<commit_message>
PRD update v1.1: sections 2, 3, 5, 9, 21, 22, 37 and canonical links
Co-Authored-By: Claude Opus 5.5 <noreply@anthropic.com>
</commit_message>
<xml_diff>
--- a/project-docs/prd-fitness-app.docx
+++ b/project-docs/prd-fitness-app.docx
@@ -1454,51 +1454,7 @@
               <w:rPr>
                 <w:rtl w:val="0"/>
               </w:rPr>
-            </w:r>
-            <w:r>
-              <w:rPr>
-                <w:sz w:val="20"/>
-                <w:szCs w:val="20"/>
-                <w:rtl w:val="1"/>
-              </w:rPr>
-              <w:t xml:space="preserve">[</w:t>
-            </w:r>
-            <w:r>
-              <w:rPr>
-                <w:sz w:val="20"/>
-                <w:szCs w:val="20"/>
-                <w:rtl w:val="1"/>
-              </w:rPr>
-              <w:t xml:space="preserve">טרם</w:t>
-            </w:r>
-            <w:r>
-              <w:rPr>
-                <w:sz w:val="20"/>
-                <w:szCs w:val="20"/>
-                <w:rtl w:val="1"/>
-              </w:rPr>
-              <w:t xml:space="preserve"> </w:t>
-            </w:r>
-            <w:r>
-              <w:rPr>
-                <w:sz w:val="20"/>
-                <w:szCs w:val="20"/>
-                <w:rtl w:val="1"/>
-              </w:rPr>
-              <w:t xml:space="preserve">נקבע</w:t>
-            </w:r>
-            <w:r>
-              <w:rPr>
-                <w:sz w:val="20"/>
-                <w:szCs w:val="20"/>
-                <w:rtl w:val="1"/>
-              </w:rPr>
-              <w:t xml:space="preserve">]</w:t>
-            </w:r>
-            <w:r>
-              <w:rPr>
-                <w:rtl w:val="0"/>
-              </w:rPr>
+              <w:t>צוות עבודה: רועי, עופרי, דניאל ושחר</w:t>
             </w:r>
           </w:p>
         </w:tc>
@@ -1573,7 +1529,7 @@
                 <w:szCs w:val="20"/>
                 <w:rtl w:val="0"/>
               </w:rPr>
-              <w:t xml:space="preserve">1.0</w:t>
+              <w:t>1.1</w:t>
             </w:r>
             <w:r>
               <w:rPr>
@@ -1653,7 +1609,7 @@
                 <w:szCs w:val="20"/>
                 <w:rtl w:val="0"/>
               </w:rPr>
-              <w:t xml:space="preserve">13.07.2026</w:t>
+              <w:t>27.09.2026</w:t>
             </w:r>
             <w:r>
               <w:rPr>
@@ -2192,6 +2148,84 @@
           </w:p>
         </w:tc>
       </w:tr>
+      <w:tr>
+        <w:trPr>
+          <w:cantSplit w:val="0"/>
+          <w:tblHeader w:val="0"/>
+        </w:trPr>
+        <w:tc>
+          <w:tcPr>
+            <w:tcMar>
+              <w:top w:w="60.0" w:type="dxa"/>
+              <w:left w:w="100.0" w:type="dxa"/>
+              <w:bottom w:w="60.0" w:type="dxa"/>
+              <w:right w:w="100.0" w:type="dxa"/>
+            </w:tcMar>
+          </w:tcPr>
+          <w:p>
+            <w:pPr>
+              <w:bidi w:val="1"/>
+              <w:rPr/>
+            </w:pPr>
+            <w:r>
+              <w:rPr>
+                <w:sz w:val="20"/>
+                <w:szCs w:val="20"/>
+                <w:rtl w:val="1"/>
+              </w:rPr>
+              <w:t>עדכון בריצה בצ'ט: מולאו סעיפים 2, 3, 5, 9, 21, 22 ו-37; בסעיף 1 נוסף מוביל הפרויקט; בסעיפים 4, 6, 7, 10 ו-11 שורת "המסמך המלא" עודכנה לשמות הקנוניים. המקורות: doc-project-definition, doc-process-mapping, doc-okr-kpi, doc-work-plan-fitness-app</w:t>
+            </w:r>
+          </w:p>
+        </w:tc>
+        <w:tc>
+          <w:tcPr>
+            <w:tcMar>
+              <w:top w:w="60.0" w:type="dxa"/>
+              <w:left w:w="100.0" w:type="dxa"/>
+              <w:bottom w:w="60.0" w:type="dxa"/>
+              <w:right w:w="100.0" w:type="dxa"/>
+            </w:tcMar>
+          </w:tcPr>
+          <w:p>
+            <w:pPr>
+              <w:bidi w:val="1"/>
+              <w:rPr/>
+            </w:pPr>
+            <w:r>
+              <w:rPr>
+                <w:sz w:val="20"/>
+                <w:szCs w:val="20"/>
+                <w:rtl w:val="0"/>
+              </w:rPr>
+              <w:t>27.09.2026</w:t>
+            </w:r>
+          </w:p>
+        </w:tc>
+        <w:tc>
+          <w:tcPr>
+            <w:tcMar>
+              <w:top w:w="60.0" w:type="dxa"/>
+              <w:left w:w="100.0" w:type="dxa"/>
+              <w:bottom w:w="60.0" w:type="dxa"/>
+              <w:right w:w="100.0" w:type="dxa"/>
+            </w:tcMar>
+          </w:tcPr>
+          <w:p>
+            <w:pPr>
+              <w:bidi w:val="1"/>
+              <w:rPr/>
+            </w:pPr>
+            <w:r>
+              <w:rPr>
+                <w:sz w:val="20"/>
+                <w:szCs w:val="20"/>
+                <w:rtl w:val="0"/>
+              </w:rPr>
+              <w:t>1.1</w:t>
+            </w:r>
+          </w:p>
+        </w:tc>
+      </w:tr>
     </w:tbl>
     <w:p>
       <w:pPr>
@@ -2804,100 +2838,37 @@
           <w:iCs w:val="1"/>
           <w:rtl w:val="1"/>
         </w:rPr>
-        <w:t xml:space="preserve">טרם</w:t>
-      </w:r>
-      <w:r>
-        <w:rPr>
-          <w:i w:val="1"/>
-          <w:iCs w:val="1"/>
-          <w:rtl w:val="1"/>
-        </w:rPr>
-        <w:t xml:space="preserve"> </w:t>
-      </w:r>
-      <w:r>
-        <w:rPr>
-          <w:i w:val="1"/>
-          <w:iCs w:val="1"/>
-          <w:rtl w:val="1"/>
-        </w:rPr>
-        <w:t xml:space="preserve">עובד</w:t>
-      </w:r>
-      <w:r>
-        <w:rPr>
-          <w:i w:val="1"/>
-          <w:iCs w:val="1"/>
-          <w:rtl w:val="1"/>
-        </w:rPr>
-        <w:t xml:space="preserve"> </w:t>
-      </w:r>
-      <w:r>
-        <w:rPr>
-          <w:i w:val="1"/>
-          <w:iCs w:val="1"/>
-          <w:rtl w:val="1"/>
-        </w:rPr>
-        <w:t xml:space="preserve">בפרויקט</w:t>
-      </w:r>
-      <w:r>
-        <w:rPr>
-          <w:i w:val="1"/>
-          <w:iCs w:val="1"/>
-          <w:rtl w:val="1"/>
-        </w:rPr>
-        <w:t xml:space="preserve"> - </w:t>
-      </w:r>
-      <w:r>
-        <w:rPr>
-          <w:i w:val="1"/>
-          <w:iCs w:val="1"/>
-          <w:rtl w:val="1"/>
-        </w:rPr>
-        <w:t xml:space="preserve">יעודכן</w:t>
-      </w:r>
-      <w:r>
-        <w:rPr>
-          <w:i w:val="1"/>
-          <w:iCs w:val="1"/>
-          <w:rtl w:val="1"/>
-        </w:rPr>
-        <w:t xml:space="preserve"> </w:t>
-      </w:r>
-      <w:r>
-        <w:rPr>
-          <w:i w:val="1"/>
-          <w:iCs w:val="1"/>
-          <w:rtl w:val="1"/>
-        </w:rPr>
-        <w:t xml:space="preserve">כשהנושא</w:t>
-      </w:r>
-      <w:r>
-        <w:rPr>
-          <w:i w:val="1"/>
-          <w:iCs w:val="1"/>
-          <w:rtl w:val="1"/>
-        </w:rPr>
-        <w:t xml:space="preserve"> </w:t>
-      </w:r>
-      <w:r>
-        <w:rPr>
-          <w:i w:val="1"/>
-          <w:iCs w:val="1"/>
-          <w:rtl w:val="1"/>
-        </w:rPr>
-        <w:t xml:space="preserve">ייסגר</w:t>
-      </w:r>
-      <w:r>
-        <w:rPr>
-          <w:i w:val="1"/>
-          <w:iCs w:val="1"/>
-          <w:rtl w:val="1"/>
-        </w:rPr>
-        <w:t xml:space="preserve">.</w:t>
-      </w:r>
-      <w:r>
-        <w:rPr>
-          <w:rtl w:val="0"/>
-        </w:rPr>
+        <w:t>אפליקציה אחת למאמן כושר אישי ולמתאמנים שלו. המאמן בונה בה תוכניות אימון, גובה תשלום ומפיק חשבונית, ועוקב אחרי ההתקדמות של כל מתאמן, בלי לקפוץ בין אפליקציות ובלי ניירת. המתאמן מזין תוצאות, מקבל משוב, ומשתתף באתגרים ובתגמולים שמחזירים אותו לאפליקציה. ארבע דרישות החובה: ניהול תוכניות אימון, סליקה וחשבוניות, ניהול תפעולי מאוחד, והזנת תוצאות אימון למעקב ארוך טווח. המתחרים חזקים בשכבת הצורך או בשכבת הרצון, והפער הוא בשילוב שתיהן.</w:t>
+      </w:r>
+    </w:p>
+    <w:p>
+      <w:pPr>
+        <w:bidi w:val="1"/>
+        <w:spacing w:after="200" w:lineRule="auto"/>
+        <w:rPr/>
+      </w:pPr>
+      <w:r>
+        <w:rPr>
+          <w:i w:val="1"/>
+          <w:iCs w:val="1"/>
+          <w:rtl w:val="1"/>
+        </w:rPr>
+        <w:t>שאלת בדיקה עצמית: האם קורא חיצוני מבין מהפסקה הזו מה הפרויקט, למי הוא מיועד ומה דרישות החובה?</w:t>
+      </w:r>
+    </w:p>
+    <w:p>
+      <w:pPr>
+        <w:bidi w:val="1"/>
+        <w:spacing w:after="200" w:lineRule="auto"/>
+        <w:rPr/>
+      </w:pPr>
+      <w:r>
+        <w:rPr>
+          <w:i w:val="1"/>
+          <w:iCs w:val="1"/>
+          <w:rtl w:val="1"/>
+        </w:rPr>
+        <w:t>המסמך המלא: doc-project-definition.md (https://github.com/Sharpop30/fitness-app/blob/main/project-docs/doc-project-definition.md)</w:t>
       </w:r>
     </w:p>
     <w:p>
@@ -3171,100 +3142,67 @@
           <w:iCs w:val="1"/>
           <w:rtl w:val="1"/>
         </w:rPr>
-        <w:t xml:space="preserve">טרם</w:t>
-      </w:r>
-      <w:r>
-        <w:rPr>
-          <w:i w:val="1"/>
-          <w:iCs w:val="1"/>
-          <w:rtl w:val="1"/>
-        </w:rPr>
-        <w:t xml:space="preserve"> </w:t>
-      </w:r>
-      <w:r>
-        <w:rPr>
-          <w:i w:val="1"/>
-          <w:iCs w:val="1"/>
-          <w:rtl w:val="1"/>
-        </w:rPr>
-        <w:t xml:space="preserve">עובד</w:t>
-      </w:r>
-      <w:r>
-        <w:rPr>
-          <w:i w:val="1"/>
-          <w:iCs w:val="1"/>
-          <w:rtl w:val="1"/>
-        </w:rPr>
-        <w:t xml:space="preserve"> </w:t>
-      </w:r>
-      <w:r>
-        <w:rPr>
-          <w:i w:val="1"/>
-          <w:iCs w:val="1"/>
-          <w:rtl w:val="1"/>
-        </w:rPr>
-        <w:t xml:space="preserve">בפרויקט</w:t>
-      </w:r>
-      <w:r>
-        <w:rPr>
-          <w:i w:val="1"/>
-          <w:iCs w:val="1"/>
-          <w:rtl w:val="1"/>
-        </w:rPr>
-        <w:t xml:space="preserve"> - </w:t>
-      </w:r>
-      <w:r>
-        <w:rPr>
-          <w:i w:val="1"/>
-          <w:iCs w:val="1"/>
-          <w:rtl w:val="1"/>
-        </w:rPr>
-        <w:t xml:space="preserve">יעודכן</w:t>
-      </w:r>
-      <w:r>
-        <w:rPr>
-          <w:i w:val="1"/>
-          <w:iCs w:val="1"/>
-          <w:rtl w:val="1"/>
-        </w:rPr>
-        <w:t xml:space="preserve"> </w:t>
-      </w:r>
-      <w:r>
-        <w:rPr>
-          <w:i w:val="1"/>
-          <w:iCs w:val="1"/>
-          <w:rtl w:val="1"/>
-        </w:rPr>
-        <w:t xml:space="preserve">כשהנושא</w:t>
-      </w:r>
-      <w:r>
-        <w:rPr>
-          <w:i w:val="1"/>
-          <w:iCs w:val="1"/>
-          <w:rtl w:val="1"/>
-        </w:rPr>
-        <w:t xml:space="preserve"> </w:t>
-      </w:r>
-      <w:r>
-        <w:rPr>
-          <w:i w:val="1"/>
-          <w:iCs w:val="1"/>
-          <w:rtl w:val="1"/>
-        </w:rPr>
-        <w:t xml:space="preserve">ייסגר</w:t>
-      </w:r>
-      <w:r>
-        <w:rPr>
-          <w:i w:val="1"/>
-          <w:iCs w:val="1"/>
-          <w:rtl w:val="1"/>
-        </w:rPr>
-        <w:t xml:space="preserve">.</w:t>
-      </w:r>
-      <w:r>
-        <w:rPr>
-          <w:rtl w:val="0"/>
-        </w:rPr>
+        <w:t>תיאור הבעיה: מאמן כושר אישי מנהל את תוכניות האימון, הגבייה והחשבוניות ואת המעקב אחרי המתאמנים בכמה אפליקציות ובעבודה ידנית, והמתאמנים שלו נוטשים כשהדיווח על אימונים ידני ואין להם משוב על ההתקדמות.</w:t>
+      </w:r>
+    </w:p>
+    <w:p>
+      <w:pPr>
+        <w:bidi w:val="1"/>
+        <w:spacing w:after="200" w:lineRule="auto"/>
+        <w:rPr/>
+      </w:pPr>
+      <w:r>
+        <w:rPr>
+          <w:i w:val="1"/>
+          <w:iCs w:val="1"/>
+          <w:rtl w:val="1"/>
+        </w:rPr>
+        <w:t>שורש הבעיה: [טרם נקבע]. צעדי עצם הדג, חמשת הלמה והאימות בשטח (צעדים 9 עד 13 במדריך) לא בוצעו, ולכן הבעיה מנוסחת מתוך הבזבוזים והכישלונות שתועדו, ולא משורש שאומת.</w:t>
+      </w:r>
+    </w:p>
+    <w:p>
+      <w:pPr>
+        <w:bidi w:val="1"/>
+        <w:spacing w:after="200" w:lineRule="auto"/>
+        <w:rPr/>
+      </w:pPr>
+      <w:r>
+        <w:rPr>
+          <w:i w:val="1"/>
+          <w:iCs w:val="1"/>
+          <w:rtl w:val="1"/>
+        </w:rPr>
+        <w:t>עדות למה שקורה היום: הבזבוזים בסעיף 4 (נדידה בין אפליקציות, דיווח ידני שגורם לנשירה), והכישלונות בעיני בעלי העניין בסעיף 7 (ממשק מסורבל, דיווח ידני, היעדר משוב).</w:t>
+      </w:r>
+    </w:p>
+    <w:p>
+      <w:pPr>
+        <w:bidi w:val="1"/>
+        <w:spacing w:after="200" w:lineRule="auto"/>
+        <w:rPr/>
+      </w:pPr>
+      <w:r>
+        <w:rPr>
+          <w:i w:val="1"/>
+          <w:iCs w:val="1"/>
+          <w:rtl w:val="1"/>
+        </w:rPr>
+        <w:t>שאלת בדיקה עצמית: האם הבעיה מנוסחת ככשל בפועל, בלי פתרון בתוכה?</w:t>
+      </w:r>
+    </w:p>
+    <w:p>
+      <w:pPr>
+        <w:bidi w:val="1"/>
+        <w:spacing w:after="200" w:lineRule="auto"/>
+        <w:rPr/>
+      </w:pPr>
+      <w:r>
+        <w:rPr>
+          <w:i w:val="1"/>
+          <w:iCs w:val="1"/>
+          <w:rtl w:val="1"/>
+        </w:rPr>
+        <w:t>המסמך המלא: doc-project-definition.md (https://github.com/Sharpop30/fitness-app/blob/main/project-docs/doc-project-definition.md)</w:t>
       </w:r>
     </w:p>
     <w:p>
@@ -6623,220 +6561,7 @@
           <w:iCs w:val="1"/>
           <w:rtl w:val="1"/>
         </w:rPr>
-        <w:t xml:space="preserve">המסמך</w:t>
-      </w:r>
-      <w:r>
-        <w:rPr>
-          <w:i w:val="1"/>
-          <w:iCs w:val="1"/>
-          <w:rtl w:val="1"/>
-        </w:rPr>
-        <w:t xml:space="preserve"> </w:t>
-      </w:r>
-      <w:r>
-        <w:rPr>
-          <w:i w:val="1"/>
-          <w:iCs w:val="1"/>
-          <w:rtl w:val="1"/>
-        </w:rPr>
-        <w:t xml:space="preserve">המלא</w:t>
-      </w:r>
-      <w:r>
-        <w:rPr>
-          <w:i w:val="1"/>
-          <w:iCs w:val="1"/>
-          <w:rtl w:val="1"/>
-        </w:rPr>
-        <w:t xml:space="preserve">: </w:t>
-      </w:r>
-      <w:r>
-        <w:rPr>
-          <w:i w:val="1"/>
-          <w:iCs w:val="1"/>
-          <w:rtl w:val="1"/>
-        </w:rPr>
-        <w:t xml:space="preserve">צורך</w:t>
-      </w:r>
-      <w:r>
-        <w:rPr>
-          <w:i w:val="1"/>
-          <w:iCs w:val="1"/>
-          <w:rtl w:val="1"/>
-        </w:rPr>
-        <w:t xml:space="preserve">_</w:t>
-      </w:r>
-      <w:r>
-        <w:rPr>
-          <w:i w:val="1"/>
-          <w:iCs w:val="1"/>
-          <w:rtl w:val="1"/>
-        </w:rPr>
-        <w:t xml:space="preserve">מול</w:t>
-      </w:r>
-      <w:r>
-        <w:rPr>
-          <w:i w:val="1"/>
-          <w:iCs w:val="1"/>
-          <w:rtl w:val="1"/>
-        </w:rPr>
-        <w:t xml:space="preserve">_</w:t>
-      </w:r>
-      <w:r>
-        <w:rPr>
-          <w:i w:val="1"/>
-          <w:iCs w:val="1"/>
-          <w:rtl w:val="1"/>
-        </w:rPr>
-        <w:t xml:space="preserve">רצון</w:t>
-      </w:r>
-      <w:r>
-        <w:rPr>
-          <w:i w:val="1"/>
-          <w:iCs w:val="1"/>
-          <w:rtl w:val="1"/>
-        </w:rPr>
-        <w:t xml:space="preserve">_</w:t>
-      </w:r>
-      <w:r>
-        <w:rPr>
-          <w:i w:val="1"/>
-          <w:iCs w:val="1"/>
-          <w:rtl w:val="1"/>
-        </w:rPr>
-        <w:t xml:space="preserve">גרסה</w:t>
-      </w:r>
-      <w:r>
-        <w:rPr>
-          <w:i w:val="1"/>
-          <w:iCs w:val="1"/>
-          <w:rtl w:val="1"/>
-        </w:rPr>
-        <w:t xml:space="preserve">_</w:t>
-      </w:r>
-      <w:r>
-        <w:rPr>
-          <w:i w:val="1"/>
-          <w:iCs w:val="1"/>
-          <w:rtl w:val="1"/>
-        </w:rPr>
-        <w:t xml:space="preserve">מעודכנת</w:t>
-      </w:r>
-      <w:r>
-        <w:rPr>
-          <w:i w:val="1"/>
-          <w:iCs w:val="1"/>
-          <w:rtl w:val="1"/>
-        </w:rPr>
-        <w:t xml:space="preserve">.</w:t>
-      </w:r>
-      <w:r>
-        <w:rPr>
-          <w:i w:val="1"/>
-          <w:iCs w:val="1"/>
-          <w:rtl w:val="0"/>
-        </w:rPr>
-        <w:t xml:space="preserve">md</w:t>
-      </w:r>
-      <w:r>
-        <w:rPr>
-          <w:i w:val="1"/>
-          <w:iCs w:val="1"/>
-          <w:rtl w:val="1"/>
-        </w:rPr>
-        <w:t xml:space="preserve">, </w:t>
-      </w:r>
-      <w:r>
-        <w:rPr>
-          <w:i w:val="1"/>
-          <w:iCs w:val="1"/>
-          <w:rtl w:val="1"/>
-        </w:rPr>
-        <w:t xml:space="preserve">מסמך</w:t>
-      </w:r>
-      <w:r>
-        <w:rPr>
-          <w:i w:val="1"/>
-          <w:iCs w:val="1"/>
-          <w:rtl w:val="1"/>
-        </w:rPr>
-        <w:t xml:space="preserve">_</w:t>
-      </w:r>
-      <w:r>
-        <w:rPr>
-          <w:i w:val="1"/>
-          <w:iCs w:val="1"/>
-          <w:rtl w:val="1"/>
-        </w:rPr>
-        <w:t xml:space="preserve">רעיונות</w:t>
-      </w:r>
-      <w:r>
-        <w:rPr>
-          <w:i w:val="1"/>
-          <w:iCs w:val="1"/>
-          <w:rtl w:val="1"/>
-        </w:rPr>
-        <w:t xml:space="preserve">.</w:t>
-      </w:r>
-      <w:r>
-        <w:rPr>
-          <w:i w:val="1"/>
-          <w:iCs w:val="1"/>
-          <w:rtl w:val="0"/>
-        </w:rPr>
-        <w:t xml:space="preserve">md</w:t>
-      </w:r>
-      <w:r>
-        <w:rPr>
-          <w:i w:val="1"/>
-          <w:iCs w:val="1"/>
-          <w:rtl w:val="1"/>
-        </w:rPr>
-        <w:t xml:space="preserve">, </w:t>
-      </w:r>
-      <w:r>
-        <w:rPr>
-          <w:i w:val="1"/>
-          <w:iCs w:val="1"/>
-          <w:rtl w:val="1"/>
-        </w:rPr>
-        <w:t xml:space="preserve">סקר</w:t>
-      </w:r>
-      <w:r>
-        <w:rPr>
-          <w:i w:val="1"/>
-          <w:iCs w:val="1"/>
-          <w:rtl w:val="1"/>
-        </w:rPr>
-        <w:t xml:space="preserve"> </w:t>
-      </w:r>
-      <w:r>
-        <w:rPr>
-          <w:i w:val="1"/>
-          <w:iCs w:val="1"/>
-          <w:rtl w:val="1"/>
-        </w:rPr>
-        <w:t xml:space="preserve">שוק</w:t>
-      </w:r>
-      <w:r>
-        <w:rPr>
-          <w:i w:val="1"/>
-          <w:iCs w:val="1"/>
-          <w:rtl w:val="1"/>
-        </w:rPr>
-        <w:t xml:space="preserve">.</w:t>
-      </w:r>
-      <w:r>
-        <w:rPr>
-          <w:i w:val="1"/>
-          <w:iCs w:val="1"/>
-          <w:rtl w:val="0"/>
-        </w:rPr>
-        <w:t xml:space="preserve">md</w:t>
-      </w:r>
-      <w:r>
-        <w:rPr>
-          <w:rtl w:val="0"/>
-        </w:rPr>
+        <w:t>המסמך המלא: doc-need-vs-want.docx (https://github.com/Sharpop30/fitness-app/blob/main/project-docs/doc-need-vs-want.docx), doc-ideas.docx (https://github.com/Sharpop30/fitness-app/blob/main/project-docs/doc-ideas.docx). סקר השוק: [טרם נקבע], המסמך אינו בתיקיית הפרויקט</w:t>
       </w:r>
     </w:p>
     <w:p>
@@ -7474,100 +7199,82 @@
           <w:iCs w:val="1"/>
           <w:rtl w:val="1"/>
         </w:rPr>
-        <w:t xml:space="preserve">טרם</w:t>
-      </w:r>
-      <w:r>
-        <w:rPr>
-          <w:i w:val="1"/>
-          <w:iCs w:val="1"/>
-          <w:rtl w:val="1"/>
-        </w:rPr>
-        <w:t xml:space="preserve"> </w:t>
-      </w:r>
-      <w:r>
-        <w:rPr>
-          <w:i w:val="1"/>
-          <w:iCs w:val="1"/>
-          <w:rtl w:val="1"/>
-        </w:rPr>
-        <w:t xml:space="preserve">עובד</w:t>
-      </w:r>
-      <w:r>
-        <w:rPr>
-          <w:i w:val="1"/>
-          <w:iCs w:val="1"/>
-          <w:rtl w:val="1"/>
-        </w:rPr>
-        <w:t xml:space="preserve"> </w:t>
-      </w:r>
-      <w:r>
-        <w:rPr>
-          <w:i w:val="1"/>
-          <w:iCs w:val="1"/>
-          <w:rtl w:val="1"/>
-        </w:rPr>
-        <w:t xml:space="preserve">בפרויקט</w:t>
-      </w:r>
-      <w:r>
-        <w:rPr>
-          <w:i w:val="1"/>
-          <w:iCs w:val="1"/>
-          <w:rtl w:val="1"/>
-        </w:rPr>
-        <w:t xml:space="preserve"> - </w:t>
-      </w:r>
-      <w:r>
-        <w:rPr>
-          <w:i w:val="1"/>
-          <w:iCs w:val="1"/>
-          <w:rtl w:val="1"/>
-        </w:rPr>
-        <w:t xml:space="preserve">יעודכן</w:t>
-      </w:r>
-      <w:r>
-        <w:rPr>
-          <w:i w:val="1"/>
-          <w:iCs w:val="1"/>
-          <w:rtl w:val="1"/>
-        </w:rPr>
-        <w:t xml:space="preserve"> </w:t>
-      </w:r>
-      <w:r>
-        <w:rPr>
-          <w:i w:val="1"/>
-          <w:iCs w:val="1"/>
-          <w:rtl w:val="1"/>
-        </w:rPr>
-        <w:t xml:space="preserve">כשהנושא</w:t>
-      </w:r>
-      <w:r>
-        <w:rPr>
-          <w:i w:val="1"/>
-          <w:iCs w:val="1"/>
-          <w:rtl w:val="1"/>
-        </w:rPr>
-        <w:t xml:space="preserve"> </w:t>
-      </w:r>
-      <w:r>
-        <w:rPr>
-          <w:i w:val="1"/>
-          <w:iCs w:val="1"/>
-          <w:rtl w:val="1"/>
-        </w:rPr>
-        <w:t xml:space="preserve">ייסגר</w:t>
-      </w:r>
-      <w:r>
-        <w:rPr>
-          <w:i w:val="1"/>
-          <w:iCs w:val="1"/>
-          <w:rtl w:val="1"/>
-        </w:rPr>
-        <w:t xml:space="preserve">.</w:t>
-      </w:r>
-      <w:r>
-        <w:rPr>
-          <w:rtl w:val="0"/>
-        </w:rPr>
+        <w:t>התהליך הקיים: המאמן בונה תוכנית, גובה ומפיק חשבוניות בעבודה ידנית, והנתונים מפוזרים בכמה אפליקציות (אילו: [טרם נקבע]). מתאמן שאינו מדווח ידנית על אימון נושר, והמאמן נשאר בלי תמונה אחת של המתאמן.</w:t>
+      </w:r>
+    </w:p>
+    <w:p>
+      <w:pPr>
+        <w:bidi w:val="1"/>
+        <w:spacing w:after="200" w:lineRule="auto"/>
+        <w:rPr/>
+      </w:pPr>
+      <w:r>
+        <w:rPr>
+          <w:i w:val="1"/>
+          <w:iCs w:val="1"/>
+          <w:rtl w:val="1"/>
+        </w:rPr>
+        <w:t>התהליך הרצוי: המאמן בונה תוכנית ומחליף תרגיל במהירות, התשלום והחשבונית מתבצעים באפליקציה (בגרסה הראשונה סליקה מדומה), המתאמן מזין תוצאות ומקבל משוב, מטבעות ואתגר שבועי, והמאמן רואה את ההתקדמות של כל מתאמן במסך אחד.</w:t>
+      </w:r>
+    </w:p>
+    <w:p>
+      <w:pPr>
+        <w:bidi w:val="1"/>
+        <w:spacing w:after="200" w:lineRule="auto"/>
+        <w:rPr/>
+      </w:pPr>
+      <w:r>
+        <w:rPr>
+          <w:i w:val="1"/>
+          <w:iCs w:val="1"/>
+          <w:rtl w:val="1"/>
+        </w:rPr>
+        <w:t>הפער: תוכנית ידנית מול בנייה מהירה; ניירת מול חשבונית אוטומטית; נתונים מפוזרים מול מקום אחד; היעדר מעקב מול הזנת תוצאות; נשירה מול משוב, תגמול וטריגר יומי.</w:t>
+      </w:r>
+    </w:p>
+    <w:p>
+      <w:pPr>
+        <w:bidi w:val="1"/>
+        <w:spacing w:after="200" w:lineRule="auto"/>
+        <w:rPr/>
+      </w:pPr>
+      <w:r>
+        <w:rPr>
+          <w:i w:val="1"/>
+          <w:iCs w:val="1"/>
+          <w:rtl w:val="1"/>
+        </w:rPr>
+        <w:t>הסתייגות: התהליך הקיים לא נצפה בשטח, והוא נגזר מהמסמכים.</w:t>
+      </w:r>
+    </w:p>
+    <w:p>
+      <w:pPr>
+        <w:bidi w:val="1"/>
+        <w:spacing w:after="200" w:lineRule="auto"/>
+        <w:rPr/>
+      </w:pPr>
+      <w:r>
+        <w:rPr>
+          <w:i w:val="1"/>
+          <w:iCs w:val="1"/>
+          <w:rtl w:val="1"/>
+        </w:rPr>
+        <w:t>שאלת בדיקה עצמית: האם כל פער בתהליך מקבל מענה בדרישה מסעיף 10?</w:t>
+      </w:r>
+    </w:p>
+    <w:p>
+      <w:pPr>
+        <w:bidi w:val="1"/>
+        <w:spacing w:after="200" w:lineRule="auto"/>
+        <w:rPr/>
+      </w:pPr>
+      <w:r>
+        <w:rPr>
+          <w:i w:val="1"/>
+          <w:iCs w:val="1"/>
+          <w:rtl w:val="1"/>
+        </w:rPr>
+        <w:t>המסמך המלא: doc-process-mapping.html (https://github.com/Sharpop30/fitness-app/blob/main/project-docs/doc-process-mapping.html), ותרשימים diagram-01-current-process.mmd ו-diagram-02-desired-process.mmd בתיקיית mermaid</w:t>
       </w:r>
     </w:p>
     <w:p>
@@ -10800,76 +10507,7 @@
           <w:iCs w:val="1"/>
           <w:rtl w:val="1"/>
         </w:rPr>
-        <w:t xml:space="preserve">המסמך</w:t>
-      </w:r>
-      <w:r>
-        <w:rPr>
-          <w:i w:val="1"/>
-          <w:iCs w:val="1"/>
-          <w:rtl w:val="1"/>
-        </w:rPr>
-        <w:t xml:space="preserve"> </w:t>
-      </w:r>
-      <w:r>
-        <w:rPr>
-          <w:i w:val="1"/>
-          <w:iCs w:val="1"/>
-          <w:rtl w:val="1"/>
-        </w:rPr>
-        <w:t xml:space="preserve">המלא</w:t>
-      </w:r>
-      <w:r>
-        <w:rPr>
-          <w:i w:val="1"/>
-          <w:iCs w:val="1"/>
-          <w:rtl w:val="1"/>
-        </w:rPr>
-        <w:t xml:space="preserve">: </w:t>
-      </w:r>
-      <w:r>
-        <w:rPr>
-          <w:i w:val="1"/>
-          <w:iCs w:val="1"/>
-          <w:rtl w:val="1"/>
-        </w:rPr>
-        <w:t xml:space="preserve">סקר</w:t>
-      </w:r>
-      <w:r>
-        <w:rPr>
-          <w:i w:val="1"/>
-          <w:iCs w:val="1"/>
-          <w:rtl w:val="1"/>
-        </w:rPr>
-        <w:t xml:space="preserve"> </w:t>
-      </w:r>
-      <w:r>
-        <w:rPr>
-          <w:i w:val="1"/>
-          <w:iCs w:val="1"/>
-          <w:rtl w:val="1"/>
-        </w:rPr>
-        <w:t xml:space="preserve">שוק</w:t>
-      </w:r>
-      <w:r>
-        <w:rPr>
-          <w:i w:val="1"/>
-          <w:iCs w:val="1"/>
-          <w:rtl w:val="1"/>
-        </w:rPr>
-        <w:t xml:space="preserve">.</w:t>
-      </w:r>
-      <w:r>
-        <w:rPr>
-          <w:i w:val="1"/>
-          <w:iCs w:val="1"/>
-          <w:rtl w:val="0"/>
-        </w:rPr>
-        <w:t xml:space="preserve">md</w:t>
-      </w:r>
-      <w:r>
-        <w:rPr>
-          <w:rtl w:val="0"/>
-        </w:rPr>
+        <w:t>המסמך המלא: סקר השוק, [טרם נקבע]. המסמך אינו בתיקיית הפרויקט, ואיתורו נדחה בהכרעת הצוות מ-27.09.2026</w:t>
       </w:r>
     </w:p>
     <w:p>
@@ -13230,156 +12868,7 @@
           <w:iCs w:val="1"/>
           <w:rtl w:val="1"/>
         </w:rPr>
-        <w:t xml:space="preserve">המסמך</w:t>
-      </w:r>
-      <w:r>
-        <w:rPr>
-          <w:i w:val="1"/>
-          <w:iCs w:val="1"/>
-          <w:rtl w:val="1"/>
-        </w:rPr>
-        <w:t xml:space="preserve"> </w:t>
-      </w:r>
-      <w:r>
-        <w:rPr>
-          <w:i w:val="1"/>
-          <w:iCs w:val="1"/>
-          <w:rtl w:val="1"/>
-        </w:rPr>
-        <w:t xml:space="preserve">המלא</w:t>
-      </w:r>
-      <w:r>
-        <w:rPr>
-          <w:i w:val="1"/>
-          <w:iCs w:val="1"/>
-          <w:rtl w:val="1"/>
-        </w:rPr>
-        <w:t xml:space="preserve">: </w:t>
-      </w:r>
-      <w:r>
-        <w:rPr>
-          <w:i w:val="1"/>
-          <w:iCs w:val="1"/>
-          <w:rtl w:val="1"/>
-        </w:rPr>
-        <w:t xml:space="preserve">מפת</w:t>
-      </w:r>
-      <w:r>
-        <w:rPr>
-          <w:i w:val="1"/>
-          <w:iCs w:val="1"/>
-          <w:rtl w:val="1"/>
-        </w:rPr>
-        <w:t xml:space="preserve">_</w:t>
-      </w:r>
-      <w:r>
-        <w:rPr>
-          <w:i w:val="1"/>
-          <w:iCs w:val="1"/>
-          <w:rtl w:val="1"/>
-        </w:rPr>
-        <w:t xml:space="preserve">בעלי</w:t>
-      </w:r>
-      <w:r>
-        <w:rPr>
-          <w:i w:val="1"/>
-          <w:iCs w:val="1"/>
-          <w:rtl w:val="1"/>
-        </w:rPr>
-        <w:t xml:space="preserve">_</w:t>
-      </w:r>
-      <w:r>
-        <w:rPr>
-          <w:i w:val="1"/>
-          <w:iCs w:val="1"/>
-          <w:rtl w:val="1"/>
-        </w:rPr>
-        <w:t xml:space="preserve">עניין</w:t>
-      </w:r>
-      <w:r>
-        <w:rPr>
-          <w:i w:val="1"/>
-          <w:iCs w:val="1"/>
-          <w:rtl w:val="1"/>
-        </w:rPr>
-        <w:t xml:space="preserve">_</w:t>
-      </w:r>
-      <w:r>
-        <w:rPr>
-          <w:i w:val="1"/>
-          <w:iCs w:val="1"/>
-          <w:rtl w:val="1"/>
-        </w:rPr>
-        <w:t xml:space="preserve">אפליקציית</w:t>
-      </w:r>
-      <w:r>
-        <w:rPr>
-          <w:i w:val="1"/>
-          <w:iCs w:val="1"/>
-          <w:rtl w:val="1"/>
-        </w:rPr>
-        <w:t xml:space="preserve">_</w:t>
-      </w:r>
-      <w:r>
-        <w:rPr>
-          <w:i w:val="1"/>
-          <w:iCs w:val="1"/>
-          <w:rtl w:val="1"/>
-        </w:rPr>
-        <w:t xml:space="preserve">ניהול</w:t>
-      </w:r>
-      <w:r>
-        <w:rPr>
-          <w:i w:val="1"/>
-          <w:iCs w:val="1"/>
-          <w:rtl w:val="1"/>
-        </w:rPr>
-        <w:t xml:space="preserve">_</w:t>
-      </w:r>
-      <w:r>
-        <w:rPr>
-          <w:i w:val="1"/>
-          <w:iCs w:val="1"/>
-          <w:rtl w:val="1"/>
-        </w:rPr>
-        <w:t xml:space="preserve">מאמן</w:t>
-      </w:r>
-      <w:r>
-        <w:rPr>
-          <w:i w:val="1"/>
-          <w:iCs w:val="1"/>
-          <w:rtl w:val="1"/>
-        </w:rPr>
-        <w:t xml:space="preserve">_</w:t>
-      </w:r>
-      <w:r>
-        <w:rPr>
-          <w:i w:val="1"/>
-          <w:iCs w:val="1"/>
-          <w:rtl w:val="1"/>
-        </w:rPr>
-        <w:t xml:space="preserve">כושר</w:t>
-      </w:r>
-      <w:r>
-        <w:rPr>
-          <w:i w:val="1"/>
-          <w:iCs w:val="1"/>
-          <w:rtl w:val="1"/>
-        </w:rPr>
-        <w:t xml:space="preserve">.</w:t>
-      </w:r>
-      <w:r>
-        <w:rPr>
-          <w:i w:val="1"/>
-          <w:iCs w:val="1"/>
-          <w:rtl w:val="0"/>
-        </w:rPr>
-        <w:t xml:space="preserve">md</w:t>
-      </w:r>
-      <w:r>
-        <w:rPr>
-          <w:rtl w:val="0"/>
-        </w:rPr>
+        <w:t>המסמך המלא: doc-stakeholder-map.docx (https://github.com/Sharpop30/fitness-app/blob/main/project-docs/doc-stakeholder-map.docx)</w:t>
       </w:r>
     </w:p>
     <w:p>
@@ -14156,100 +13645,82 @@
           <w:iCs w:val="1"/>
           <w:rtl w:val="1"/>
         </w:rPr>
-        <w:t xml:space="preserve">טרם</w:t>
-      </w:r>
-      <w:r>
-        <w:rPr>
-          <w:i w:val="1"/>
-          <w:iCs w:val="1"/>
-          <w:rtl w:val="1"/>
-        </w:rPr>
-        <w:t xml:space="preserve"> </w:t>
-      </w:r>
-      <w:r>
-        <w:rPr>
-          <w:i w:val="1"/>
-          <w:iCs w:val="1"/>
-          <w:rtl w:val="1"/>
-        </w:rPr>
-        <w:t xml:space="preserve">עובד</w:t>
-      </w:r>
-      <w:r>
-        <w:rPr>
-          <w:i w:val="1"/>
-          <w:iCs w:val="1"/>
-          <w:rtl w:val="1"/>
-        </w:rPr>
-        <w:t xml:space="preserve"> </w:t>
-      </w:r>
-      <w:r>
-        <w:rPr>
-          <w:i w:val="1"/>
-          <w:iCs w:val="1"/>
-          <w:rtl w:val="1"/>
-        </w:rPr>
-        <w:t xml:space="preserve">בפרויקט</w:t>
-      </w:r>
-      <w:r>
-        <w:rPr>
-          <w:i w:val="1"/>
-          <w:iCs w:val="1"/>
-          <w:rtl w:val="1"/>
-        </w:rPr>
-        <w:t xml:space="preserve"> - </w:t>
-      </w:r>
-      <w:r>
-        <w:rPr>
-          <w:i w:val="1"/>
-          <w:iCs w:val="1"/>
-          <w:rtl w:val="1"/>
-        </w:rPr>
-        <w:t xml:space="preserve">יעודכן</w:t>
-      </w:r>
-      <w:r>
-        <w:rPr>
-          <w:i w:val="1"/>
-          <w:iCs w:val="1"/>
-          <w:rtl w:val="1"/>
-        </w:rPr>
-        <w:t xml:space="preserve"> </w:t>
-      </w:r>
-      <w:r>
-        <w:rPr>
-          <w:i w:val="1"/>
-          <w:iCs w:val="1"/>
-          <w:rtl w:val="1"/>
-        </w:rPr>
-        <w:t xml:space="preserve">כשהנושא</w:t>
-      </w:r>
-      <w:r>
-        <w:rPr>
-          <w:i w:val="1"/>
-          <w:iCs w:val="1"/>
-          <w:rtl w:val="1"/>
-        </w:rPr>
-        <w:t xml:space="preserve"> </w:t>
-      </w:r>
-      <w:r>
-        <w:rPr>
-          <w:i w:val="1"/>
-          <w:iCs w:val="1"/>
-          <w:rtl w:val="1"/>
-        </w:rPr>
-        <w:t xml:space="preserve">ייסגר</w:t>
-      </w:r>
-      <w:r>
-        <w:rPr>
-          <w:i w:val="1"/>
-          <w:iCs w:val="1"/>
-          <w:rtl w:val="1"/>
-        </w:rPr>
-        <w:t xml:space="preserve">.</w:t>
-      </w:r>
-      <w:r>
-        <w:rPr>
-          <w:rtl w:val="0"/>
-        </w:rPr>
+        <w:t>היעד (Objective): המאמן מנהל את כל העבודה מול המתאמנים שלו באפליקציה אחת, והמתאמנים שלו נשארים ומתאמנים.</w:t>
+      </w:r>
+    </w:p>
+    <w:p>
+      <w:pPr>
+        <w:bidi w:val="1"/>
+        <w:spacing w:after="200" w:lineRule="auto"/>
+        <w:rPr/>
+      </w:pPr>
+      <w:r>
+        <w:rPr>
+          <w:i w:val="1"/>
+          <w:iCs w:val="1"/>
+          <w:rtl w:val="1"/>
+        </w:rPr>
+        <w:t>KR1: הפעולות התפעוליות של המאמן (תוכניות, גבייה וחשבוניות) מתבצעות באפליקציה. KR2: שיעור הנטישה החודשי של מתאמנים יורד. KR3: המתאמנים הפעילים מזינים תוצאות אימון באופן קבוע. הטווח: שלושה עד שישה חודשים.</w:t>
+      </w:r>
+    </w:p>
+    <w:p>
+      <w:pPr>
+        <w:bidi w:val="1"/>
+        <w:spacing w:after="200" w:lineRule="auto"/>
+        <w:rPr/>
+      </w:pPr>
+      <w:r>
+        <w:rPr>
+          <w:i w:val="1"/>
+          <w:iCs w:val="1"/>
+          <w:rtl w:val="1"/>
+        </w:rPr>
+        <w:t>המדדים: ל-KR1 תוכניות פעילות לכל מתאמן, זמן החלפת תרגיל ותשלומים עם חשבונית אוטומטית; ל-KR2 שיעור נטישה חודשי, מתאמנים פעילים והשתתפות באתגר השבועי; ל-KR3 הזנת תוצאות שבועית, חזרה יומית ומשוב שנשלח. כל המדדים נמדדים מנתוני האפליקציה.</w:t>
+      </w:r>
+    </w:p>
+    <w:p>
+      <w:pPr>
+        <w:bidi w:val="1"/>
+        <w:spacing w:after="200" w:lineRule="auto"/>
+        <w:rPr/>
+      </w:pPr>
+      <w:r>
+        <w:rPr>
+          <w:i w:val="1"/>
+          <w:iCs w:val="1"/>
+          <w:rtl w:val="1"/>
+        </w:rPr>
+        <w:t>ערך הבסיס וערך היעד לכל מדד: [טרם נקבע]. נשארים פתוחים בהכרעת הצוות מ-27.09.2026, ויקבעו אחרי חודש מדידה ראשון.</w:t>
+      </w:r>
+    </w:p>
+    <w:p>
+      <w:pPr>
+        <w:bidi w:val="1"/>
+        <w:spacing w:after="200" w:lineRule="auto"/>
+        <w:rPr/>
+      </w:pPr>
+      <w:r>
+        <w:rPr>
+          <w:i w:val="1"/>
+          <w:iCs w:val="1"/>
+          <w:rtl w:val="1"/>
+        </w:rPr>
+        <w:t>שאלת בדיקה עצמית: האם כל Key Result נגזר מהגדרת הצלחה של בעל עניין בסעיף 7?</w:t>
+      </w:r>
+    </w:p>
+    <w:p>
+      <w:pPr>
+        <w:bidi w:val="1"/>
+        <w:spacing w:after="200" w:lineRule="auto"/>
+        <w:rPr/>
+      </w:pPr>
+      <w:r>
+        <w:rPr>
+          <w:i w:val="1"/>
+          <w:iCs w:val="1"/>
+          <w:rtl w:val="1"/>
+        </w:rPr>
+        <w:t>המסמך המלא: doc-okr-kpi.md (https://github.com/Sharpop30/fitness-app/blob/main/project-docs/doc-okr-kpi.md)</w:t>
       </w:r>
     </w:p>
     <w:p>
@@ -22207,188 +21678,7 @@
           <w:iCs w:val="1"/>
           <w:rtl w:val="1"/>
         </w:rPr>
-        <w:t xml:space="preserve">המסמך</w:t>
-      </w:r>
-      <w:r>
-        <w:rPr>
-          <w:i w:val="1"/>
-          <w:iCs w:val="1"/>
-          <w:rtl w:val="1"/>
-        </w:rPr>
-        <w:t xml:space="preserve"> </w:t>
-      </w:r>
-      <w:r>
-        <w:rPr>
-          <w:i w:val="1"/>
-          <w:iCs w:val="1"/>
-          <w:rtl w:val="1"/>
-        </w:rPr>
-        <w:t xml:space="preserve">המלא</w:t>
-      </w:r>
-      <w:r>
-        <w:rPr>
-          <w:i w:val="1"/>
-          <w:iCs w:val="1"/>
-          <w:rtl w:val="1"/>
-        </w:rPr>
-        <w:t xml:space="preserve">: </w:t>
-      </w:r>
-      <w:r>
-        <w:rPr>
-          <w:i w:val="1"/>
-          <w:iCs w:val="1"/>
-          <w:rtl w:val="1"/>
-        </w:rPr>
-        <w:t xml:space="preserve">סיכום</w:t>
-      </w:r>
-      <w:r>
-        <w:rPr>
-          <w:i w:val="1"/>
-          <w:iCs w:val="1"/>
-          <w:rtl w:val="1"/>
-        </w:rPr>
-        <w:t xml:space="preserve">_</w:t>
-      </w:r>
-      <w:r>
-        <w:rPr>
-          <w:i w:val="1"/>
-          <w:iCs w:val="1"/>
-          <w:rtl w:val="1"/>
-        </w:rPr>
-        <w:t xml:space="preserve">תהליך</w:t>
-      </w:r>
-      <w:r>
-        <w:rPr>
-          <w:i w:val="1"/>
-          <w:iCs w:val="1"/>
-          <w:rtl w:val="1"/>
-        </w:rPr>
-        <w:t xml:space="preserve">_</w:t>
-      </w:r>
-      <w:r>
-        <w:rPr>
-          <w:i w:val="1"/>
-          <w:iCs w:val="1"/>
-          <w:rtl w:val="1"/>
-        </w:rPr>
-        <w:t xml:space="preserve">דרישות</w:t>
-      </w:r>
-      <w:r>
-        <w:rPr>
-          <w:i w:val="1"/>
-          <w:iCs w:val="1"/>
-          <w:rtl w:val="1"/>
-        </w:rPr>
-        <w:t xml:space="preserve">_</w:t>
-      </w:r>
-      <w:r>
-        <w:rPr>
-          <w:i w:val="1"/>
-          <w:iCs w:val="1"/>
-          <w:rtl w:val="1"/>
-        </w:rPr>
-        <w:t xml:space="preserve">ותעדוף</w:t>
-      </w:r>
-      <w:r>
-        <w:rPr>
-          <w:i w:val="1"/>
-          <w:iCs w:val="1"/>
-          <w:rtl w:val="1"/>
-        </w:rPr>
-        <w:t xml:space="preserve">.</w:t>
-      </w:r>
-      <w:r>
-        <w:rPr>
-          <w:i w:val="1"/>
-          <w:iCs w:val="1"/>
-          <w:rtl w:val="0"/>
-        </w:rPr>
-        <w:t xml:space="preserve">md</w:t>
-      </w:r>
-      <w:r>
-        <w:rPr>
-          <w:i w:val="1"/>
-          <w:iCs w:val="1"/>
-          <w:rtl w:val="1"/>
-        </w:rPr>
-        <w:t xml:space="preserve">, </w:t>
-      </w:r>
-      <w:r>
-        <w:rPr>
-          <w:i w:val="1"/>
-          <w:iCs w:val="1"/>
-          <w:rtl w:val="1"/>
-        </w:rPr>
-        <w:t xml:space="preserve">סיפורי</w:t>
-      </w:r>
-      <w:r>
-        <w:rPr>
-          <w:i w:val="1"/>
-          <w:iCs w:val="1"/>
-          <w:rtl w:val="1"/>
-        </w:rPr>
-        <w:t xml:space="preserve">_</w:t>
-      </w:r>
-      <w:r>
-        <w:rPr>
-          <w:i w:val="1"/>
-          <w:iCs w:val="1"/>
-          <w:rtl w:val="1"/>
-        </w:rPr>
-        <w:t xml:space="preserve">משתמש</w:t>
-      </w:r>
-      <w:r>
-        <w:rPr>
-          <w:i w:val="1"/>
-          <w:iCs w:val="1"/>
-          <w:rtl w:val="1"/>
-        </w:rPr>
-        <w:t xml:space="preserve">_</w:t>
-      </w:r>
-      <w:r>
-        <w:rPr>
-          <w:i w:val="1"/>
-          <w:iCs w:val="1"/>
-          <w:rtl w:val="1"/>
-        </w:rPr>
-        <w:t xml:space="preserve">מכל</w:t>
-      </w:r>
-      <w:r>
-        <w:rPr>
-          <w:i w:val="1"/>
-          <w:iCs w:val="1"/>
-          <w:rtl w:val="1"/>
-        </w:rPr>
-        <w:t xml:space="preserve">_</w:t>
-      </w:r>
-      <w:r>
-        <w:rPr>
-          <w:i w:val="1"/>
-          <w:iCs w:val="1"/>
-          <w:rtl w:val="1"/>
-        </w:rPr>
-        <w:t xml:space="preserve">הדרישות</w:t>
-      </w:r>
-      <w:r>
-        <w:rPr>
-          <w:i w:val="1"/>
-          <w:iCs w:val="1"/>
-          <w:rtl w:val="1"/>
-        </w:rPr>
-        <w:t xml:space="preserve">.</w:t>
-      </w:r>
-      <w:r>
-        <w:rPr>
-          <w:i w:val="1"/>
-          <w:iCs w:val="1"/>
-          <w:rtl w:val="0"/>
-        </w:rPr>
-        <w:t xml:space="preserve">md</w:t>
-      </w:r>
-      <w:r>
-        <w:rPr>
-          <w:rtl w:val="0"/>
-        </w:rPr>
+        <w:t>המסמך המלא: doc-requirements-prioritization.docx (https://github.com/Sharpop30/fitness-app/blob/main/project-docs/doc-requirements-prioritization.docx), story-all-requirements.docx (https://github.com/Sharpop30/fitness-app/blob/main/project-docs/story-all-requirements.docx)</w:t>
       </w:r>
     </w:p>
     <w:p>
@@ -30708,108 +29998,7 @@
           <w:iCs w:val="1"/>
           <w:rtl w:val="1"/>
         </w:rPr>
-        <w:t xml:space="preserve">המסמך</w:t>
-      </w:r>
-      <w:r>
-        <w:rPr>
-          <w:i w:val="1"/>
-          <w:iCs w:val="1"/>
-          <w:rtl w:val="1"/>
-        </w:rPr>
-        <w:t xml:space="preserve"> </w:t>
-      </w:r>
-      <w:r>
-        <w:rPr>
-          <w:i w:val="1"/>
-          <w:iCs w:val="1"/>
-          <w:rtl w:val="1"/>
-        </w:rPr>
-        <w:t xml:space="preserve">המלא</w:t>
-      </w:r>
-      <w:r>
-        <w:rPr>
-          <w:i w:val="1"/>
-          <w:iCs w:val="1"/>
-          <w:rtl w:val="1"/>
-        </w:rPr>
-        <w:t xml:space="preserve">: </w:t>
-      </w:r>
-      <w:r>
-        <w:rPr>
-          <w:i w:val="1"/>
-          <w:iCs w:val="1"/>
-          <w:rtl w:val="1"/>
-        </w:rPr>
-        <w:t xml:space="preserve">סיפורי</w:t>
-      </w:r>
-      <w:r>
-        <w:rPr>
-          <w:i w:val="1"/>
-          <w:iCs w:val="1"/>
-          <w:rtl w:val="1"/>
-        </w:rPr>
-        <w:t xml:space="preserve">_</w:t>
-      </w:r>
-      <w:r>
-        <w:rPr>
-          <w:i w:val="1"/>
-          <w:iCs w:val="1"/>
-          <w:rtl w:val="1"/>
-        </w:rPr>
-        <w:t xml:space="preserve">משתמש</w:t>
-      </w:r>
-      <w:r>
-        <w:rPr>
-          <w:i w:val="1"/>
-          <w:iCs w:val="1"/>
-          <w:rtl w:val="1"/>
-        </w:rPr>
-        <w:t xml:space="preserve">_</w:t>
-      </w:r>
-      <w:r>
-        <w:rPr>
-          <w:i w:val="1"/>
-          <w:iCs w:val="1"/>
-          <w:rtl w:val="1"/>
-        </w:rPr>
-        <w:t xml:space="preserve">מכל</w:t>
-      </w:r>
-      <w:r>
-        <w:rPr>
-          <w:i w:val="1"/>
-          <w:iCs w:val="1"/>
-          <w:rtl w:val="1"/>
-        </w:rPr>
-        <w:t xml:space="preserve">_</w:t>
-      </w:r>
-      <w:r>
-        <w:rPr>
-          <w:i w:val="1"/>
-          <w:iCs w:val="1"/>
-          <w:rtl w:val="1"/>
-        </w:rPr>
-        <w:t xml:space="preserve">הדרישות</w:t>
-      </w:r>
-      <w:r>
-        <w:rPr>
-          <w:i w:val="1"/>
-          <w:iCs w:val="1"/>
-          <w:rtl w:val="1"/>
-        </w:rPr>
-        <w:t xml:space="preserve">.</w:t>
-      </w:r>
-      <w:r>
-        <w:rPr>
-          <w:i w:val="1"/>
-          <w:iCs w:val="1"/>
-          <w:rtl w:val="0"/>
-        </w:rPr>
-        <w:t xml:space="preserve">md</w:t>
-      </w:r>
-      <w:r>
-        <w:rPr>
-          <w:rtl w:val="0"/>
-        </w:rPr>
+        <w:t>המסמך המלא: story-all-requirements.docx (https://github.com/Sharpop30/fitness-app/blob/main/project-docs/story-all-requirements.docx)</w:t>
       </w:r>
     </w:p>
     <w:p>
@@ -36108,100 +35297,52 @@
           <w:iCs w:val="1"/>
           <w:rtl w:val="1"/>
         </w:rPr>
-        <w:t xml:space="preserve">טרם</w:t>
-      </w:r>
-      <w:r>
-        <w:rPr>
-          <w:i w:val="1"/>
-          <w:iCs w:val="1"/>
-          <w:rtl w:val="1"/>
-        </w:rPr>
-        <w:t xml:space="preserve"> </w:t>
-      </w:r>
-      <w:r>
-        <w:rPr>
-          <w:i w:val="1"/>
-          <w:iCs w:val="1"/>
-          <w:rtl w:val="1"/>
-        </w:rPr>
-        <w:t xml:space="preserve">עובד</w:t>
-      </w:r>
-      <w:r>
-        <w:rPr>
-          <w:i w:val="1"/>
-          <w:iCs w:val="1"/>
-          <w:rtl w:val="1"/>
-        </w:rPr>
-        <w:t xml:space="preserve"> </w:t>
-      </w:r>
-      <w:r>
-        <w:rPr>
-          <w:i w:val="1"/>
-          <w:iCs w:val="1"/>
-          <w:rtl w:val="1"/>
-        </w:rPr>
-        <w:t xml:space="preserve">בפרויקט</w:t>
-      </w:r>
-      <w:r>
-        <w:rPr>
-          <w:i w:val="1"/>
-          <w:iCs w:val="1"/>
-          <w:rtl w:val="1"/>
-        </w:rPr>
-        <w:t xml:space="preserve"> - </w:t>
-      </w:r>
-      <w:r>
-        <w:rPr>
-          <w:i w:val="1"/>
-          <w:iCs w:val="1"/>
-          <w:rtl w:val="1"/>
-        </w:rPr>
-        <w:t xml:space="preserve">יעודכן</w:t>
-      </w:r>
-      <w:r>
-        <w:rPr>
-          <w:i w:val="1"/>
-          <w:iCs w:val="1"/>
-          <w:rtl w:val="1"/>
-        </w:rPr>
-        <w:t xml:space="preserve"> </w:t>
-      </w:r>
-      <w:r>
-        <w:rPr>
-          <w:i w:val="1"/>
-          <w:iCs w:val="1"/>
-          <w:rtl w:val="1"/>
-        </w:rPr>
-        <w:t xml:space="preserve">כשהנושא</w:t>
-      </w:r>
-      <w:r>
-        <w:rPr>
-          <w:i w:val="1"/>
-          <w:iCs w:val="1"/>
-          <w:rtl w:val="1"/>
-        </w:rPr>
-        <w:t xml:space="preserve"> </w:t>
-      </w:r>
-      <w:r>
-        <w:rPr>
-          <w:i w:val="1"/>
-          <w:iCs w:val="1"/>
-          <w:rtl w:val="1"/>
-        </w:rPr>
-        <w:t xml:space="preserve">ייסגר</w:t>
-      </w:r>
-      <w:r>
-        <w:rPr>
-          <w:i w:val="1"/>
-          <w:iCs w:val="1"/>
-          <w:rtl w:val="1"/>
-        </w:rPr>
-        <w:t xml:space="preserve">.</w:t>
-      </w:r>
-      <w:r>
-        <w:rPr>
-          <w:rtl w:val="0"/>
-        </w:rPr>
+        <w:t>רשימת המערכות: Supabase (מסד נתונים, זהות משתמשים ואחסון קבצים); ספק סליקה וחשבוניות: [טרם נקבע], ובגרסה הראשונה סליקה מדומה בלבד, מסומנת ככזו.</w:t>
+      </w:r>
+    </w:p>
+    <w:p>
+      <w:pPr>
+        <w:bidi w:val="1"/>
+        <w:spacing w:after="200" w:lineRule="auto"/>
+        <w:rPr/>
+      </w:pPr>
+      <w:r>
+        <w:rPr>
+          <w:i w:val="1"/>
+          <w:iCs w:val="1"/>
+          <w:rtl w:val="1"/>
+        </w:rPr>
+        <w:t>סוג החיבור, מבנה הנתונים, תדירות הסנכרון והגורם האחראי: [טרם נקבע], ייקבעו במפת המודולים.</w:t>
+      </w:r>
+    </w:p>
+    <w:p>
+      <w:pPr>
+        <w:bidi w:val="1"/>
+        <w:spacing w:after="200" w:lineRule="auto"/>
+        <w:rPr/>
+      </w:pPr>
+      <w:r>
+        <w:rPr>
+          <w:i w:val="1"/>
+          <w:iCs w:val="1"/>
+          <w:rtl w:val="1"/>
+        </w:rPr>
+        <w:t>שאלת בדיקה עצמית: האם לכל מערכת חיצונית יש סוג חיבור וגורם אחראי?</w:t>
+      </w:r>
+    </w:p>
+    <w:p>
+      <w:pPr>
+        <w:bidi w:val="1"/>
+        <w:spacing w:after="200" w:lineRule="auto"/>
+        <w:rPr/>
+      </w:pPr>
+      <w:r>
+        <w:rPr>
+          <w:i w:val="1"/>
+          <w:iCs w:val="1"/>
+          <w:rtl w:val="1"/>
+        </w:rPr>
+        <w:t>המסמך המלא: doc-work-plan-fitness-app.md (https://github.com/Sharpop30/fitness-app/blob/main/project-docs/doc-work-plan-fitness-app.md)</w:t>
       </w:r>
     </w:p>
     <w:p>
@@ -36472,100 +35613,52 @@
           <w:iCs w:val="1"/>
           <w:rtl w:val="1"/>
         </w:rPr>
-        <w:t xml:space="preserve">טרם</w:t>
-      </w:r>
-      <w:r>
-        <w:rPr>
-          <w:i w:val="1"/>
-          <w:iCs w:val="1"/>
-          <w:rtl w:val="1"/>
-        </w:rPr>
-        <w:t xml:space="preserve"> </w:t>
-      </w:r>
-      <w:r>
-        <w:rPr>
-          <w:i w:val="1"/>
-          <w:iCs w:val="1"/>
-          <w:rtl w:val="1"/>
-        </w:rPr>
-        <w:t xml:space="preserve">עובד</w:t>
-      </w:r>
-      <w:r>
-        <w:rPr>
-          <w:i w:val="1"/>
-          <w:iCs w:val="1"/>
-          <w:rtl w:val="1"/>
-        </w:rPr>
-        <w:t xml:space="preserve"> </w:t>
-      </w:r>
-      <w:r>
-        <w:rPr>
-          <w:i w:val="1"/>
-          <w:iCs w:val="1"/>
-          <w:rtl w:val="1"/>
-        </w:rPr>
-        <w:t xml:space="preserve">בפרויקט</w:t>
-      </w:r>
-      <w:r>
-        <w:rPr>
-          <w:i w:val="1"/>
-          <w:iCs w:val="1"/>
-          <w:rtl w:val="1"/>
-        </w:rPr>
-        <w:t xml:space="preserve"> - </w:t>
-      </w:r>
-      <w:r>
-        <w:rPr>
-          <w:i w:val="1"/>
-          <w:iCs w:val="1"/>
-          <w:rtl w:val="1"/>
-        </w:rPr>
-        <w:t xml:space="preserve">יעודכן</w:t>
-      </w:r>
-      <w:r>
-        <w:rPr>
-          <w:i w:val="1"/>
-          <w:iCs w:val="1"/>
-          <w:rtl w:val="1"/>
-        </w:rPr>
-        <w:t xml:space="preserve"> </w:t>
-      </w:r>
-      <w:r>
-        <w:rPr>
-          <w:i w:val="1"/>
-          <w:iCs w:val="1"/>
-          <w:rtl w:val="1"/>
-        </w:rPr>
-        <w:t xml:space="preserve">כשהנושא</w:t>
-      </w:r>
-      <w:r>
-        <w:rPr>
-          <w:i w:val="1"/>
-          <w:iCs w:val="1"/>
-          <w:rtl w:val="1"/>
-        </w:rPr>
-        <w:t xml:space="preserve"> </w:t>
-      </w:r>
-      <w:r>
-        <w:rPr>
-          <w:i w:val="1"/>
-          <w:iCs w:val="1"/>
-          <w:rtl w:val="1"/>
-        </w:rPr>
-        <w:t xml:space="preserve">ייסגר</w:t>
-      </w:r>
-      <w:r>
-        <w:rPr>
-          <w:i w:val="1"/>
-          <w:iCs w:val="1"/>
-          <w:rtl w:val="1"/>
-        </w:rPr>
-        <w:t xml:space="preserve">.</w:t>
-      </w:r>
-      <w:r>
-        <w:rPr>
-          <w:rtl w:val="0"/>
-        </w:rPr>
+        <w:t>פלטפורמת המערכת: Supabase. אחסון מסמכי הפרויקט: מאגר GitHub fitness-app ותיקייה מסונכרנת ב-Google Drive. כלי הבנייה: Claude Code. עדכון ה-PRD: ריצה בצ'ט, בלי כלי אוטומציה בשלב זה.</w:t>
+      </w:r>
+    </w:p>
+    <w:p>
+      <w:pPr>
+        <w:bidi w:val="1"/>
+        <w:spacing w:after="200" w:lineRule="auto"/>
+        <w:rPr/>
+      </w:pPr>
+      <w:r>
+        <w:rPr>
+          <w:i w:val="1"/>
+          <w:iCs w:val="1"/>
+          <w:rtl w:val="1"/>
+        </w:rPr>
+        <w:t>נקודות החיבור וההרשאות הנדרשות: [טרם נקבע].</w:t>
+      </w:r>
+    </w:p>
+    <w:p>
+      <w:pPr>
+        <w:bidi w:val="1"/>
+        <w:spacing w:after="200" w:lineRule="auto"/>
+        <w:rPr/>
+      </w:pPr>
+      <w:r>
+        <w:rPr>
+          <w:i w:val="1"/>
+          <w:iCs w:val="1"/>
+          <w:rtl w:val="1"/>
+        </w:rPr>
+        <w:t>שאלת בדיקה עצמית: האם ידוע איפה המערכת חיה ומי מחזיק בהרשאות אליה?</w:t>
+      </w:r>
+    </w:p>
+    <w:p>
+      <w:pPr>
+        <w:bidi w:val="1"/>
+        <w:spacing w:after="200" w:lineRule="auto"/>
+        <w:rPr/>
+      </w:pPr>
+      <w:r>
+        <w:rPr>
+          <w:i w:val="1"/>
+          <w:iCs w:val="1"/>
+          <w:rtl w:val="1"/>
+        </w:rPr>
+        <w:t>המסמך המלא: doc-work-plan-fitness-app.md (https://github.com/Sharpop30/fitness-app/blob/main/project-docs/doc-work-plan-fitness-app.md), ו-file-system-index.md (https://github.com/Sharpop30/fitness-app/blob/main/project-docs/file-system-index.md)</w:t>
       </w:r>
     </w:p>
     <w:p>
@@ -41993,100 +41086,67 @@
           <w:iCs w:val="1"/>
           <w:rtl w:val="1"/>
         </w:rPr>
-        <w:t xml:space="preserve">טרם</w:t>
-      </w:r>
-      <w:r>
-        <w:rPr>
-          <w:i w:val="1"/>
-          <w:iCs w:val="1"/>
-          <w:rtl w:val="1"/>
-        </w:rPr>
-        <w:t xml:space="preserve"> </w:t>
-      </w:r>
-      <w:r>
-        <w:rPr>
-          <w:i w:val="1"/>
-          <w:iCs w:val="1"/>
-          <w:rtl w:val="1"/>
-        </w:rPr>
-        <w:t xml:space="preserve">עובד</w:t>
-      </w:r>
-      <w:r>
-        <w:rPr>
-          <w:i w:val="1"/>
-          <w:iCs w:val="1"/>
-          <w:rtl w:val="1"/>
-        </w:rPr>
-        <w:t xml:space="preserve"> </w:t>
-      </w:r>
-      <w:r>
-        <w:rPr>
-          <w:i w:val="1"/>
-          <w:iCs w:val="1"/>
-          <w:rtl w:val="1"/>
-        </w:rPr>
-        <w:t xml:space="preserve">בפרויקט</w:t>
-      </w:r>
-      <w:r>
-        <w:rPr>
-          <w:i w:val="1"/>
-          <w:iCs w:val="1"/>
-          <w:rtl w:val="1"/>
-        </w:rPr>
-        <w:t xml:space="preserve"> - </w:t>
-      </w:r>
-      <w:r>
-        <w:rPr>
-          <w:i w:val="1"/>
-          <w:iCs w:val="1"/>
-          <w:rtl w:val="1"/>
-        </w:rPr>
-        <w:t xml:space="preserve">יעודכן</w:t>
-      </w:r>
-      <w:r>
-        <w:rPr>
-          <w:i w:val="1"/>
-          <w:iCs w:val="1"/>
-          <w:rtl w:val="1"/>
-        </w:rPr>
-        <w:t xml:space="preserve"> </w:t>
-      </w:r>
-      <w:r>
-        <w:rPr>
-          <w:i w:val="1"/>
-          <w:iCs w:val="1"/>
-          <w:rtl w:val="1"/>
-        </w:rPr>
-        <w:t xml:space="preserve">כשהנושא</w:t>
-      </w:r>
-      <w:r>
-        <w:rPr>
-          <w:i w:val="1"/>
-          <w:iCs w:val="1"/>
-          <w:rtl w:val="1"/>
-        </w:rPr>
-        <w:t xml:space="preserve"> </w:t>
-      </w:r>
-      <w:r>
-        <w:rPr>
-          <w:i w:val="1"/>
-          <w:iCs w:val="1"/>
-          <w:rtl w:val="1"/>
-        </w:rPr>
-        <w:t xml:space="preserve">ייסגר</w:t>
-      </w:r>
-      <w:r>
-        <w:rPr>
-          <w:i w:val="1"/>
-          <w:iCs w:val="1"/>
-          <w:rtl w:val="1"/>
-        </w:rPr>
-        <w:t xml:space="preserve">.</w:t>
-      </w:r>
-      <w:r>
-        <w:rPr>
-          <w:rtl w:val="0"/>
-        </w:rPr>
+        <w:t>הבנייה נמדדת בשלבים ולא בזמן, לפי מנגנון הבנייה המודולרית (פריט 46).</w:t>
+      </w:r>
+    </w:p>
+    <w:p>
+      <w:pPr>
+        <w:bidi w:val="1"/>
+        <w:spacing w:after="100" w:lineRule="auto"/>
+        <w:rPr/>
+      </w:pPr>
+      <w:r>
+        <w:rPr>
+          <w:i w:val="1"/>
+          <w:iCs w:val="1"/>
+          <w:rtl w:val="1"/>
+        </w:rPr>
+        <w:t>אבני הדרך: (1) קליטה ותשתית: הושלם. (2) השלמת האבחון: בביצוע, הגדרת הפרויקט, מיפוי התהליכים והיעדים אושרו. (3) השלמת האפיון עד מפת המודולים ומסמך הבנייה: ממתין. (4) הבנייה בשבעת שלבי סדר הבנייה: ממתין.</w:t>
+      </w:r>
+    </w:p>
+    <w:p>
+      <w:pPr>
+        <w:bidi w:val="1"/>
+        <w:spacing w:after="100" w:lineRule="auto"/>
+        <w:rPr/>
+      </w:pPr>
+      <w:r>
+        <w:rPr>
+          <w:i w:val="1"/>
+          <w:iCs w:val="1"/>
+          <w:rtl w:val="1"/>
+        </w:rPr>
+        <w:t>המועדים: [טרם נקבע].</w:t>
+      </w:r>
+    </w:p>
+    <w:p>
+      <w:pPr>
+        <w:bidi w:val="1"/>
+        <w:spacing w:after="100" w:lineRule="auto"/>
+        <w:rPr/>
+      </w:pPr>
+      <w:r>
+        <w:rPr>
+          <w:i w:val="1"/>
+          <w:iCs w:val="1"/>
+          <w:rtl w:val="1"/>
+        </w:rPr>
+        <w:t>שאלת בדיקה עצמית: האם לכל אבן דרך יש מצב עדכני?</w:t>
+      </w:r>
+    </w:p>
+    <w:p>
+      <w:pPr>
+        <w:bidi w:val="1"/>
+        <w:spacing w:after="100" w:lineRule="auto"/>
+        <w:rPr/>
+      </w:pPr>
+      <w:r>
+        <w:rPr>
+          <w:i w:val="1"/>
+          <w:iCs w:val="1"/>
+          <w:rtl w:val="1"/>
+        </w:rPr>
+        <w:t>המסמך המלא: doc-work-plan-fitness-app.md (https://github.com/Sharpop30/fitness-app/blob/main/project-docs/doc-work-plan-fitness-app.md)</w:t>
       </w:r>
     </w:p>
     <w:sectPr>

</xml_diff>

<commit_message>
PRD v1.2: unified wording in section 2, build decision in section 6
Co-Authored-By: Claude Opus 5.5 <noreply@anthropic.com>
</commit_message>
<xml_diff>
--- a/project-docs/prd-fitness-app.docx
+++ b/project-docs/prd-fitness-app.docx
@@ -1529,12 +1529,7 @@
                 <w:szCs w:val="20"/>
                 <w:rtl w:val="0"/>
               </w:rPr>
-              <w:t>1.1</w:t>
-            </w:r>
-            <w:r>
-              <w:rPr>
-                <w:rtl w:val="0"/>
-              </w:rPr>
+              <w:t>1.2</w:t>
             </w:r>
           </w:p>
         </w:tc>
@@ -2226,6 +2221,84 @@
           </w:p>
         </w:tc>
       </w:tr>
+      <w:tr>
+        <w:trPr>
+          <w:cantSplit w:val="0"/>
+          <w:tblHeader w:val="0"/>
+        </w:trPr>
+        <w:tc>
+          <w:tcPr>
+            <w:tcMar>
+              <w:top w:w="60.0" w:type="dxa"/>
+              <w:left w:w="100.0" w:type="dxa"/>
+              <w:bottom w:w="60.0" w:type="dxa"/>
+              <w:right w:w="100.0" w:type="dxa"/>
+            </w:tcMar>
+          </w:tcPr>
+          <w:p>
+            <w:pPr>
+              <w:bidi w:val="1"/>
+              <w:rPr/>
+            </w:pPr>
+            <w:r>
+              <w:rPr>
+                <w:sz w:val="20"/>
+                <w:szCs w:val="20"/>
+                <w:rtl w:val="1"/>
+              </w:rPr>
+              <w:t>סעיף 2: "שמחזירים אותו לאפליקציה" הוחלף ב"שמשמרים אותו באפליקציה", לפי doc-project-definition גרסה 2. סעיף 6: ההכרעה לפתח, לפי doc-work-plan-fitness-app גרסה 2</w:t>
+            </w:r>
+          </w:p>
+        </w:tc>
+        <w:tc>
+          <w:tcPr>
+            <w:tcMar>
+              <w:top w:w="60.0" w:type="dxa"/>
+              <w:left w:w="100.0" w:type="dxa"/>
+              <w:bottom w:w="60.0" w:type="dxa"/>
+              <w:right w:w="100.0" w:type="dxa"/>
+            </w:tcMar>
+          </w:tcPr>
+          <w:p>
+            <w:pPr>
+              <w:bidi w:val="1"/>
+              <w:rPr/>
+            </w:pPr>
+            <w:r>
+              <w:rPr>
+                <w:sz w:val="20"/>
+                <w:szCs w:val="20"/>
+                <w:rtl w:val="0"/>
+              </w:rPr>
+              <w:t>27.09.2026</w:t>
+            </w:r>
+          </w:p>
+        </w:tc>
+        <w:tc>
+          <w:tcPr>
+            <w:tcMar>
+              <w:top w:w="60.0" w:type="dxa"/>
+              <w:left w:w="100.0" w:type="dxa"/>
+              <w:bottom w:w="60.0" w:type="dxa"/>
+              <w:right w:w="100.0" w:type="dxa"/>
+            </w:tcMar>
+          </w:tcPr>
+          <w:p>
+            <w:pPr>
+              <w:bidi w:val="1"/>
+              <w:rPr/>
+            </w:pPr>
+            <w:r>
+              <w:rPr>
+                <w:sz w:val="20"/>
+                <w:szCs w:val="20"/>
+                <w:rtl w:val="0"/>
+              </w:rPr>
+              <w:t>1.2</w:t>
+            </w:r>
+          </w:p>
+        </w:tc>
+      </w:tr>
     </w:tbl>
     <w:p>
       <w:pPr>
@@ -2838,7 +2911,7 @@
           <w:iCs w:val="1"/>
           <w:rtl w:val="1"/>
         </w:rPr>
-        <w:t>אפליקציה אחת למאמן כושר אישי ולמתאמנים שלו. המאמן בונה בה תוכניות אימון, גובה תשלום ומפיק חשבונית, ועוקב אחרי ההתקדמות של כל מתאמן, בלי לקפוץ בין אפליקציות ובלי ניירת. המתאמן מזין תוצאות, מקבל משוב, ומשתתף באתגרים ובתגמולים שמחזירים אותו לאפליקציה. ארבע דרישות החובה: ניהול תוכניות אימון, סליקה וחשבוניות, ניהול תפעולי מאוחד, והזנת תוצאות אימון למעקב ארוך טווח. המתחרים חזקים בשכבת הצורך או בשכבת הרצון, והפער הוא בשילוב שתיהן.</w:t>
+        <w:t>אפליקציה אחת למאמן כושר אישי ולמתאמנים שלו. המאמן בונה בה תוכניות אימון, גובה תשלום ומפיק חשבונית, ועוקב אחרי ההתקדמות של כל מתאמן, בלי לקפוץ בין אפליקציות ובלי ניירת. המתאמן מזין תוצאות, מקבל משוב, ומשתתף באתגרים ובתגמולים שמשמרים אותו באפליקציה. ארבע דרישות החובה: ניהול תוכניות אימון, סליקה וחשבוניות, ניהול תפעולי מאוחד, והזנת תוצאות אימון למעקב ארוך טווח. המתחרים חזקים בשכבת הצורך או בשכבת הרצון, והפער הוא בשילוב שתיהן.</w:t>
       </w:r>
     </w:p>
     <w:p>
@@ -10269,230 +10342,7 @@
           <w:bCs w:val="1"/>
           <w:rtl w:val="1"/>
         </w:rPr>
-        <w:t xml:space="preserve">הכרעה</w:t>
-      </w:r>
-      <w:r>
-        <w:rPr>
-          <w:b w:val="1"/>
-          <w:bCs w:val="1"/>
-          <w:rtl w:val="1"/>
-        </w:rPr>
-        <w:t xml:space="preserve"> </w:t>
-      </w:r>
-      <w:r>
-        <w:rPr>
-          <w:b w:val="1"/>
-          <w:bCs w:val="1"/>
-          <w:rtl w:val="1"/>
-        </w:rPr>
-        <w:t xml:space="preserve">לפתח</w:t>
-      </w:r>
-      <w:r>
-        <w:rPr>
-          <w:b w:val="1"/>
-          <w:bCs w:val="1"/>
-          <w:rtl w:val="1"/>
-        </w:rPr>
-        <w:t xml:space="preserve"> </w:t>
-      </w:r>
-      <w:r>
-        <w:rPr>
-          <w:b w:val="1"/>
-          <w:bCs w:val="1"/>
-          <w:rtl w:val="1"/>
-        </w:rPr>
-        <w:t xml:space="preserve">או</w:t>
-      </w:r>
-      <w:r>
-        <w:rPr>
-          <w:b w:val="1"/>
-          <w:bCs w:val="1"/>
-          <w:rtl w:val="1"/>
-        </w:rPr>
-        <w:t xml:space="preserve"> </w:t>
-      </w:r>
-      <w:r>
-        <w:rPr>
-          <w:b w:val="1"/>
-          <w:bCs w:val="1"/>
-          <w:rtl w:val="1"/>
-        </w:rPr>
-        <w:t xml:space="preserve">לרכוש</w:t>
-      </w:r>
-      <w:r>
-        <w:rPr>
-          <w:b w:val="1"/>
-          <w:bCs w:val="1"/>
-          <w:rtl w:val="1"/>
-        </w:rPr>
-        <w:t xml:space="preserve">: </w:t>
-      </w:r>
-      <w:r>
-        <w:rPr>
-          <w:rtl w:val="0"/>
-        </w:rPr>
-      </w:r>
-      <w:r>
-        <w:rPr>
-          <w:rtl w:val="1"/>
-        </w:rPr>
-        <w:t xml:space="preserve">[</w:t>
-      </w:r>
-      <w:r>
-        <w:rPr>
-          <w:rtl w:val="1"/>
-        </w:rPr>
-        <w:t xml:space="preserve">טרם</w:t>
-      </w:r>
-      <w:r>
-        <w:rPr>
-          <w:rtl w:val="1"/>
-        </w:rPr>
-        <w:t xml:space="preserve"> </w:t>
-      </w:r>
-      <w:r>
-        <w:rPr>
-          <w:rtl w:val="1"/>
-        </w:rPr>
-        <w:t xml:space="preserve">נקבע</w:t>
-      </w:r>
-      <w:r>
-        <w:rPr>
-          <w:rtl w:val="1"/>
-        </w:rPr>
-        <w:t xml:space="preserve">] — </w:t>
-      </w:r>
-      <w:r>
-        <w:rPr>
-          <w:rtl w:val="1"/>
-        </w:rPr>
-        <w:t xml:space="preserve">לא</w:t>
-      </w:r>
-      <w:r>
-        <w:rPr>
-          <w:rtl w:val="1"/>
-        </w:rPr>
-        <w:t xml:space="preserve"> </w:t>
-      </w:r>
-      <w:r>
-        <w:rPr>
-          <w:rtl w:val="1"/>
-        </w:rPr>
-        <w:t xml:space="preserve">נמצאה</w:t>
-      </w:r>
-      <w:r>
-        <w:rPr>
-          <w:rtl w:val="1"/>
-        </w:rPr>
-        <w:t xml:space="preserve"> </w:t>
-      </w:r>
-      <w:r>
-        <w:rPr>
-          <w:rtl w:val="1"/>
-        </w:rPr>
-        <w:t xml:space="preserve">במסמכים</w:t>
-      </w:r>
-      <w:r>
-        <w:rPr>
-          <w:rtl w:val="1"/>
-        </w:rPr>
-        <w:t xml:space="preserve"> </w:t>
-      </w:r>
-      <w:r>
-        <w:rPr>
-          <w:rtl w:val="1"/>
-        </w:rPr>
-        <w:t xml:space="preserve">הכרעה</w:t>
-      </w:r>
-      <w:r>
-        <w:rPr>
-          <w:rtl w:val="1"/>
-        </w:rPr>
-        <w:t xml:space="preserve"> </w:t>
-      </w:r>
-      <w:r>
-        <w:rPr>
-          <w:rtl w:val="1"/>
-        </w:rPr>
-        <w:t xml:space="preserve">מפורשת</w:t>
-      </w:r>
-      <w:r>
-        <w:rPr>
-          <w:rtl w:val="1"/>
-        </w:rPr>
-        <w:t xml:space="preserve"> </w:t>
-      </w:r>
-      <w:r>
-        <w:rPr>
-          <w:rtl w:val="1"/>
-        </w:rPr>
-        <w:t xml:space="preserve">בין</w:t>
-      </w:r>
-      <w:r>
-        <w:rPr>
-          <w:rtl w:val="1"/>
-        </w:rPr>
-        <w:t xml:space="preserve"> </w:t>
-      </w:r>
-      <w:r>
-        <w:rPr>
-          <w:rtl w:val="1"/>
-        </w:rPr>
-        <w:t xml:space="preserve">פיתוח</w:t>
-      </w:r>
-      <w:r>
-        <w:rPr>
-          <w:rtl w:val="1"/>
-        </w:rPr>
-        <w:t xml:space="preserve"> </w:t>
-      </w:r>
-      <w:r>
-        <w:rPr>
-          <w:rtl w:val="1"/>
-        </w:rPr>
-        <w:t xml:space="preserve">עצמאי</w:t>
-      </w:r>
-      <w:r>
-        <w:rPr>
-          <w:rtl w:val="1"/>
-        </w:rPr>
-        <w:t xml:space="preserve"> </w:t>
-      </w:r>
-      <w:r>
-        <w:rPr>
-          <w:rtl w:val="1"/>
-        </w:rPr>
-        <w:t xml:space="preserve">לרכישת</w:t>
-      </w:r>
-      <w:r>
-        <w:rPr>
-          <w:rtl w:val="1"/>
-        </w:rPr>
-        <w:t xml:space="preserve"> </w:t>
-      </w:r>
-      <w:r>
-        <w:rPr>
-          <w:rtl w:val="1"/>
-        </w:rPr>
-        <w:t xml:space="preserve">פתרון</w:t>
-      </w:r>
-      <w:r>
-        <w:rPr>
-          <w:rtl w:val="1"/>
-        </w:rPr>
-        <w:t xml:space="preserve"> </w:t>
-      </w:r>
-      <w:r>
-        <w:rPr>
-          <w:rtl w:val="1"/>
-        </w:rPr>
-        <w:t xml:space="preserve">קיים</w:t>
-      </w:r>
-      <w:r>
-        <w:rPr>
-          <w:rtl w:val="1"/>
-        </w:rPr>
-        <w:t xml:space="preserve">.</w:t>
+        <w:t>הכרעה לפתח או לרכוש: לפתח. המערכת נבנית בידי הצוות על Supabase, ולא נרכש פתרון קיים. בהכרעת הצוות מ-27.09.2026 (doc-work-plan-fitness-app.md)</w:t>
       </w:r>
     </w:p>
     <w:p>

</xml_diff>

<commit_message>
Approve MLP scope; PRD v1.3; add story 30 draft
Co-Authored-By: Claude Opus 5.5 <noreply@anthropic.com>
</commit_message>
<xml_diff>
--- a/project-docs/prd-fitness-app.docx
+++ b/project-docs/prd-fitness-app.docx
@@ -1529,7 +1529,7 @@
                 <w:szCs w:val="20"/>
                 <w:rtl w:val="0"/>
               </w:rPr>
-              <w:t>1.2</w:t>
+              <w:t>1.3</w:t>
             </w:r>
           </w:p>
         </w:tc>
@@ -2295,6 +2295,84 @@
                 <w:rtl w:val="0"/>
               </w:rPr>
               <w:t>1.2</w:t>
+            </w:r>
+          </w:p>
+        </w:tc>
+      </w:tr>
+      <w:tr>
+        <w:trPr>
+          <w:cantSplit w:val="0"/>
+          <w:tblHeader w:val="0"/>
+        </w:trPr>
+        <w:tc>
+          <w:tcPr>
+            <w:tcMar>
+              <w:top w:w="60.0" w:type="dxa"/>
+              <w:left w:w="100.0" w:type="dxa"/>
+              <w:bottom w:w="60.0" w:type="dxa"/>
+              <w:right w:w="100.0" w:type="dxa"/>
+            </w:tcMar>
+          </w:tcPr>
+          <w:p>
+            <w:pPr>
+              <w:bidi w:val="1"/>
+              <w:rPr/>
+            </w:pPr>
+            <w:r>
+              <w:rPr>
+                <w:sz w:val="20"/>
+                <w:szCs w:val="20"/>
+                <w:rtl w:val="1"/>
+              </w:rPr>
+              <w:t>סעיף 12 מולא מ-doc-mlp-scope. סעיפים 10 ו-11: נוספה דרישה 30, הרשמה לשיעורים, בהכרעת הצוות</w:t>
+            </w:r>
+          </w:p>
+        </w:tc>
+        <w:tc>
+          <w:tcPr>
+            <w:tcMar>
+              <w:top w:w="60.0" w:type="dxa"/>
+              <w:left w:w="100.0" w:type="dxa"/>
+              <w:bottom w:w="60.0" w:type="dxa"/>
+              <w:right w:w="100.0" w:type="dxa"/>
+            </w:tcMar>
+          </w:tcPr>
+          <w:p>
+            <w:pPr>
+              <w:bidi w:val="1"/>
+              <w:rPr/>
+            </w:pPr>
+            <w:r>
+              <w:rPr>
+                <w:sz w:val="20"/>
+                <w:szCs w:val="20"/>
+                <w:rtl w:val="0"/>
+              </w:rPr>
+              <w:t>27.09.2026</w:t>
+            </w:r>
+          </w:p>
+        </w:tc>
+        <w:tc>
+          <w:tcPr>
+            <w:tcMar>
+              <w:top w:w="60.0" w:type="dxa"/>
+              <w:left w:w="100.0" w:type="dxa"/>
+              <w:bottom w:w="60.0" w:type="dxa"/>
+              <w:right w:w="100.0" w:type="dxa"/>
+            </w:tcMar>
+          </w:tcPr>
+          <w:p>
+            <w:pPr>
+              <w:bidi w:val="1"/>
+              <w:rPr/>
+            </w:pPr>
+            <w:r>
+              <w:rPr>
+                <w:sz w:val="20"/>
+                <w:szCs w:val="20"/>
+                <w:rtl w:val="0"/>
+              </w:rPr>
+              <w:t>1.3</w:t>
             </w:r>
           </w:p>
         </w:tc>
@@ -14515,6 +14593,108 @@
                 <w:szCs w:val="20"/>
                 <w:rtl w:val="1"/>
               </w:rPr>
+              <w:t>[טרם נקבע]</w:t>
+            </w:r>
+          </w:p>
+        </w:tc>
+        <w:tc>
+          <w:tcPr>
+            <w:tcMar>
+              <w:top w:w="60.0" w:type="dxa"/>
+              <w:left w:w="100.0" w:type="dxa"/>
+              <w:bottom w:w="60.0" w:type="dxa"/>
+              <w:right w:w="100.0" w:type="dxa"/>
+            </w:tcMar>
+          </w:tcPr>
+          <w:p>
+            <w:pPr>
+              <w:bidi w:val="1"/>
+              <w:rPr/>
+            </w:pPr>
+            <w:r>
+              <w:rPr>
+                <w:sz w:val="20"/>
+                <w:szCs w:val="20"/>
+                <w:rtl w:val="1"/>
+              </w:rPr>
+              <w:t>צורך</w:t>
+            </w:r>
+          </w:p>
+        </w:tc>
+        <w:tc>
+          <w:tcPr>
+            <w:tcMar>
+              <w:top w:w="60.0" w:type="dxa"/>
+              <w:left w:w="100.0" w:type="dxa"/>
+              <w:bottom w:w="60.0" w:type="dxa"/>
+              <w:right w:w="100.0" w:type="dxa"/>
+            </w:tcMar>
+          </w:tcPr>
+          <w:p>
+            <w:pPr>
+              <w:bidi w:val="1"/>
+              <w:rPr/>
+            </w:pPr>
+            <w:r>
+              <w:rPr>
+                <w:sz w:val="20"/>
+                <w:szCs w:val="20"/>
+                <w:rtl w:val="0"/>
+              </w:rPr>
+              <w:t>Must</w:t>
+            </w:r>
+          </w:p>
+        </w:tc>
+        <w:tc>
+          <w:tcPr>
+            <w:tcMar>
+              <w:top w:w="60.0" w:type="dxa"/>
+              <w:left w:w="100.0" w:type="dxa"/>
+              <w:bottom w:w="60.0" w:type="dxa"/>
+              <w:right w:w="100.0" w:type="dxa"/>
+            </w:tcMar>
+          </w:tcPr>
+          <w:p>
+            <w:pPr>
+              <w:bidi w:val="1"/>
+              <w:rPr/>
+            </w:pPr>
+            <w:r>
+              <w:rPr>
+                <w:sz w:val="20"/>
+                <w:szCs w:val="20"/>
+                <w:rtl w:val="1"/>
+              </w:rPr>
+              <w:t>הרשמה לשיעורים (דרישה 30, נוספה 27.09.2026)</w:t>
+            </w:r>
+          </w:p>
+        </w:tc>
+      </w:tr>
+      <w:tr>
+        <w:trPr>
+          <w:cantSplit w:val="0"/>
+          <w:tblHeader w:val="0"/>
+        </w:trPr>
+        <w:tc>
+          <w:tcPr>
+            <w:tcMar>
+              <w:top w:w="60.0" w:type="dxa"/>
+              <w:left w:w="100.0" w:type="dxa"/>
+              <w:bottom w:w="60.0" w:type="dxa"/>
+              <w:right w:w="100.0" w:type="dxa"/>
+            </w:tcMar>
+          </w:tcPr>
+          <w:p>
+            <w:pPr>
+              <w:bidi w:val="1"/>
+              <w:rPr/>
+            </w:pPr>
+            <w:r>
+              <w:rPr>
+                <w:sz w:val="20"/>
+                <w:szCs w:val="20"/>
+                <w:rtl w:val="1"/>
+              </w:rPr>
               <w:t xml:space="preserve">ניהול</w:t>
             </w:r>
             <w:r>
@@ -29826,6 +30006,36 @@
     </w:p>
     <w:p>
       <w:pPr>
+        <w:keepNext w:val="0"/>
+        <w:keepLines w:val="0"/>
+        <w:pageBreakBefore w:val="0"/>
+        <w:widowControl w:val="1"/>
+        <w:numPr>
+          <w:ilvl w:val="0"/>
+          <w:numId w:val="1"/>
+        </w:numPr>
+        <w:pBdr>
+          <w:top w:space="0" w:sz="0" w:val="nil"/>
+          <w:left w:space="0" w:sz="0" w:val="nil"/>
+          <w:bottom w:space="0" w:sz="0" w:val="nil"/>
+          <w:right w:space="0" w:sz="0" w:val="nil"/>
+          <w:between w:space="0" w:sz="0" w:val="nil"/>
+        </w:pBdr>
+        <w:shd w:fill="auto" w:val="clear"/>
+        <w:bidi w:val="1"/>
+        <w:spacing w:after="60" w:before="0" w:line="240" w:lineRule="auto"/>
+        <w:ind w:left="720" w:right="0" w:hanging="360"/>
+        <w:rPr/>
+      </w:pPr>
+      <w:r>
+        <w:rPr>
+          <w:rtl w:val="0"/>
+        </w:rPr>
+        <w:t>30. הרשמה לשיעורים — Must (נוספה 27.09.2026, הסיפור המלא בטיוטה לאישור)</w:t>
+      </w:r>
+    </w:p>
+    <w:p>
+      <w:pPr>
         <w:bidi w:val="1"/>
         <w:spacing w:after="80" w:lineRule="auto"/>
         <w:rPr/>
@@ -30823,100 +31033,82 @@
           <w:iCs w:val="1"/>
           <w:rtl w:val="1"/>
         </w:rPr>
-        <w:t xml:space="preserve">טרם</w:t>
-      </w:r>
-      <w:r>
-        <w:rPr>
-          <w:i w:val="1"/>
-          <w:iCs w:val="1"/>
-          <w:rtl w:val="1"/>
-        </w:rPr>
-        <w:t xml:space="preserve"> </w:t>
-      </w:r>
-      <w:r>
-        <w:rPr>
-          <w:i w:val="1"/>
-          <w:iCs w:val="1"/>
-          <w:rtl w:val="1"/>
-        </w:rPr>
-        <w:t xml:space="preserve">עובד</w:t>
-      </w:r>
-      <w:r>
-        <w:rPr>
-          <w:i w:val="1"/>
-          <w:iCs w:val="1"/>
-          <w:rtl w:val="1"/>
-        </w:rPr>
-        <w:t xml:space="preserve"> </w:t>
-      </w:r>
-      <w:r>
-        <w:rPr>
-          <w:i w:val="1"/>
-          <w:iCs w:val="1"/>
-          <w:rtl w:val="1"/>
-        </w:rPr>
-        <w:t xml:space="preserve">בפרויקט</w:t>
-      </w:r>
-      <w:r>
-        <w:rPr>
-          <w:i w:val="1"/>
-          <w:iCs w:val="1"/>
-          <w:rtl w:val="1"/>
-        </w:rPr>
-        <w:t xml:space="preserve"> - </w:t>
-      </w:r>
-      <w:r>
-        <w:rPr>
-          <w:i w:val="1"/>
-          <w:iCs w:val="1"/>
-          <w:rtl w:val="1"/>
-        </w:rPr>
-        <w:t xml:space="preserve">יעודכן</w:t>
-      </w:r>
-      <w:r>
-        <w:rPr>
-          <w:i w:val="1"/>
-          <w:iCs w:val="1"/>
-          <w:rtl w:val="1"/>
-        </w:rPr>
-        <w:t xml:space="preserve"> </w:t>
-      </w:r>
-      <w:r>
-        <w:rPr>
-          <w:i w:val="1"/>
-          <w:iCs w:val="1"/>
-          <w:rtl w:val="1"/>
-        </w:rPr>
-        <w:t xml:space="preserve">כשהנושא</w:t>
-      </w:r>
-      <w:r>
-        <w:rPr>
-          <w:i w:val="1"/>
-          <w:iCs w:val="1"/>
-          <w:rtl w:val="1"/>
-        </w:rPr>
-        <w:t xml:space="preserve"> </w:t>
-      </w:r>
-      <w:r>
-        <w:rPr>
-          <w:i w:val="1"/>
-          <w:iCs w:val="1"/>
-          <w:rtl w:val="1"/>
-        </w:rPr>
-        <w:t xml:space="preserve">ייסגר</w:t>
-      </w:r>
-      <w:r>
-        <w:rPr>
-          <w:i w:val="1"/>
-          <w:iCs w:val="1"/>
-          <w:rtl w:val="1"/>
-        </w:rPr>
-        <w:t xml:space="preserve">.</w:t>
-      </w:r>
-      <w:r>
-        <w:rPr>
-          <w:rtl w:val="0"/>
-        </w:rPr>
+        <w:t>דרישות שנכנסות לגרסה הראשונה: צורך: 1 תוכניות אימון, 2 סליקה וחשבוניות (הדגמה בלבד), 12 הזנת תוצאות, 19 ניהול מאוחד, 4 מעקב התקדמות ויזואלי, 30 הרשמה לשיעורים. רצון: 21 משוב מיידי, 6 ו-24 מטבעות ותגמולים, 5 אתגר שבועי, 25 טריגר יומי כתזכורת בתוך האפליקציה, 10 סרטוני הדגמה. עקרונות: 20, 27, 28, 29.</w:t>
+      </w:r>
+    </w:p>
+    <w:p>
+      <w:pPr>
+        <w:bidi w:val="1"/>
+        <w:spacing w:after="200" w:lineRule="auto"/>
+        <w:rPr/>
+      </w:pPr>
+      <w:r>
+        <w:rPr>
+          <w:i w:val="1"/>
+          <w:iCs w:val="1"/>
+          <w:rtl w:val="1"/>
+        </w:rPr>
+        <w:t>דרישות שנדחות לשלב הצמיחה: 7 תזונה ו-22 שיתוף הישגים (דורשות AI או פיד); 9, 11, 14, 23 שכבת הקהילה (Could); 15 סוגי עסק; 3 מיתוג, 13 מעקב אוטומטי, 16 תמחור, 26 תגים; 8, 17, 18 (Won't).</w:t>
+      </w:r>
+    </w:p>
+    <w:p>
+      <w:pPr>
+        <w:bidi w:val="1"/>
+        <w:spacing w:after="200" w:lineRule="auto"/>
+        <w:rPr/>
+      </w:pPr>
+      <w:r>
+        <w:rPr>
+          <w:i w:val="1"/>
+          <w:iCs w:val="1"/>
+          <w:rtl w:val="1"/>
+        </w:rPr>
+        <w:t>קריטריוני קבלה: לכל דרישה שנכנסת, מה עושים ומה חייבים לראות, במסמך המלא. הערכים המספריים (כמו מטבעות לפעולה) [טרם נקבע], ונשמרים בטבלת ייחוס.</w:t>
+      </w:r>
+    </w:p>
+    <w:p>
+      <w:pPr>
+        <w:bidi w:val="1"/>
+        <w:spacing w:after="200" w:lineRule="auto"/>
+        <w:rPr/>
+      </w:pPr>
+      <w:r>
+        <w:rPr>
+          <w:i w:val="1"/>
+          <w:iCs w:val="1"/>
+          <w:rtl w:val="1"/>
+        </w:rPr>
+        <w:t>תנאי אישור: בדיקה מול מאמן (האם הוא מנהל תוכנית, גבייה ומעקב בלי אפליקציה נוספת ובלי הדרכה) ומול מתאמן (האם הוא מזין תוצאה בלי מאמץ ורוצה לחזור). מי הבודקים וכמה: [טרם נקבע].</w:t>
+      </w:r>
+    </w:p>
+    <w:p>
+      <w:pPr>
+        <w:bidi w:val="1"/>
+        <w:spacing w:after="200" w:lineRule="auto"/>
+        <w:rPr/>
+      </w:pPr>
+      <w:r>
+        <w:rPr>
+          <w:i w:val="1"/>
+          <w:iCs w:val="1"/>
+          <w:rtl w:val="1"/>
+        </w:rPr>
+        <w:t>שאלת בדיקה עצמית: האם כל דרישה שנכנסה מגובה בשורה בסעיף 10, וכל דרישה שנדחתה נושאת סיבה?</w:t>
+      </w:r>
+    </w:p>
+    <w:p>
+      <w:pPr>
+        <w:bidi w:val="1"/>
+        <w:spacing w:after="200" w:lineRule="auto"/>
+        <w:rPr/>
+      </w:pPr>
+      <w:r>
+        <w:rPr>
+          <w:i w:val="1"/>
+          <w:iCs w:val="1"/>
+          <w:rtl w:val="1"/>
+        </w:rPr>
+        <w:t>המסמך המלא: doc-mlp-scope.md (https://github.com/Sharpop30/fitness-app/blob/main/project-docs/doc-mlp-scope.md)</w:t>
       </w:r>
     </w:p>
     <w:p>

</xml_diff>

<commit_message>
Approve story 30; PRD v1.4
Co-Authored-By: Claude Opus 5.5 <noreply@anthropic.com>
</commit_message>
<xml_diff>
--- a/project-docs/prd-fitness-app.docx
+++ b/project-docs/prd-fitness-app.docx
@@ -1529,7 +1529,7 @@
                 <w:szCs w:val="20"/>
                 <w:rtl w:val="0"/>
               </w:rPr>
-              <w:t>1.3</w:t>
+              <w:t>1.4</w:t>
             </w:r>
           </w:p>
         </w:tc>
@@ -2373,6 +2373,84 @@
                 <w:rtl w:val="0"/>
               </w:rPr>
               <w:t>1.3</w:t>
+            </w:r>
+          </w:p>
+        </w:tc>
+      </w:tr>
+      <w:tr>
+        <w:trPr>
+          <w:cantSplit w:val="0"/>
+          <w:tblHeader w:val="0"/>
+        </w:trPr>
+        <w:tc>
+          <w:tcPr>
+            <w:tcMar>
+              <w:top w:w="60.0" w:type="dxa"/>
+              <w:left w:w="100.0" w:type="dxa"/>
+              <w:bottom w:w="60.0" w:type="dxa"/>
+              <w:right w:w="100.0" w:type="dxa"/>
+            </w:tcMar>
+          </w:tcPr>
+          <w:p>
+            <w:pPr>
+              <w:bidi w:val="1"/>
+              <w:rPr/>
+            </w:pPr>
+            <w:r>
+              <w:rPr>
+                <w:sz w:val="20"/>
+                <w:szCs w:val="20"/>
+                <w:rtl w:val="1"/>
+              </w:rPr>
+              <w:t>סעיף 11: סיפור 30 אושר, ונוספו ההכרעות והקישור</w:t>
+            </w:r>
+          </w:p>
+        </w:tc>
+        <w:tc>
+          <w:tcPr>
+            <w:tcMar>
+              <w:top w:w="60.0" w:type="dxa"/>
+              <w:left w:w="100.0" w:type="dxa"/>
+              <w:bottom w:w="60.0" w:type="dxa"/>
+              <w:right w:w="100.0" w:type="dxa"/>
+            </w:tcMar>
+          </w:tcPr>
+          <w:p>
+            <w:pPr>
+              <w:bidi w:val="1"/>
+              <w:rPr/>
+            </w:pPr>
+            <w:r>
+              <w:rPr>
+                <w:sz w:val="20"/>
+                <w:szCs w:val="20"/>
+                <w:rtl w:val="0"/>
+              </w:rPr>
+              <w:t>27.09.2026</w:t>
+            </w:r>
+          </w:p>
+        </w:tc>
+        <w:tc>
+          <w:tcPr>
+            <w:tcMar>
+              <w:top w:w="60.0" w:type="dxa"/>
+              <w:left w:w="100.0" w:type="dxa"/>
+              <w:bottom w:w="60.0" w:type="dxa"/>
+              <w:right w:w="100.0" w:type="dxa"/>
+            </w:tcMar>
+          </w:tcPr>
+          <w:p>
+            <w:pPr>
+              <w:bidi w:val="1"/>
+              <w:rPr/>
+            </w:pPr>
+            <w:r>
+              <w:rPr>
+                <w:sz w:val="20"/>
+                <w:szCs w:val="20"/>
+                <w:rtl w:val="0"/>
+              </w:rPr>
+              <w:t>1.4</w:t>
             </w:r>
           </w:p>
         </w:tc>
@@ -30031,7 +30109,7 @@
         <w:rPr>
           <w:rtl w:val="0"/>
         </w:rPr>
-        <w:t>30. הרשמה לשיעורים — Must (נוספה 27.09.2026, הסיפור המלא בטיוטה לאישור)</w:t>
+        <w:t>30. הרשמה לשיעורים — Must. שיעור קבוצתי עם מספר מקומות מוגבל, בלי קשר לתשלום. הסיפור המלא: story-30-class-registration.md (https://github.com/Sharpop30/fitness-app/blob/main/project-docs/story-30-class-registration.md)</w:t>
       </w:r>
     </w:p>
     <w:p>

</xml_diff>

<commit_message>
Story 30 v2 (waitlist, 24h cancel); PRD v1.5; story 1 draft
Co-Authored-By: Claude Opus 5.5 <noreply@anthropic.com>
</commit_message>
<xml_diff>
--- a/project-docs/prd-fitness-app.docx
+++ b/project-docs/prd-fitness-app.docx
@@ -1529,7 +1529,7 @@
                 <w:szCs w:val="20"/>
                 <w:rtl w:val="0"/>
               </w:rPr>
-              <w:t>1.4</w:t>
+              <w:t>1.5</w:t>
             </w:r>
           </w:p>
         </w:tc>
@@ -2451,6 +2451,84 @@
                 <w:rtl w:val="0"/>
               </w:rPr>
               <w:t>1.4</w:t>
+            </w:r>
+          </w:p>
+        </w:tc>
+      </w:tr>
+      <w:tr>
+        <w:trPr>
+          <w:cantSplit w:val="0"/>
+          <w:tblHeader w:val="0"/>
+        </w:trPr>
+        <w:tc>
+          <w:tcPr>
+            <w:tcMar>
+              <w:top w:w="60.0" w:type="dxa"/>
+              <w:left w:w="100.0" w:type="dxa"/>
+              <w:bottom w:w="60.0" w:type="dxa"/>
+              <w:right w:w="100.0" w:type="dxa"/>
+            </w:tcMar>
+          </w:tcPr>
+          <w:p>
+            <w:pPr>
+              <w:bidi w:val="1"/>
+              <w:rPr/>
+            </w:pPr>
+            <w:r>
+              <w:rPr>
+                <w:sz w:val="20"/>
+                <w:szCs w:val="20"/>
+                <w:rtl w:val="1"/>
+              </w:rPr>
+              <w:t>סעיף 11: סיפור 30 גרסה 2, רשימת המתנה וביטול עד 24 שעות</w:t>
+            </w:r>
+          </w:p>
+        </w:tc>
+        <w:tc>
+          <w:tcPr>
+            <w:tcMar>
+              <w:top w:w="60.0" w:type="dxa"/>
+              <w:left w:w="100.0" w:type="dxa"/>
+              <w:bottom w:w="60.0" w:type="dxa"/>
+              <w:right w:w="100.0" w:type="dxa"/>
+            </w:tcMar>
+          </w:tcPr>
+          <w:p>
+            <w:pPr>
+              <w:bidi w:val="1"/>
+              <w:rPr/>
+            </w:pPr>
+            <w:r>
+              <w:rPr>
+                <w:sz w:val="20"/>
+                <w:szCs w:val="20"/>
+                <w:rtl w:val="0"/>
+              </w:rPr>
+              <w:t>27.09.2026</w:t>
+            </w:r>
+          </w:p>
+        </w:tc>
+        <w:tc>
+          <w:tcPr>
+            <w:tcMar>
+              <w:top w:w="60.0" w:type="dxa"/>
+              <w:left w:w="100.0" w:type="dxa"/>
+              <w:bottom w:w="60.0" w:type="dxa"/>
+              <w:right w:w="100.0" w:type="dxa"/>
+            </w:tcMar>
+          </w:tcPr>
+          <w:p>
+            <w:pPr>
+              <w:bidi w:val="1"/>
+              <w:rPr/>
+            </w:pPr>
+            <w:r>
+              <w:rPr>
+                <w:sz w:val="20"/>
+                <w:szCs w:val="20"/>
+                <w:rtl w:val="0"/>
+              </w:rPr>
+              <w:t>1.5</w:t>
             </w:r>
           </w:p>
         </w:tc>
@@ -30109,7 +30187,7 @@
         <w:rPr>
           <w:rtl w:val="0"/>
         </w:rPr>
-        <w:t>30. הרשמה לשיעורים — Must. שיעור קבוצתי עם מספר מקומות מוגבל, בלי קשר לתשלום. הסיפור המלא: story-30-class-registration.md (https://github.com/Sharpop30/fitness-app/blob/main/project-docs/story-30-class-registration.md)</w:t>
+        <w:t>30. הרשמה לשיעורים — Must. שיעור קבוצתי עם מספר מקומות מוגבל, בלי קשר לתשלום, עם רשימת המתנה, וביטול עד 24 שעות לפני השיעור. הסיפור המלא: story-30-class-registration.md (https://github.com/Sharpop30/fitness-app/blob/main/project-docs/story-30-class-registration.md)</w:t>
       </w:r>
     </w:p>
     <w:p>

</xml_diff>

<commit_message>
Approve story 1; PRD v1.6; story 2 draft
Co-Authored-By: Claude Opus 5.5 <noreply@anthropic.com>
</commit_message>
<xml_diff>
--- a/project-docs/prd-fitness-app.docx
+++ b/project-docs/prd-fitness-app.docx
@@ -1529,7 +1529,7 @@
                 <w:szCs w:val="20"/>
                 <w:rtl w:val="0"/>
               </w:rPr>
-              <w:t>1.5</w:t>
+              <w:t>1.6</w:t>
             </w:r>
           </w:p>
         </w:tc>
@@ -2529,6 +2529,84 @@
                 <w:rtl w:val="0"/>
               </w:rPr>
               <w:t>1.5</w:t>
+            </w:r>
+          </w:p>
+        </w:tc>
+      </w:tr>
+      <w:tr>
+        <w:trPr>
+          <w:cantSplit w:val="0"/>
+          <w:tblHeader w:val="0"/>
+        </w:trPr>
+        <w:tc>
+          <w:tcPr>
+            <w:tcMar>
+              <w:top w:w="60.0" w:type="dxa"/>
+              <w:left w:w="100.0" w:type="dxa"/>
+              <w:bottom w:w="60.0" w:type="dxa"/>
+              <w:right w:w="100.0" w:type="dxa"/>
+            </w:tcMar>
+          </w:tcPr>
+          <w:p>
+            <w:pPr>
+              <w:bidi w:val="1"/>
+              <w:rPr/>
+            </w:pPr>
+            <w:r>
+              <w:rPr>
+                <w:sz w:val="20"/>
+                <w:szCs w:val="20"/>
+                <w:rtl w:val="1"/>
+              </w:rPr>
+              <w:t>סעיף 11: סיפור 1 הורחב לפורמט ששת המרכיבים, עם ההכרעות והקישור</w:t>
+            </w:r>
+          </w:p>
+        </w:tc>
+        <w:tc>
+          <w:tcPr>
+            <w:tcMar>
+              <w:top w:w="60.0" w:type="dxa"/>
+              <w:left w:w="100.0" w:type="dxa"/>
+              <w:bottom w:w="60.0" w:type="dxa"/>
+              <w:right w:w="100.0" w:type="dxa"/>
+            </w:tcMar>
+          </w:tcPr>
+          <w:p>
+            <w:pPr>
+              <w:bidi w:val="1"/>
+              <w:rPr/>
+            </w:pPr>
+            <w:r>
+              <w:rPr>
+                <w:sz w:val="20"/>
+                <w:szCs w:val="20"/>
+                <w:rtl w:val="0"/>
+              </w:rPr>
+              <w:t>27.09.2026</w:t>
+            </w:r>
+          </w:p>
+        </w:tc>
+        <w:tc>
+          <w:tcPr>
+            <w:tcMar>
+              <w:top w:w="60.0" w:type="dxa"/>
+              <w:left w:w="100.0" w:type="dxa"/>
+              <w:bottom w:w="60.0" w:type="dxa"/>
+              <w:right w:w="100.0" w:type="dxa"/>
+            </w:tcMar>
+          </w:tcPr>
+          <w:p>
+            <w:pPr>
+              <w:bidi w:val="1"/>
+              <w:rPr/>
+            </w:pPr>
+            <w:r>
+              <w:rPr>
+                <w:sz w:val="20"/>
+                <w:szCs w:val="20"/>
+                <w:rtl w:val="0"/>
+              </w:rPr>
+              <w:t>1.6</w:t>
             </w:r>
           </w:p>
         </w:tc>
@@ -22883,6 +22961,21 @@
         <w:rPr>
           <w:rtl w:val="0"/>
         </w:rPr>
+      </w:r>
+    </w:p>
+    <w:p>
+      <w:pPr>
+        <w:bidi w:val="1"/>
+        <w:spacing w:after="160" w:lineRule="auto"/>
+        <w:rPr/>
+      </w:pPr>
+      <w:r>
+        <w:rPr>
+          <w:i w:val="1"/>
+          <w:iCs w:val="1"/>
+          <w:rtl w:val="1"/>
+        </w:rPr>
+        <w:t>בגרסה הראשונה: לכל תרגיל סטים, חזרות ומשקל; רשימת תרגילים מוכנה ותרגילים שהמאמן מוסיף; תוכנית פעילה אחת למתאמן. הסיפור המלא: story-01-training-programs.md (https://github.com/Sharpop30/fitness-app/blob/main/project-docs/story-01-training-programs.md)</w:t>
       </w:r>
     </w:p>
     <w:p>

</xml_diff>

<commit_message>
Approve story 2; PRD v1.7; story 12 draft
Co-Authored-By: Claude Opus 5.5 <noreply@anthropic.com>
</commit_message>
<xml_diff>
--- a/project-docs/prd-fitness-app.docx
+++ b/project-docs/prd-fitness-app.docx
@@ -1529,7 +1529,7 @@
                 <w:szCs w:val="20"/>
                 <w:rtl w:val="0"/>
               </w:rPr>
-              <w:t>1.6</w:t>
+              <w:t>1.7</w:t>
             </w:r>
           </w:p>
         </w:tc>
@@ -2607,6 +2607,84 @@
                 <w:rtl w:val="0"/>
               </w:rPr>
               <w:t>1.6</w:t>
+            </w:r>
+          </w:p>
+        </w:tc>
+      </w:tr>
+      <w:tr>
+        <w:trPr>
+          <w:cantSplit w:val="0"/>
+          <w:tblHeader w:val="0"/>
+        </w:trPr>
+        <w:tc>
+          <w:tcPr>
+            <w:tcMar>
+              <w:top w:w="60.0" w:type="dxa"/>
+              <w:left w:w="100.0" w:type="dxa"/>
+              <w:bottom w:w="60.0" w:type="dxa"/>
+              <w:right w:w="100.0" w:type="dxa"/>
+            </w:tcMar>
+          </w:tcPr>
+          <w:p>
+            <w:pPr>
+              <w:bidi w:val="1"/>
+              <w:rPr/>
+            </w:pPr>
+            <w:r>
+              <w:rPr>
+                <w:sz w:val="20"/>
+                <w:szCs w:val="20"/>
+                <w:rtl w:val="1"/>
+              </w:rPr>
+              <w:t>סעיף 11: סיפור 2 הורחב, עם ההכרעות והקישור</w:t>
+            </w:r>
+          </w:p>
+        </w:tc>
+        <w:tc>
+          <w:tcPr>
+            <w:tcMar>
+              <w:top w:w="60.0" w:type="dxa"/>
+              <w:left w:w="100.0" w:type="dxa"/>
+              <w:bottom w:w="60.0" w:type="dxa"/>
+              <w:right w:w="100.0" w:type="dxa"/>
+            </w:tcMar>
+          </w:tcPr>
+          <w:p>
+            <w:pPr>
+              <w:bidi w:val="1"/>
+              <w:rPr/>
+            </w:pPr>
+            <w:r>
+              <w:rPr>
+                <w:sz w:val="20"/>
+                <w:szCs w:val="20"/>
+                <w:rtl w:val="0"/>
+              </w:rPr>
+              <w:t>27.09.2026</w:t>
+            </w:r>
+          </w:p>
+        </w:tc>
+        <w:tc>
+          <w:tcPr>
+            <w:tcMar>
+              <w:top w:w="60.0" w:type="dxa"/>
+              <w:left w:w="100.0" w:type="dxa"/>
+              <w:bottom w:w="60.0" w:type="dxa"/>
+              <w:right w:w="100.0" w:type="dxa"/>
+            </w:tcMar>
+          </w:tcPr>
+          <w:p>
+            <w:pPr>
+              <w:bidi w:val="1"/>
+              <w:rPr/>
+            </w:pPr>
+            <w:r>
+              <w:rPr>
+                <w:sz w:val="20"/>
+                <w:szCs w:val="20"/>
+                <w:rtl w:val="0"/>
+              </w:rPr>
+              <w:t>1.7</w:t>
             </w:r>
           </w:p>
         </w:tc>
@@ -23065,196 +23143,7 @@
         <w:rPr>
           <w:rtl w:val="0"/>
         </w:rPr>
-      </w:r>
-      <w:r>
-        <w:rPr>
-          <w:rFonts w:ascii="Arial" w:cs="Arial" w:eastAsia="Arial" w:hAnsi="Arial"/>
-          <w:b w:val="0"/>
-          <w:bCs w:val="0"/>
-          <w:i w:val="0"/>
-          <w:iCs w:val="0"/>
-          <w:smallCaps w:val="0"/>
-          <w:strike w:val="0"/>
-          <w:color w:val="000000"/>
-          <w:sz w:val="22"/>
-          <w:szCs w:val="22"/>
-          <w:u w:val="none"/>
-          <w:shd w:fill="auto" w:val="clear"/>
-          <w:vertAlign w:val="baseline"/>
-          <w:rtl w:val="1"/>
-        </w:rPr>
-        <w:t xml:space="preserve">2. </w:t>
-      </w:r>
-      <w:r>
-        <w:rPr>
-          <w:rFonts w:ascii="Arial" w:cs="Arial" w:eastAsia="Arial" w:hAnsi="Arial"/>
-          <w:b w:val="0"/>
-          <w:bCs w:val="0"/>
-          <w:i w:val="0"/>
-          <w:iCs w:val="0"/>
-          <w:smallCaps w:val="0"/>
-          <w:strike w:val="0"/>
-          <w:color w:val="000000"/>
-          <w:sz w:val="22"/>
-          <w:szCs w:val="22"/>
-          <w:u w:val="none"/>
-          <w:shd w:fill="auto" w:val="clear"/>
-          <w:vertAlign w:val="baseline"/>
-          <w:rtl w:val="1"/>
-        </w:rPr>
-        <w:t xml:space="preserve">סליקת</w:t>
-      </w:r>
-      <w:r>
-        <w:rPr>
-          <w:rFonts w:ascii="Arial" w:cs="Arial" w:eastAsia="Arial" w:hAnsi="Arial"/>
-          <w:b w:val="0"/>
-          <w:bCs w:val="0"/>
-          <w:i w:val="0"/>
-          <w:iCs w:val="0"/>
-          <w:smallCaps w:val="0"/>
-          <w:strike w:val="0"/>
-          <w:color w:val="000000"/>
-          <w:sz w:val="22"/>
-          <w:szCs w:val="22"/>
-          <w:u w:val="none"/>
-          <w:shd w:fill="auto" w:val="clear"/>
-          <w:vertAlign w:val="baseline"/>
-          <w:rtl w:val="1"/>
-        </w:rPr>
-        <w:t xml:space="preserve"> </w:t>
-      </w:r>
-      <w:r>
-        <w:rPr>
-          <w:rFonts w:ascii="Arial" w:cs="Arial" w:eastAsia="Arial" w:hAnsi="Arial"/>
-          <w:b w:val="0"/>
-          <w:bCs w:val="0"/>
-          <w:i w:val="0"/>
-          <w:iCs w:val="0"/>
-          <w:smallCaps w:val="0"/>
-          <w:strike w:val="0"/>
-          <w:color w:val="000000"/>
-          <w:sz w:val="22"/>
-          <w:szCs w:val="22"/>
-          <w:u w:val="none"/>
-          <w:shd w:fill="auto" w:val="clear"/>
-          <w:vertAlign w:val="baseline"/>
-          <w:rtl w:val="1"/>
-        </w:rPr>
-        <w:t xml:space="preserve">אשראי</w:t>
-      </w:r>
-      <w:r>
-        <w:rPr>
-          <w:rFonts w:ascii="Arial" w:cs="Arial" w:eastAsia="Arial" w:hAnsi="Arial"/>
-          <w:b w:val="0"/>
-          <w:bCs w:val="0"/>
-          <w:i w:val="0"/>
-          <w:iCs w:val="0"/>
-          <w:smallCaps w:val="0"/>
-          <w:strike w:val="0"/>
-          <w:color w:val="000000"/>
-          <w:sz w:val="22"/>
-          <w:szCs w:val="22"/>
-          <w:u w:val="none"/>
-          <w:shd w:fill="auto" w:val="clear"/>
-          <w:vertAlign w:val="baseline"/>
-          <w:rtl w:val="1"/>
-        </w:rPr>
-        <w:t xml:space="preserve"> </w:t>
-      </w:r>
-      <w:r>
-        <w:rPr>
-          <w:rFonts w:ascii="Arial" w:cs="Arial" w:eastAsia="Arial" w:hAnsi="Arial"/>
-          <w:b w:val="0"/>
-          <w:bCs w:val="0"/>
-          <w:i w:val="0"/>
-          <w:iCs w:val="0"/>
-          <w:smallCaps w:val="0"/>
-          <w:strike w:val="0"/>
-          <w:color w:val="000000"/>
-          <w:sz w:val="22"/>
-          <w:szCs w:val="22"/>
-          <w:u w:val="none"/>
-          <w:shd w:fill="auto" w:val="clear"/>
-          <w:vertAlign w:val="baseline"/>
-          <w:rtl w:val="1"/>
-        </w:rPr>
-        <w:t xml:space="preserve">וחשבוניות</w:t>
-      </w:r>
-      <w:r>
-        <w:rPr>
-          <w:rFonts w:ascii="Arial" w:cs="Arial" w:eastAsia="Arial" w:hAnsi="Arial"/>
-          <w:b w:val="0"/>
-          <w:bCs w:val="0"/>
-          <w:i w:val="0"/>
-          <w:iCs w:val="0"/>
-          <w:smallCaps w:val="0"/>
-          <w:strike w:val="0"/>
-          <w:color w:val="000000"/>
-          <w:sz w:val="22"/>
-          <w:szCs w:val="22"/>
-          <w:u w:val="none"/>
-          <w:shd w:fill="auto" w:val="clear"/>
-          <w:vertAlign w:val="baseline"/>
-          <w:rtl w:val="1"/>
-        </w:rPr>
-        <w:t xml:space="preserve"> </w:t>
-      </w:r>
-      <w:r>
-        <w:rPr>
-          <w:rFonts w:ascii="Arial" w:cs="Arial" w:eastAsia="Arial" w:hAnsi="Arial"/>
-          <w:b w:val="0"/>
-          <w:bCs w:val="0"/>
-          <w:i w:val="0"/>
-          <w:iCs w:val="0"/>
-          <w:smallCaps w:val="0"/>
-          <w:strike w:val="0"/>
-          <w:color w:val="000000"/>
-          <w:sz w:val="22"/>
-          <w:szCs w:val="22"/>
-          <w:u w:val="none"/>
-          <w:shd w:fill="auto" w:val="clear"/>
-          <w:vertAlign w:val="baseline"/>
-          <w:rtl w:val="1"/>
-        </w:rPr>
-        <w:t xml:space="preserve">אוטומטיות</w:t>
-      </w:r>
-      <w:r>
-        <w:rPr>
-          <w:rFonts w:ascii="Arial" w:cs="Arial" w:eastAsia="Arial" w:hAnsi="Arial"/>
-          <w:b w:val="0"/>
-          <w:bCs w:val="0"/>
-          <w:i w:val="0"/>
-          <w:iCs w:val="0"/>
-          <w:smallCaps w:val="0"/>
-          <w:strike w:val="0"/>
-          <w:color w:val="000000"/>
-          <w:sz w:val="22"/>
-          <w:szCs w:val="22"/>
-          <w:u w:val="none"/>
-          <w:shd w:fill="auto" w:val="clear"/>
-          <w:vertAlign w:val="baseline"/>
-          <w:rtl w:val="1"/>
-        </w:rPr>
-        <w:t xml:space="preserve"> — </w:t>
-      </w:r>
-      <w:r>
-        <w:rPr>
-          <w:rFonts w:ascii="Arial" w:cs="Arial" w:eastAsia="Arial" w:hAnsi="Arial"/>
-          <w:b w:val="0"/>
-          <w:bCs w:val="0"/>
-          <w:i w:val="0"/>
-          <w:iCs w:val="0"/>
-          <w:smallCaps w:val="0"/>
-          <w:strike w:val="0"/>
-          <w:color w:val="000000"/>
-          <w:sz w:val="22"/>
-          <w:szCs w:val="22"/>
-          <w:u w:val="none"/>
-          <w:shd w:fill="auto" w:val="clear"/>
-          <w:vertAlign w:val="baseline"/>
-          <w:rtl w:val="0"/>
-        </w:rPr>
-        <w:t xml:space="preserve">Must</w:t>
+        <w:t>2. סליקת אשראי וחשבוניות אוטומטיות — Must. בגרסה הראשונה הדגמה בלבד, בלי הזנת פרטי כרטיס. המתאמן משלם על מנוי חודשי או על חבילת אימונים (כרטיסייה). הסיפור המלא: story-02-payments-invoices.md (https://github.com/Sharpop30/fitness-app/blob/main/project-docs/story-02-payments-invoices.md)</w:t>
       </w:r>
     </w:p>
     <w:p>

</xml_diff>

<commit_message>
Story 2 v2; approve story 12; PRD v1.8; story 19 draft
Co-Authored-By: Claude Opus 5.5 <noreply@anthropic.com>
</commit_message>
<xml_diff>
--- a/project-docs/prd-fitness-app.docx
+++ b/project-docs/prd-fitness-app.docx
@@ -1529,7 +1529,7 @@
                 <w:szCs w:val="20"/>
                 <w:rtl w:val="0"/>
               </w:rPr>
-              <w:t>1.7</w:t>
+              <w:t>1.8</w:t>
             </w:r>
           </w:p>
         </w:tc>
@@ -2685,6 +2685,84 @@
                 <w:rtl w:val="0"/>
               </w:rPr>
               <w:t>1.7</w:t>
+            </w:r>
+          </w:p>
+        </w:tc>
+      </w:tr>
+      <w:tr>
+        <w:trPr>
+          <w:cantSplit w:val="0"/>
+          <w:tblHeader w:val="0"/>
+        </w:trPr>
+        <w:tc>
+          <w:tcPr>
+            <w:tcMar>
+              <w:top w:w="60.0" w:type="dxa"/>
+              <w:left w:w="100.0" w:type="dxa"/>
+              <w:bottom w:w="60.0" w:type="dxa"/>
+              <w:right w:w="100.0" w:type="dxa"/>
+            </w:tcMar>
+          </w:tcPr>
+          <w:p>
+            <w:pPr>
+              <w:bidi w:val="1"/>
+              <w:rPr/>
+            </w:pPr>
+            <w:r>
+              <w:rPr>
+                <w:sz w:val="20"/>
+                <w:szCs w:val="20"/>
+                <w:rtl w:val="1"/>
+              </w:rPr>
+              <w:t>סעיף 11: סיפור 2 גרסה 2 (הכרטיסייה אינה סופרת אימונים); סיפור 12 הורחב, עם ההכרעות והקישור</w:t>
+            </w:r>
+          </w:p>
+        </w:tc>
+        <w:tc>
+          <w:tcPr>
+            <w:tcMar>
+              <w:top w:w="60.0" w:type="dxa"/>
+              <w:left w:w="100.0" w:type="dxa"/>
+              <w:bottom w:w="60.0" w:type="dxa"/>
+              <w:right w:w="100.0" w:type="dxa"/>
+            </w:tcMar>
+          </w:tcPr>
+          <w:p>
+            <w:pPr>
+              <w:bidi w:val="1"/>
+              <w:rPr/>
+            </w:pPr>
+            <w:r>
+              <w:rPr>
+                <w:sz w:val="20"/>
+                <w:szCs w:val="20"/>
+                <w:rtl w:val="0"/>
+              </w:rPr>
+              <w:t>27.09.2026</w:t>
+            </w:r>
+          </w:p>
+        </w:tc>
+        <w:tc>
+          <w:tcPr>
+            <w:tcMar>
+              <w:top w:w="60.0" w:type="dxa"/>
+              <w:left w:w="100.0" w:type="dxa"/>
+              <w:bottom w:w="60.0" w:type="dxa"/>
+              <w:right w:w="100.0" w:type="dxa"/>
+            </w:tcMar>
+          </w:tcPr>
+          <w:p>
+            <w:pPr>
+              <w:bidi w:val="1"/>
+              <w:rPr/>
+            </w:pPr>
+            <w:r>
+              <w:rPr>
+                <w:sz w:val="20"/>
+                <w:szCs w:val="20"/>
+                <w:rtl w:val="0"/>
+              </w:rPr>
+              <w:t>1.8</w:t>
             </w:r>
           </w:p>
         </w:tc>
@@ -23143,7 +23221,7 @@
         <w:rPr>
           <w:rtl w:val="0"/>
         </w:rPr>
-        <w:t>2. סליקת אשראי וחשבוניות אוטומטיות — Must. בגרסה הראשונה הדגמה בלבד, בלי הזנת פרטי כרטיס. המתאמן משלם על מנוי חודשי או על חבילת אימונים (כרטיסייה). הסיפור המלא: story-02-payments-invoices.md (https://github.com/Sharpop30/fitness-app/blob/main/project-docs/story-02-payments-invoices.md)</w:t>
+        <w:t>2. סליקת אשראי וחשבוניות אוטומטיות — Must. בגרסה הראשונה הדגמה בלבד, בלי הזנת פרטי כרטיס. המתאמן משלם על מנוי חודשי או על חבילת אימונים (כרטיסייה), והכרטיסייה אינה סופרת אימונים בגרסה הראשונה. הסיפור המלא: story-02-payments-invoices.md (https://github.com/Sharpop30/fitness-app/blob/main/project-docs/story-02-payments-invoices.md)</w:t>
       </w:r>
     </w:p>
     <w:p>
@@ -25524,272 +25602,7 @@
         <w:rPr>
           <w:rtl w:val="0"/>
         </w:rPr>
-      </w:r>
-      <w:r>
-        <w:rPr>
-          <w:rFonts w:ascii="Arial" w:cs="Arial" w:eastAsia="Arial" w:hAnsi="Arial"/>
-          <w:b w:val="0"/>
-          <w:bCs w:val="0"/>
-          <w:i w:val="0"/>
-          <w:iCs w:val="0"/>
-          <w:smallCaps w:val="0"/>
-          <w:strike w:val="0"/>
-          <w:color w:val="000000"/>
-          <w:sz w:val="22"/>
-          <w:szCs w:val="22"/>
-          <w:u w:val="none"/>
-          <w:shd w:fill="auto" w:val="clear"/>
-          <w:vertAlign w:val="baseline"/>
-          <w:rtl w:val="1"/>
-        </w:rPr>
-        <w:t xml:space="preserve">12. </w:t>
-      </w:r>
-      <w:r>
-        <w:rPr>
-          <w:rFonts w:ascii="Arial" w:cs="Arial" w:eastAsia="Arial" w:hAnsi="Arial"/>
-          <w:b w:val="0"/>
-          <w:bCs w:val="0"/>
-          <w:i w:val="0"/>
-          <w:iCs w:val="0"/>
-          <w:smallCaps w:val="0"/>
-          <w:strike w:val="0"/>
-          <w:color w:val="000000"/>
-          <w:sz w:val="22"/>
-          <w:szCs w:val="22"/>
-          <w:u w:val="none"/>
-          <w:shd w:fill="auto" w:val="clear"/>
-          <w:vertAlign w:val="baseline"/>
-          <w:rtl w:val="1"/>
-        </w:rPr>
-        <w:t xml:space="preserve">הזנת</w:t>
-      </w:r>
-      <w:r>
-        <w:rPr>
-          <w:rFonts w:ascii="Arial" w:cs="Arial" w:eastAsia="Arial" w:hAnsi="Arial"/>
-          <w:b w:val="0"/>
-          <w:bCs w:val="0"/>
-          <w:i w:val="0"/>
-          <w:iCs w:val="0"/>
-          <w:smallCaps w:val="0"/>
-          <w:strike w:val="0"/>
-          <w:color w:val="000000"/>
-          <w:sz w:val="22"/>
-          <w:szCs w:val="22"/>
-          <w:u w:val="none"/>
-          <w:shd w:fill="auto" w:val="clear"/>
-          <w:vertAlign w:val="baseline"/>
-          <w:rtl w:val="1"/>
-        </w:rPr>
-        <w:t xml:space="preserve"> </w:t>
-      </w:r>
-      <w:r>
-        <w:rPr>
-          <w:rFonts w:ascii="Arial" w:cs="Arial" w:eastAsia="Arial" w:hAnsi="Arial"/>
-          <w:b w:val="0"/>
-          <w:bCs w:val="0"/>
-          <w:i w:val="0"/>
-          <w:iCs w:val="0"/>
-          <w:smallCaps w:val="0"/>
-          <w:strike w:val="0"/>
-          <w:color w:val="000000"/>
-          <w:sz w:val="22"/>
-          <w:szCs w:val="22"/>
-          <w:u w:val="none"/>
-          <w:shd w:fill="auto" w:val="clear"/>
-          <w:vertAlign w:val="baseline"/>
-          <w:rtl w:val="1"/>
-        </w:rPr>
-        <w:t xml:space="preserve">תוצאות</w:t>
-      </w:r>
-      <w:r>
-        <w:rPr>
-          <w:rFonts w:ascii="Arial" w:cs="Arial" w:eastAsia="Arial" w:hAnsi="Arial"/>
-          <w:b w:val="0"/>
-          <w:bCs w:val="0"/>
-          <w:i w:val="0"/>
-          <w:iCs w:val="0"/>
-          <w:smallCaps w:val="0"/>
-          <w:strike w:val="0"/>
-          <w:color w:val="000000"/>
-          <w:sz w:val="22"/>
-          <w:szCs w:val="22"/>
-          <w:u w:val="none"/>
-          <w:shd w:fill="auto" w:val="clear"/>
-          <w:vertAlign w:val="baseline"/>
-          <w:rtl w:val="1"/>
-        </w:rPr>
-        <w:t xml:space="preserve"> </w:t>
-      </w:r>
-      <w:r>
-        <w:rPr>
-          <w:rFonts w:ascii="Arial" w:cs="Arial" w:eastAsia="Arial" w:hAnsi="Arial"/>
-          <w:b w:val="0"/>
-          <w:bCs w:val="0"/>
-          <w:i w:val="0"/>
-          <w:iCs w:val="0"/>
-          <w:smallCaps w:val="0"/>
-          <w:strike w:val="0"/>
-          <w:color w:val="000000"/>
-          <w:sz w:val="22"/>
-          <w:szCs w:val="22"/>
-          <w:u w:val="none"/>
-          <w:shd w:fill="auto" w:val="clear"/>
-          <w:vertAlign w:val="baseline"/>
-          <w:rtl w:val="1"/>
-        </w:rPr>
-        <w:t xml:space="preserve">אימון</w:t>
-      </w:r>
-      <w:r>
-        <w:rPr>
-          <w:rFonts w:ascii="Arial" w:cs="Arial" w:eastAsia="Arial" w:hAnsi="Arial"/>
-          <w:b w:val="0"/>
-          <w:bCs w:val="0"/>
-          <w:i w:val="0"/>
-          <w:iCs w:val="0"/>
-          <w:smallCaps w:val="0"/>
-          <w:strike w:val="0"/>
-          <w:color w:val="000000"/>
-          <w:sz w:val="22"/>
-          <w:szCs w:val="22"/>
-          <w:u w:val="none"/>
-          <w:shd w:fill="auto" w:val="clear"/>
-          <w:vertAlign w:val="baseline"/>
-          <w:rtl w:val="1"/>
-        </w:rPr>
-        <w:t xml:space="preserve"> </w:t>
-      </w:r>
-      <w:r>
-        <w:rPr>
-          <w:rFonts w:ascii="Arial" w:cs="Arial" w:eastAsia="Arial" w:hAnsi="Arial"/>
-          <w:b w:val="0"/>
-          <w:bCs w:val="0"/>
-          <w:i w:val="0"/>
-          <w:iCs w:val="0"/>
-          <w:smallCaps w:val="0"/>
-          <w:strike w:val="0"/>
-          <w:color w:val="000000"/>
-          <w:sz w:val="22"/>
-          <w:szCs w:val="22"/>
-          <w:u w:val="none"/>
-          <w:shd w:fill="auto" w:val="clear"/>
-          <w:vertAlign w:val="baseline"/>
-          <w:rtl w:val="1"/>
-        </w:rPr>
-        <w:t xml:space="preserve">למעקב</w:t>
-      </w:r>
-      <w:r>
-        <w:rPr>
-          <w:rFonts w:ascii="Arial" w:cs="Arial" w:eastAsia="Arial" w:hAnsi="Arial"/>
-          <w:b w:val="0"/>
-          <w:bCs w:val="0"/>
-          <w:i w:val="0"/>
-          <w:iCs w:val="0"/>
-          <w:smallCaps w:val="0"/>
-          <w:strike w:val="0"/>
-          <w:color w:val="000000"/>
-          <w:sz w:val="22"/>
-          <w:szCs w:val="22"/>
-          <w:u w:val="none"/>
-          <w:shd w:fill="auto" w:val="clear"/>
-          <w:vertAlign w:val="baseline"/>
-          <w:rtl w:val="1"/>
-        </w:rPr>
-        <w:t xml:space="preserve"> </w:t>
-      </w:r>
-      <w:r>
-        <w:rPr>
-          <w:rFonts w:ascii="Arial" w:cs="Arial" w:eastAsia="Arial" w:hAnsi="Arial"/>
-          <w:b w:val="0"/>
-          <w:bCs w:val="0"/>
-          <w:i w:val="0"/>
-          <w:iCs w:val="0"/>
-          <w:smallCaps w:val="0"/>
-          <w:strike w:val="0"/>
-          <w:color w:val="000000"/>
-          <w:sz w:val="22"/>
-          <w:szCs w:val="22"/>
-          <w:u w:val="none"/>
-          <w:shd w:fill="auto" w:val="clear"/>
-          <w:vertAlign w:val="baseline"/>
-          <w:rtl w:val="1"/>
-        </w:rPr>
-        <w:t xml:space="preserve">ארוך</w:t>
-      </w:r>
-      <w:r>
-        <w:rPr>
-          <w:rFonts w:ascii="Arial" w:cs="Arial" w:eastAsia="Arial" w:hAnsi="Arial"/>
-          <w:b w:val="0"/>
-          <w:bCs w:val="0"/>
-          <w:i w:val="0"/>
-          <w:iCs w:val="0"/>
-          <w:smallCaps w:val="0"/>
-          <w:strike w:val="0"/>
-          <w:color w:val="000000"/>
-          <w:sz w:val="22"/>
-          <w:szCs w:val="22"/>
-          <w:u w:val="none"/>
-          <w:shd w:fill="auto" w:val="clear"/>
-          <w:vertAlign w:val="baseline"/>
-          <w:rtl w:val="1"/>
-        </w:rPr>
-        <w:t xml:space="preserve">-</w:t>
-      </w:r>
-      <w:r>
-        <w:rPr>
-          <w:rFonts w:ascii="Arial" w:cs="Arial" w:eastAsia="Arial" w:hAnsi="Arial"/>
-          <w:b w:val="0"/>
-          <w:bCs w:val="0"/>
-          <w:i w:val="0"/>
-          <w:iCs w:val="0"/>
-          <w:smallCaps w:val="0"/>
-          <w:strike w:val="0"/>
-          <w:color w:val="000000"/>
-          <w:sz w:val="22"/>
-          <w:szCs w:val="22"/>
-          <w:u w:val="none"/>
-          <w:shd w:fill="auto" w:val="clear"/>
-          <w:vertAlign w:val="baseline"/>
-          <w:rtl w:val="1"/>
-        </w:rPr>
-        <w:t xml:space="preserve">טווח</w:t>
-      </w:r>
-      <w:r>
-        <w:rPr>
-          <w:rFonts w:ascii="Arial" w:cs="Arial" w:eastAsia="Arial" w:hAnsi="Arial"/>
-          <w:b w:val="0"/>
-          <w:bCs w:val="0"/>
-          <w:i w:val="0"/>
-          <w:iCs w:val="0"/>
-          <w:smallCaps w:val="0"/>
-          <w:strike w:val="0"/>
-          <w:color w:val="000000"/>
-          <w:sz w:val="22"/>
-          <w:szCs w:val="22"/>
-          <w:u w:val="none"/>
-          <w:shd w:fill="auto" w:val="clear"/>
-          <w:vertAlign w:val="baseline"/>
-          <w:rtl w:val="1"/>
-        </w:rPr>
-        <w:t xml:space="preserve"> — </w:t>
-      </w:r>
-      <w:r>
-        <w:rPr>
-          <w:rFonts w:ascii="Arial" w:cs="Arial" w:eastAsia="Arial" w:hAnsi="Arial"/>
-          <w:b w:val="0"/>
-          <w:bCs w:val="0"/>
-          <w:i w:val="0"/>
-          <w:iCs w:val="0"/>
-          <w:smallCaps w:val="0"/>
-          <w:strike w:val="0"/>
-          <w:color w:val="000000"/>
-          <w:sz w:val="22"/>
-          <w:szCs w:val="22"/>
-          <w:u w:val="none"/>
-          <w:shd w:fill="auto" w:val="clear"/>
-          <w:vertAlign w:val="baseline"/>
-          <w:rtl w:val="0"/>
-        </w:rPr>
-        <w:t xml:space="preserve">Must</w:t>
+        <w:t>12. הזנת תוצאות אימון למעקב ארוך-טווח — Must. תוצאה לכל סט, ממולאת מראש לפי היעד ונשמרת בלחיצה, וניתנת לתיקון אחרי השמירה. הסיפור המלא: story-12-results-entry.md (https://github.com/Sharpop30/fitness-app/blob/main/project-docs/story-12-results-entry.md)</w:t>
       </w:r>
     </w:p>
     <w:p>

</xml_diff>

<commit_message>
Approve story 19; PRD v1.9; story 4 draft
Co-Authored-By: Claude Opus 5.5 <noreply@anthropic.com>
</commit_message>
<xml_diff>
--- a/project-docs/prd-fitness-app.docx
+++ b/project-docs/prd-fitness-app.docx
@@ -1529,7 +1529,7 @@
                 <w:szCs w:val="20"/>
                 <w:rtl w:val="0"/>
               </w:rPr>
-              <w:t>1.8</w:t>
+              <w:t>1.9</w:t>
             </w:r>
           </w:p>
         </w:tc>
@@ -2763,6 +2763,84 @@
                 <w:rtl w:val="0"/>
               </w:rPr>
               <w:t>1.8</w:t>
+            </w:r>
+          </w:p>
+        </w:tc>
+      </w:tr>
+      <w:tr>
+        <w:trPr>
+          <w:cantSplit w:val="0"/>
+          <w:tblHeader w:val="0"/>
+        </w:trPr>
+        <w:tc>
+          <w:tcPr>
+            <w:tcMar>
+              <w:top w:w="60.0" w:type="dxa"/>
+              <w:left w:w="100.0" w:type="dxa"/>
+              <w:bottom w:w="60.0" w:type="dxa"/>
+              <w:right w:w="100.0" w:type="dxa"/>
+            </w:tcMar>
+          </w:tcPr>
+          <w:p>
+            <w:pPr>
+              <w:bidi w:val="1"/>
+              <w:rPr/>
+            </w:pPr>
+            <w:r>
+              <w:rPr>
+                <w:sz w:val="20"/>
+                <w:szCs w:val="20"/>
+                <w:rtl w:val="1"/>
+              </w:rPr>
+              <w:t>סעיף 11: סיפור 19 הורחב, עם ההכרעה והקישור</w:t>
+            </w:r>
+          </w:p>
+        </w:tc>
+        <w:tc>
+          <w:tcPr>
+            <w:tcMar>
+              <w:top w:w="60.0" w:type="dxa"/>
+              <w:left w:w="100.0" w:type="dxa"/>
+              <w:bottom w:w="60.0" w:type="dxa"/>
+              <w:right w:w="100.0" w:type="dxa"/>
+            </w:tcMar>
+          </w:tcPr>
+          <w:p>
+            <w:pPr>
+              <w:bidi w:val="1"/>
+              <w:rPr/>
+            </w:pPr>
+            <w:r>
+              <w:rPr>
+                <w:sz w:val="20"/>
+                <w:szCs w:val="20"/>
+                <w:rtl w:val="0"/>
+              </w:rPr>
+              <w:t>27.09.2026</w:t>
+            </w:r>
+          </w:p>
+        </w:tc>
+        <w:tc>
+          <w:tcPr>
+            <w:tcMar>
+              <w:top w:w="60.0" w:type="dxa"/>
+              <w:left w:w="100.0" w:type="dxa"/>
+              <w:bottom w:w="60.0" w:type="dxa"/>
+              <w:right w:w="100.0" w:type="dxa"/>
+            </w:tcMar>
+          </w:tcPr>
+          <w:p>
+            <w:pPr>
+              <w:bidi w:val="1"/>
+              <w:rPr/>
+            </w:pPr>
+            <w:r>
+              <w:rPr>
+                <w:sz w:val="20"/>
+                <w:szCs w:val="20"/>
+                <w:rtl w:val="0"/>
+              </w:rPr>
+              <w:t>1.9</w:t>
             </w:r>
           </w:p>
         </w:tc>
@@ -27098,158 +27176,7 @@
         <w:rPr>
           <w:rtl w:val="0"/>
         </w:rPr>
-      </w:r>
-      <w:r>
-        <w:rPr>
-          <w:rFonts w:ascii="Arial" w:cs="Arial" w:eastAsia="Arial" w:hAnsi="Arial"/>
-          <w:b w:val="0"/>
-          <w:bCs w:val="0"/>
-          <w:i w:val="0"/>
-          <w:iCs w:val="0"/>
-          <w:smallCaps w:val="0"/>
-          <w:strike w:val="0"/>
-          <w:color w:val="000000"/>
-          <w:sz w:val="22"/>
-          <w:szCs w:val="22"/>
-          <w:u w:val="none"/>
-          <w:shd w:fill="auto" w:val="clear"/>
-          <w:vertAlign w:val="baseline"/>
-          <w:rtl w:val="1"/>
-        </w:rPr>
-        <w:t xml:space="preserve">19. </w:t>
-      </w:r>
-      <w:r>
-        <w:rPr>
-          <w:rFonts w:ascii="Arial" w:cs="Arial" w:eastAsia="Arial" w:hAnsi="Arial"/>
-          <w:b w:val="0"/>
-          <w:bCs w:val="0"/>
-          <w:i w:val="0"/>
-          <w:iCs w:val="0"/>
-          <w:smallCaps w:val="0"/>
-          <w:strike w:val="0"/>
-          <w:color w:val="000000"/>
-          <w:sz w:val="22"/>
-          <w:szCs w:val="22"/>
-          <w:u w:val="none"/>
-          <w:shd w:fill="auto" w:val="clear"/>
-          <w:vertAlign w:val="baseline"/>
-          <w:rtl w:val="1"/>
-        </w:rPr>
-        <w:t xml:space="preserve">ניהול</w:t>
-      </w:r>
-      <w:r>
-        <w:rPr>
-          <w:rFonts w:ascii="Arial" w:cs="Arial" w:eastAsia="Arial" w:hAnsi="Arial"/>
-          <w:b w:val="0"/>
-          <w:bCs w:val="0"/>
-          <w:i w:val="0"/>
-          <w:iCs w:val="0"/>
-          <w:smallCaps w:val="0"/>
-          <w:strike w:val="0"/>
-          <w:color w:val="000000"/>
-          <w:sz w:val="22"/>
-          <w:szCs w:val="22"/>
-          <w:u w:val="none"/>
-          <w:shd w:fill="auto" w:val="clear"/>
-          <w:vertAlign w:val="baseline"/>
-          <w:rtl w:val="1"/>
-        </w:rPr>
-        <w:t xml:space="preserve"> </w:t>
-      </w:r>
-      <w:r>
-        <w:rPr>
-          <w:rFonts w:ascii="Arial" w:cs="Arial" w:eastAsia="Arial" w:hAnsi="Arial"/>
-          <w:b w:val="0"/>
-          <w:bCs w:val="0"/>
-          <w:i w:val="0"/>
-          <w:iCs w:val="0"/>
-          <w:smallCaps w:val="0"/>
-          <w:strike w:val="0"/>
-          <w:color w:val="000000"/>
-          <w:sz w:val="22"/>
-          <w:szCs w:val="22"/>
-          <w:u w:val="none"/>
-          <w:shd w:fill="auto" w:val="clear"/>
-          <w:vertAlign w:val="baseline"/>
-          <w:rtl w:val="1"/>
-        </w:rPr>
-        <w:t xml:space="preserve">תפעולי</w:t>
-      </w:r>
-      <w:r>
-        <w:rPr>
-          <w:rFonts w:ascii="Arial" w:cs="Arial" w:eastAsia="Arial" w:hAnsi="Arial"/>
-          <w:b w:val="0"/>
-          <w:bCs w:val="0"/>
-          <w:i w:val="0"/>
-          <w:iCs w:val="0"/>
-          <w:smallCaps w:val="0"/>
-          <w:strike w:val="0"/>
-          <w:color w:val="000000"/>
-          <w:sz w:val="22"/>
-          <w:szCs w:val="22"/>
-          <w:u w:val="none"/>
-          <w:shd w:fill="auto" w:val="clear"/>
-          <w:vertAlign w:val="baseline"/>
-          <w:rtl w:val="1"/>
-        </w:rPr>
-        <w:t xml:space="preserve"> </w:t>
-      </w:r>
-      <w:r>
-        <w:rPr>
-          <w:rFonts w:ascii="Arial" w:cs="Arial" w:eastAsia="Arial" w:hAnsi="Arial"/>
-          <w:b w:val="0"/>
-          <w:bCs w:val="0"/>
-          <w:i w:val="0"/>
-          <w:iCs w:val="0"/>
-          <w:smallCaps w:val="0"/>
-          <w:strike w:val="0"/>
-          <w:color w:val="000000"/>
-          <w:sz w:val="22"/>
-          <w:szCs w:val="22"/>
-          <w:u w:val="none"/>
-          <w:shd w:fill="auto" w:val="clear"/>
-          <w:vertAlign w:val="baseline"/>
-          <w:rtl w:val="1"/>
-        </w:rPr>
-        <w:t xml:space="preserve">מאוחד</w:t>
-      </w:r>
-      <w:r>
-        <w:rPr>
-          <w:rFonts w:ascii="Arial" w:cs="Arial" w:eastAsia="Arial" w:hAnsi="Arial"/>
-          <w:b w:val="0"/>
-          <w:bCs w:val="0"/>
-          <w:i w:val="0"/>
-          <w:iCs w:val="0"/>
-          <w:smallCaps w:val="0"/>
-          <w:strike w:val="0"/>
-          <w:color w:val="000000"/>
-          <w:sz w:val="22"/>
-          <w:szCs w:val="22"/>
-          <w:u w:val="none"/>
-          <w:shd w:fill="auto" w:val="clear"/>
-          <w:vertAlign w:val="baseline"/>
-          <w:rtl w:val="1"/>
-        </w:rPr>
-        <w:t xml:space="preserve"> — </w:t>
-      </w:r>
-      <w:r>
-        <w:rPr>
-          <w:rFonts w:ascii="Arial" w:cs="Arial" w:eastAsia="Arial" w:hAnsi="Arial"/>
-          <w:b w:val="0"/>
-          <w:bCs w:val="0"/>
-          <w:i w:val="0"/>
-          <w:iCs w:val="0"/>
-          <w:smallCaps w:val="0"/>
-          <w:strike w:val="0"/>
-          <w:color w:val="000000"/>
-          <w:sz w:val="22"/>
-          <w:szCs w:val="22"/>
-          <w:u w:val="none"/>
-          <w:shd w:fill="auto" w:val="clear"/>
-          <w:vertAlign w:val="baseline"/>
-          <w:rtl w:val="0"/>
-        </w:rPr>
-        <w:t xml:space="preserve">Must</w:t>
+        <w:t>19. ניהול תפעולי מאוחד — Must. רשימת מתאמנים, כרטיס מתאמן שמרכז תוכנית, תוצאות ותשלומים, ומסך בית למאמן. המאמן מזמין את המתאמנים. הסיפור המלא: story-19-unified-operations.md (https://github.com/Sharpop30/fitness-app/blob/main/project-docs/story-19-unified-operations.md)</w:t>
       </w:r>
     </w:p>
     <w:p>

</xml_diff>

<commit_message>
Approve story 4; PRD v1.10; story 21 draft
Co-Authored-By: Claude Opus 5.5 <noreply@anthropic.com>
</commit_message>
<xml_diff>
--- a/project-docs/prd-fitness-app.docx
+++ b/project-docs/prd-fitness-app.docx
@@ -1529,7 +1529,7 @@
                 <w:szCs w:val="20"/>
                 <w:rtl w:val="0"/>
               </w:rPr>
-              <w:t>1.9</w:t>
+              <w:t>1.10</w:t>
             </w:r>
           </w:p>
         </w:tc>
@@ -2841,6 +2841,84 @@
                 <w:rtl w:val="0"/>
               </w:rPr>
               <w:t>1.9</w:t>
+            </w:r>
+          </w:p>
+        </w:tc>
+      </w:tr>
+      <w:tr>
+        <w:trPr>
+          <w:cantSplit w:val="0"/>
+          <w:tblHeader w:val="0"/>
+        </w:trPr>
+        <w:tc>
+          <w:tcPr>
+            <w:tcMar>
+              <w:top w:w="60.0" w:type="dxa"/>
+              <w:left w:w="100.0" w:type="dxa"/>
+              <w:bottom w:w="60.0" w:type="dxa"/>
+              <w:right w:w="100.0" w:type="dxa"/>
+            </w:tcMar>
+          </w:tcPr>
+          <w:p>
+            <w:pPr>
+              <w:bidi w:val="1"/>
+              <w:rPr/>
+            </w:pPr>
+            <w:r>
+              <w:rPr>
+                <w:sz w:val="20"/>
+                <w:szCs w:val="20"/>
+                <w:rtl w:val="1"/>
+              </w:rPr>
+              <w:t>סעיף 11: סיפור 4 הורחב, עם ההכרעות והקישור</w:t>
+            </w:r>
+          </w:p>
+        </w:tc>
+        <w:tc>
+          <w:tcPr>
+            <w:tcMar>
+              <w:top w:w="60.0" w:type="dxa"/>
+              <w:left w:w="100.0" w:type="dxa"/>
+              <w:bottom w:w="60.0" w:type="dxa"/>
+              <w:right w:w="100.0" w:type="dxa"/>
+            </w:tcMar>
+          </w:tcPr>
+          <w:p>
+            <w:pPr>
+              <w:bidi w:val="1"/>
+              <w:rPr/>
+            </w:pPr>
+            <w:r>
+              <w:rPr>
+                <w:sz w:val="20"/>
+                <w:szCs w:val="20"/>
+                <w:rtl w:val="0"/>
+              </w:rPr>
+              <w:t>27.09.2026</w:t>
+            </w:r>
+          </w:p>
+        </w:tc>
+        <w:tc>
+          <w:tcPr>
+            <w:tcMar>
+              <w:top w:w="60.0" w:type="dxa"/>
+              <w:left w:w="100.0" w:type="dxa"/>
+              <w:bottom w:w="60.0" w:type="dxa"/>
+              <w:right w:w="100.0" w:type="dxa"/>
+            </w:tcMar>
+          </w:tcPr>
+          <w:p>
+            <w:pPr>
+              <w:bidi w:val="1"/>
+              <w:rPr/>
+            </w:pPr>
+            <w:r>
+              <w:rPr>
+                <w:sz w:val="20"/>
+                <w:szCs w:val="20"/>
+                <w:rtl w:val="0"/>
+              </w:rPr>
+              <w:t>1.10</w:t>
             </w:r>
           </w:p>
         </w:tc>
@@ -23643,329 +23721,7 @@
         <w:rPr>
           <w:rtl w:val="0"/>
         </w:rPr>
-      </w:r>
-      <w:r>
-        <w:rPr>
-          <w:rFonts w:ascii="Arial" w:cs="Arial" w:eastAsia="Arial" w:hAnsi="Arial"/>
-          <w:b w:val="0"/>
-          <w:bCs w:val="0"/>
-          <w:i w:val="0"/>
-          <w:iCs w:val="0"/>
-          <w:smallCaps w:val="0"/>
-          <w:strike w:val="0"/>
-          <w:color w:val="000000"/>
-          <w:sz w:val="22"/>
-          <w:szCs w:val="22"/>
-          <w:u w:val="none"/>
-          <w:shd w:fill="auto" w:val="clear"/>
-          <w:vertAlign w:val="baseline"/>
-          <w:rtl w:val="1"/>
-        </w:rPr>
-        <w:t xml:space="preserve">4. </w:t>
-      </w:r>
-      <w:r>
-        <w:rPr>
-          <w:rFonts w:ascii="Arial" w:cs="Arial" w:eastAsia="Arial" w:hAnsi="Arial"/>
-          <w:b w:val="0"/>
-          <w:bCs w:val="0"/>
-          <w:i w:val="0"/>
-          <w:iCs w:val="0"/>
-          <w:smallCaps w:val="0"/>
-          <w:strike w:val="0"/>
-          <w:color w:val="000000"/>
-          <w:sz w:val="22"/>
-          <w:szCs w:val="22"/>
-          <w:u w:val="none"/>
-          <w:shd w:fill="auto" w:val="clear"/>
-          <w:vertAlign w:val="baseline"/>
-          <w:rtl w:val="1"/>
-        </w:rPr>
-        <w:t xml:space="preserve">מעקב</w:t>
-      </w:r>
-      <w:r>
-        <w:rPr>
-          <w:rFonts w:ascii="Arial" w:cs="Arial" w:eastAsia="Arial" w:hAnsi="Arial"/>
-          <w:b w:val="0"/>
-          <w:bCs w:val="0"/>
-          <w:i w:val="0"/>
-          <w:iCs w:val="0"/>
-          <w:smallCaps w:val="0"/>
-          <w:strike w:val="0"/>
-          <w:color w:val="000000"/>
-          <w:sz w:val="22"/>
-          <w:szCs w:val="22"/>
-          <w:u w:val="none"/>
-          <w:shd w:fill="auto" w:val="clear"/>
-          <w:vertAlign w:val="baseline"/>
-          <w:rtl w:val="1"/>
-        </w:rPr>
-        <w:t xml:space="preserve"> </w:t>
-      </w:r>
-      <w:r>
-        <w:rPr>
-          <w:rFonts w:ascii="Arial" w:cs="Arial" w:eastAsia="Arial" w:hAnsi="Arial"/>
-          <w:b w:val="0"/>
-          <w:bCs w:val="0"/>
-          <w:i w:val="0"/>
-          <w:iCs w:val="0"/>
-          <w:smallCaps w:val="0"/>
-          <w:strike w:val="0"/>
-          <w:color w:val="000000"/>
-          <w:sz w:val="22"/>
-          <w:szCs w:val="22"/>
-          <w:u w:val="none"/>
-          <w:shd w:fill="auto" w:val="clear"/>
-          <w:vertAlign w:val="baseline"/>
-          <w:rtl w:val="1"/>
-        </w:rPr>
-        <w:t xml:space="preserve">התקדמות</w:t>
-      </w:r>
-      <w:r>
-        <w:rPr>
-          <w:rFonts w:ascii="Arial" w:cs="Arial" w:eastAsia="Arial" w:hAnsi="Arial"/>
-          <w:b w:val="0"/>
-          <w:bCs w:val="0"/>
-          <w:i w:val="0"/>
-          <w:iCs w:val="0"/>
-          <w:smallCaps w:val="0"/>
-          <w:strike w:val="0"/>
-          <w:color w:val="000000"/>
-          <w:sz w:val="22"/>
-          <w:szCs w:val="22"/>
-          <w:u w:val="none"/>
-          <w:shd w:fill="auto" w:val="clear"/>
-          <w:vertAlign w:val="baseline"/>
-          <w:rtl w:val="1"/>
-        </w:rPr>
-        <w:t xml:space="preserve"> </w:t>
-      </w:r>
-      <w:r>
-        <w:rPr>
-          <w:rFonts w:ascii="Arial" w:cs="Arial" w:eastAsia="Arial" w:hAnsi="Arial"/>
-          <w:b w:val="0"/>
-          <w:bCs w:val="0"/>
-          <w:i w:val="0"/>
-          <w:iCs w:val="0"/>
-          <w:smallCaps w:val="0"/>
-          <w:strike w:val="0"/>
-          <w:color w:val="000000"/>
-          <w:sz w:val="22"/>
-          <w:szCs w:val="22"/>
-          <w:u w:val="none"/>
-          <w:shd w:fill="auto" w:val="clear"/>
-          <w:vertAlign w:val="baseline"/>
-          <w:rtl w:val="1"/>
-        </w:rPr>
-        <w:t xml:space="preserve">ויזואלי</w:t>
-      </w:r>
-      <w:r>
-        <w:rPr>
-          <w:rFonts w:ascii="Arial" w:cs="Arial" w:eastAsia="Arial" w:hAnsi="Arial"/>
-          <w:b w:val="0"/>
-          <w:bCs w:val="0"/>
-          <w:i w:val="0"/>
-          <w:iCs w:val="0"/>
-          <w:smallCaps w:val="0"/>
-          <w:strike w:val="0"/>
-          <w:color w:val="000000"/>
-          <w:sz w:val="22"/>
-          <w:szCs w:val="22"/>
-          <w:u w:val="none"/>
-          <w:shd w:fill="auto" w:val="clear"/>
-          <w:vertAlign w:val="baseline"/>
-          <w:rtl w:val="1"/>
-        </w:rPr>
-        <w:t xml:space="preserve"> </w:t>
-      </w:r>
-      <w:r>
-        <w:rPr>
-          <w:rFonts w:ascii="Arial" w:cs="Arial" w:eastAsia="Arial" w:hAnsi="Arial"/>
-          <w:b w:val="0"/>
-          <w:bCs w:val="0"/>
-          <w:i w:val="0"/>
-          <w:iCs w:val="0"/>
-          <w:smallCaps w:val="0"/>
-          <w:strike w:val="0"/>
-          <w:color w:val="000000"/>
-          <w:sz w:val="22"/>
-          <w:szCs w:val="22"/>
-          <w:u w:val="none"/>
-          <w:shd w:fill="auto" w:val="clear"/>
-          <w:vertAlign w:val="baseline"/>
-          <w:rtl w:val="1"/>
-        </w:rPr>
-        <w:t xml:space="preserve">למתאמנים</w:t>
-      </w:r>
-      <w:r>
-        <w:rPr>
-          <w:rFonts w:ascii="Arial" w:cs="Arial" w:eastAsia="Arial" w:hAnsi="Arial"/>
-          <w:b w:val="0"/>
-          <w:bCs w:val="0"/>
-          <w:i w:val="0"/>
-          <w:iCs w:val="0"/>
-          <w:smallCaps w:val="0"/>
-          <w:strike w:val="0"/>
-          <w:color w:val="000000"/>
-          <w:sz w:val="22"/>
-          <w:szCs w:val="22"/>
-          <w:u w:val="none"/>
-          <w:shd w:fill="auto" w:val="clear"/>
-          <w:vertAlign w:val="baseline"/>
-          <w:rtl w:val="1"/>
-        </w:rPr>
-        <w:t xml:space="preserve"> — [</w:t>
-      </w:r>
-      <w:r>
-        <w:rPr>
-          <w:rFonts w:ascii="Arial" w:cs="Arial" w:eastAsia="Arial" w:hAnsi="Arial"/>
-          <w:b w:val="0"/>
-          <w:bCs w:val="0"/>
-          <w:i w:val="0"/>
-          <w:iCs w:val="0"/>
-          <w:smallCaps w:val="0"/>
-          <w:strike w:val="0"/>
-          <w:color w:val="000000"/>
-          <w:sz w:val="22"/>
-          <w:szCs w:val="22"/>
-          <w:u w:val="none"/>
-          <w:shd w:fill="auto" w:val="clear"/>
-          <w:vertAlign w:val="baseline"/>
-          <w:rtl w:val="1"/>
-        </w:rPr>
-        <w:t xml:space="preserve">טרם</w:t>
-      </w:r>
-      <w:r>
-        <w:rPr>
-          <w:rFonts w:ascii="Arial" w:cs="Arial" w:eastAsia="Arial" w:hAnsi="Arial"/>
-          <w:b w:val="0"/>
-          <w:bCs w:val="0"/>
-          <w:i w:val="0"/>
-          <w:iCs w:val="0"/>
-          <w:smallCaps w:val="0"/>
-          <w:strike w:val="0"/>
-          <w:color w:val="000000"/>
-          <w:sz w:val="22"/>
-          <w:szCs w:val="22"/>
-          <w:u w:val="none"/>
-          <w:shd w:fill="auto" w:val="clear"/>
-          <w:vertAlign w:val="baseline"/>
-          <w:rtl w:val="1"/>
-        </w:rPr>
-        <w:t xml:space="preserve"> </w:t>
-      </w:r>
-      <w:r>
-        <w:rPr>
-          <w:rFonts w:ascii="Arial" w:cs="Arial" w:eastAsia="Arial" w:hAnsi="Arial"/>
-          <w:b w:val="0"/>
-          <w:bCs w:val="0"/>
-          <w:i w:val="0"/>
-          <w:iCs w:val="0"/>
-          <w:smallCaps w:val="0"/>
-          <w:strike w:val="0"/>
-          <w:color w:val="000000"/>
-          <w:sz w:val="22"/>
-          <w:szCs w:val="22"/>
-          <w:u w:val="none"/>
-          <w:shd w:fill="auto" w:val="clear"/>
-          <w:vertAlign w:val="baseline"/>
-          <w:rtl w:val="1"/>
-        </w:rPr>
-        <w:t xml:space="preserve">נקבע</w:t>
-      </w:r>
-      <w:r>
-        <w:rPr>
-          <w:rFonts w:ascii="Arial" w:cs="Arial" w:eastAsia="Arial" w:hAnsi="Arial"/>
-          <w:b w:val="0"/>
-          <w:bCs w:val="0"/>
-          <w:i w:val="0"/>
-          <w:iCs w:val="0"/>
-          <w:smallCaps w:val="0"/>
-          <w:strike w:val="0"/>
-          <w:color w:val="000000"/>
-          <w:sz w:val="22"/>
-          <w:szCs w:val="22"/>
-          <w:u w:val="none"/>
-          <w:shd w:fill="auto" w:val="clear"/>
-          <w:vertAlign w:val="baseline"/>
-          <w:rtl w:val="1"/>
-        </w:rPr>
-        <w:t xml:space="preserve"> </w:t>
-      </w:r>
-      <w:r>
-        <w:rPr>
-          <w:rFonts w:ascii="Arial" w:cs="Arial" w:eastAsia="Arial" w:hAnsi="Arial"/>
-          <w:b w:val="0"/>
-          <w:bCs w:val="0"/>
-          <w:i w:val="0"/>
-          <w:iCs w:val="0"/>
-          <w:smallCaps w:val="0"/>
-          <w:strike w:val="0"/>
-          <w:color w:val="000000"/>
-          <w:sz w:val="22"/>
-          <w:szCs w:val="22"/>
-          <w:u w:val="none"/>
-          <w:shd w:fill="auto" w:val="clear"/>
-          <w:vertAlign w:val="baseline"/>
-          <w:rtl w:val="1"/>
-        </w:rPr>
-        <w:t xml:space="preserve">בטבלת</w:t>
-      </w:r>
-      <w:r>
-        <w:rPr>
-          <w:rFonts w:ascii="Arial" w:cs="Arial" w:eastAsia="Arial" w:hAnsi="Arial"/>
-          <w:b w:val="0"/>
-          <w:bCs w:val="0"/>
-          <w:i w:val="0"/>
-          <w:iCs w:val="0"/>
-          <w:smallCaps w:val="0"/>
-          <w:strike w:val="0"/>
-          <w:color w:val="000000"/>
-          <w:sz w:val="22"/>
-          <w:szCs w:val="22"/>
-          <w:u w:val="none"/>
-          <w:shd w:fill="auto" w:val="clear"/>
-          <w:vertAlign w:val="baseline"/>
-          <w:rtl w:val="1"/>
-        </w:rPr>
-        <w:t xml:space="preserve"> </w:t>
-      </w:r>
-      <w:r>
-        <w:rPr>
-          <w:rFonts w:ascii="Arial" w:cs="Arial" w:eastAsia="Arial" w:hAnsi="Arial"/>
-          <w:b w:val="0"/>
-          <w:bCs w:val="0"/>
-          <w:i w:val="0"/>
-          <w:iCs w:val="0"/>
-          <w:smallCaps w:val="0"/>
-          <w:strike w:val="0"/>
-          <w:color w:val="000000"/>
-          <w:sz w:val="22"/>
-          <w:szCs w:val="22"/>
-          <w:u w:val="none"/>
-          <w:shd w:fill="auto" w:val="clear"/>
-          <w:vertAlign w:val="baseline"/>
-          <w:rtl w:val="1"/>
-        </w:rPr>
-        <w:t xml:space="preserve">התעדוף</w:t>
-      </w:r>
-      <w:r>
-        <w:rPr>
-          <w:rFonts w:ascii="Arial" w:cs="Arial" w:eastAsia="Arial" w:hAnsi="Arial"/>
-          <w:b w:val="0"/>
-          <w:bCs w:val="0"/>
-          <w:i w:val="0"/>
-          <w:iCs w:val="0"/>
-          <w:smallCaps w:val="0"/>
-          <w:strike w:val="0"/>
-          <w:color w:val="000000"/>
-          <w:sz w:val="22"/>
-          <w:szCs w:val="22"/>
-          <w:u w:val="none"/>
-          <w:shd w:fill="auto" w:val="clear"/>
-          <w:vertAlign w:val="baseline"/>
-          <w:rtl w:val="1"/>
-        </w:rPr>
-        <w:t xml:space="preserve">]</w:t>
+        <w:t>4. מעקב התקדמות ויזואלי — בגרסה הראשונה. גרף לכל תרגיל של המשקל הגבוה בכל אימון, עם סימון שיא אישי, אצל המאמן ואצל המתאמן. הסיפור המלא: story-04-progress-tracking.md (https://github.com/Sharpop30/fitness-app/blob/main/project-docs/story-04-progress-tracking.md)</w:t>
       </w:r>
     </w:p>
     <w:p>

</xml_diff>

<commit_message>
Approve story 21; PRD v1.11; story 6+24 draft
Co-Authored-By: Claude Opus 5.5 <noreply@anthropic.com>
</commit_message>
<xml_diff>
--- a/project-docs/prd-fitness-app.docx
+++ b/project-docs/prd-fitness-app.docx
@@ -1529,7 +1529,7 @@
                 <w:szCs w:val="20"/>
                 <w:rtl w:val="0"/>
               </w:rPr>
-              <w:t>1.10</w:t>
+              <w:t>1.11</w:t>
             </w:r>
           </w:p>
         </w:tc>
@@ -2919,6 +2919,84 @@
                 <w:rtl w:val="0"/>
               </w:rPr>
               <w:t>1.10</w:t>
+            </w:r>
+          </w:p>
+        </w:tc>
+      </w:tr>
+      <w:tr>
+        <w:trPr>
+          <w:cantSplit w:val="0"/>
+          <w:tblHeader w:val="0"/>
+        </w:trPr>
+        <w:tc>
+          <w:tcPr>
+            <w:tcMar>
+              <w:top w:w="60.0" w:type="dxa"/>
+              <w:left w:w="100.0" w:type="dxa"/>
+              <w:bottom w:w="60.0" w:type="dxa"/>
+              <w:right w:w="100.0" w:type="dxa"/>
+            </w:tcMar>
+          </w:tcPr>
+          <w:p>
+            <w:pPr>
+              <w:bidi w:val="1"/>
+              <w:rPr/>
+            </w:pPr>
+            <w:r>
+              <w:rPr>
+                <w:sz w:val="20"/>
+                <w:szCs w:val="20"/>
+                <w:rtl w:val="1"/>
+              </w:rPr>
+              <w:t>סעיף 11: סיפור 21 הורחב, עם ההכרעות והקישור</w:t>
+            </w:r>
+          </w:p>
+        </w:tc>
+        <w:tc>
+          <w:tcPr>
+            <w:tcMar>
+              <w:top w:w="60.0" w:type="dxa"/>
+              <w:left w:w="100.0" w:type="dxa"/>
+              <w:bottom w:w="60.0" w:type="dxa"/>
+              <w:right w:w="100.0" w:type="dxa"/>
+            </w:tcMar>
+          </w:tcPr>
+          <w:p>
+            <w:pPr>
+              <w:bidi w:val="1"/>
+              <w:rPr/>
+            </w:pPr>
+            <w:r>
+              <w:rPr>
+                <w:sz w:val="20"/>
+                <w:szCs w:val="20"/>
+                <w:rtl w:val="0"/>
+              </w:rPr>
+              <w:t>27.09.2026</w:t>
+            </w:r>
+          </w:p>
+        </w:tc>
+        <w:tc>
+          <w:tcPr>
+            <w:tcMar>
+              <w:top w:w="60.0" w:type="dxa"/>
+              <w:left w:w="100.0" w:type="dxa"/>
+              <w:bottom w:w="60.0" w:type="dxa"/>
+              <w:right w:w="100.0" w:type="dxa"/>
+            </w:tcMar>
+          </w:tcPr>
+          <w:p>
+            <w:pPr>
+              <w:bidi w:val="1"/>
+              <w:rPr/>
+            </w:pPr>
+            <w:r>
+              <w:rPr>
+                <w:sz w:val="20"/>
+                <w:szCs w:val="20"/>
+                <w:rtl w:val="0"/>
+              </w:rPr>
+              <w:t>1.11</w:t>
             </w:r>
           </w:p>
         </w:tc>
@@ -27352,158 +27430,7 @@
         <w:rPr>
           <w:rtl w:val="0"/>
         </w:rPr>
-      </w:r>
-      <w:r>
-        <w:rPr>
-          <w:rFonts w:ascii="Arial" w:cs="Arial" w:eastAsia="Arial" w:hAnsi="Arial"/>
-          <w:b w:val="0"/>
-          <w:bCs w:val="0"/>
-          <w:i w:val="0"/>
-          <w:iCs w:val="0"/>
-          <w:smallCaps w:val="0"/>
-          <w:strike w:val="0"/>
-          <w:color w:val="000000"/>
-          <w:sz w:val="22"/>
-          <w:szCs w:val="22"/>
-          <w:u w:val="none"/>
-          <w:shd w:fill="auto" w:val="clear"/>
-          <w:vertAlign w:val="baseline"/>
-          <w:rtl w:val="1"/>
-        </w:rPr>
-        <w:t xml:space="preserve">21. </w:t>
-      </w:r>
-      <w:r>
-        <w:rPr>
-          <w:rFonts w:ascii="Arial" w:cs="Arial" w:eastAsia="Arial" w:hAnsi="Arial"/>
-          <w:b w:val="0"/>
-          <w:bCs w:val="0"/>
-          <w:i w:val="0"/>
-          <w:iCs w:val="0"/>
-          <w:smallCaps w:val="0"/>
-          <w:strike w:val="0"/>
-          <w:color w:val="000000"/>
-          <w:sz w:val="22"/>
-          <w:szCs w:val="22"/>
-          <w:u w:val="none"/>
-          <w:shd w:fill="auto" w:val="clear"/>
-          <w:vertAlign w:val="baseline"/>
-          <w:rtl w:val="1"/>
-        </w:rPr>
-        <w:t xml:space="preserve">משוב</w:t>
-      </w:r>
-      <w:r>
-        <w:rPr>
-          <w:rFonts w:ascii="Arial" w:cs="Arial" w:eastAsia="Arial" w:hAnsi="Arial"/>
-          <w:b w:val="0"/>
-          <w:bCs w:val="0"/>
-          <w:i w:val="0"/>
-          <w:iCs w:val="0"/>
-          <w:smallCaps w:val="0"/>
-          <w:strike w:val="0"/>
-          <w:color w:val="000000"/>
-          <w:sz w:val="22"/>
-          <w:szCs w:val="22"/>
-          <w:u w:val="none"/>
-          <w:shd w:fill="auto" w:val="clear"/>
-          <w:vertAlign w:val="baseline"/>
-          <w:rtl w:val="1"/>
-        </w:rPr>
-        <w:t xml:space="preserve"> </w:t>
-      </w:r>
-      <w:r>
-        <w:rPr>
-          <w:rFonts w:ascii="Arial" w:cs="Arial" w:eastAsia="Arial" w:hAnsi="Arial"/>
-          <w:b w:val="0"/>
-          <w:bCs w:val="0"/>
-          <w:i w:val="0"/>
-          <w:iCs w:val="0"/>
-          <w:smallCaps w:val="0"/>
-          <w:strike w:val="0"/>
-          <w:color w:val="000000"/>
-          <w:sz w:val="22"/>
-          <w:szCs w:val="22"/>
-          <w:u w:val="none"/>
-          <w:shd w:fill="auto" w:val="clear"/>
-          <w:vertAlign w:val="baseline"/>
-          <w:rtl w:val="1"/>
-        </w:rPr>
-        <w:t xml:space="preserve">מיידי</w:t>
-      </w:r>
-      <w:r>
-        <w:rPr>
-          <w:rFonts w:ascii="Arial" w:cs="Arial" w:eastAsia="Arial" w:hAnsi="Arial"/>
-          <w:b w:val="0"/>
-          <w:bCs w:val="0"/>
-          <w:i w:val="0"/>
-          <w:iCs w:val="0"/>
-          <w:smallCaps w:val="0"/>
-          <w:strike w:val="0"/>
-          <w:color w:val="000000"/>
-          <w:sz w:val="22"/>
-          <w:szCs w:val="22"/>
-          <w:u w:val="none"/>
-          <w:shd w:fill="auto" w:val="clear"/>
-          <w:vertAlign w:val="baseline"/>
-          <w:rtl w:val="1"/>
-        </w:rPr>
-        <w:t xml:space="preserve"> </w:t>
-      </w:r>
-      <w:r>
-        <w:rPr>
-          <w:rFonts w:ascii="Arial" w:cs="Arial" w:eastAsia="Arial" w:hAnsi="Arial"/>
-          <w:b w:val="0"/>
-          <w:bCs w:val="0"/>
-          <w:i w:val="0"/>
-          <w:iCs w:val="0"/>
-          <w:smallCaps w:val="0"/>
-          <w:strike w:val="0"/>
-          <w:color w:val="000000"/>
-          <w:sz w:val="22"/>
-          <w:szCs w:val="22"/>
-          <w:u w:val="none"/>
-          <w:shd w:fill="auto" w:val="clear"/>
-          <w:vertAlign w:val="baseline"/>
-          <w:rtl w:val="1"/>
-        </w:rPr>
-        <w:t xml:space="preserve">למתאמן</w:t>
-      </w:r>
-      <w:r>
-        <w:rPr>
-          <w:rFonts w:ascii="Arial" w:cs="Arial" w:eastAsia="Arial" w:hAnsi="Arial"/>
-          <w:b w:val="0"/>
-          <w:bCs w:val="0"/>
-          <w:i w:val="0"/>
-          <w:iCs w:val="0"/>
-          <w:smallCaps w:val="0"/>
-          <w:strike w:val="0"/>
-          <w:color w:val="000000"/>
-          <w:sz w:val="22"/>
-          <w:szCs w:val="22"/>
-          <w:u w:val="none"/>
-          <w:shd w:fill="auto" w:val="clear"/>
-          <w:vertAlign w:val="baseline"/>
-          <w:rtl w:val="1"/>
-        </w:rPr>
-        <w:t xml:space="preserve"> — </w:t>
-      </w:r>
-      <w:r>
-        <w:rPr>
-          <w:rFonts w:ascii="Arial" w:cs="Arial" w:eastAsia="Arial" w:hAnsi="Arial"/>
-          <w:b w:val="0"/>
-          <w:bCs w:val="0"/>
-          <w:i w:val="0"/>
-          <w:iCs w:val="0"/>
-          <w:smallCaps w:val="0"/>
-          <w:strike w:val="0"/>
-          <w:color w:val="000000"/>
-          <w:sz w:val="22"/>
-          <w:szCs w:val="22"/>
-          <w:u w:val="none"/>
-          <w:shd w:fill="auto" w:val="clear"/>
-          <w:vertAlign w:val="baseline"/>
-          <w:rtl w:val="0"/>
-        </w:rPr>
-        <w:t xml:space="preserve">Should</w:t>
+        <w:t>21. משוב מיידי למתאמן — Should, בגרסה הראשונה. אחרי כל שמירה: סטים שהושלמו, שיא אישי ומטבעות, לפי כללים קבועים ובלי AI. המאמן יכול להוסיף הערה אישית. הסיפור המלא: story-21-instant-feedback.md (https://github.com/Sharpop30/fitness-app/blob/main/project-docs/story-21-instant-feedback.md)</w:t>
       </w:r>
     </w:p>
     <w:p>

</xml_diff>

<commit_message>
Approve story 6+24; PRD v1.12; story 5 draft
Co-Authored-By: Claude Opus 5.5 <noreply@anthropic.com>
</commit_message>
<xml_diff>
--- a/project-docs/prd-fitness-app.docx
+++ b/project-docs/prd-fitness-app.docx
@@ -1529,7 +1529,7 @@
                 <w:szCs w:val="20"/>
                 <w:rtl w:val="0"/>
               </w:rPr>
-              <w:t>1.11</w:t>
+              <w:t>1.12</w:t>
             </w:r>
           </w:p>
         </w:tc>
@@ -2997,6 +2997,84 @@
                 <w:rtl w:val="0"/>
               </w:rPr>
               <w:t>1.11</w:t>
+            </w:r>
+          </w:p>
+        </w:tc>
+      </w:tr>
+      <w:tr>
+        <w:trPr>
+          <w:cantSplit w:val="0"/>
+          <w:tblHeader w:val="0"/>
+        </w:trPr>
+        <w:tc>
+          <w:tcPr>
+            <w:tcMar>
+              <w:top w:w="60.0" w:type="dxa"/>
+              <w:left w:w="100.0" w:type="dxa"/>
+              <w:bottom w:w="60.0" w:type="dxa"/>
+              <w:right w:w="100.0" w:type="dxa"/>
+            </w:tcMar>
+          </w:tcPr>
+          <w:p>
+            <w:pPr>
+              <w:bidi w:val="1"/>
+              <w:rPr/>
+            </w:pPr>
+            <w:r>
+              <w:rPr>
+                <w:sz w:val="20"/>
+                <w:szCs w:val="20"/>
+                <w:rtl w:val="1"/>
+              </w:rPr>
+              <w:t>סעיף 11: סיפורים 6 ו-24 הורחבו כמנגנון אחד, עם ההכרעות והקישור</w:t>
+            </w:r>
+          </w:p>
+        </w:tc>
+        <w:tc>
+          <w:tcPr>
+            <w:tcMar>
+              <w:top w:w="60.0" w:type="dxa"/>
+              <w:left w:w="100.0" w:type="dxa"/>
+              <w:bottom w:w="60.0" w:type="dxa"/>
+              <w:right w:w="100.0" w:type="dxa"/>
+            </w:tcMar>
+          </w:tcPr>
+          <w:p>
+            <w:pPr>
+              <w:bidi w:val="1"/>
+              <w:rPr/>
+            </w:pPr>
+            <w:r>
+              <w:rPr>
+                <w:sz w:val="20"/>
+                <w:szCs w:val="20"/>
+                <w:rtl w:val="0"/>
+              </w:rPr>
+              <w:t>27.09.2026</w:t>
+            </w:r>
+          </w:p>
+        </w:tc>
+        <w:tc>
+          <w:tcPr>
+            <w:tcMar>
+              <w:top w:w="60.0" w:type="dxa"/>
+              <w:left w:w="100.0" w:type="dxa"/>
+              <w:bottom w:w="60.0" w:type="dxa"/>
+              <w:right w:w="100.0" w:type="dxa"/>
+            </w:tcMar>
+          </w:tcPr>
+          <w:p>
+            <w:pPr>
+              <w:bidi w:val="1"/>
+              <w:rPr/>
+            </w:pPr>
+            <w:r>
+              <w:rPr>
+                <w:sz w:val="20"/>
+                <w:szCs w:val="20"/>
+                <w:rtl w:val="0"/>
+              </w:rPr>
+              <w:t>1.12</w:t>
             </w:r>
           </w:p>
         </w:tc>
@@ -24048,234 +24126,7 @@
         <w:rPr>
           <w:rtl w:val="0"/>
         </w:rPr>
-      </w:r>
-      <w:r>
-        <w:rPr>
-          <w:rFonts w:ascii="Arial" w:cs="Arial" w:eastAsia="Arial" w:hAnsi="Arial"/>
-          <w:b w:val="0"/>
-          <w:bCs w:val="0"/>
-          <w:i w:val="0"/>
-          <w:iCs w:val="0"/>
-          <w:smallCaps w:val="0"/>
-          <w:strike w:val="0"/>
-          <w:color w:val="000000"/>
-          <w:sz w:val="22"/>
-          <w:szCs w:val="22"/>
-          <w:u w:val="none"/>
-          <w:shd w:fill="auto" w:val="clear"/>
-          <w:vertAlign w:val="baseline"/>
-          <w:rtl w:val="1"/>
-        </w:rPr>
-        <w:t xml:space="preserve">6. </w:t>
-      </w:r>
-      <w:r>
-        <w:rPr>
-          <w:rFonts w:ascii="Arial" w:cs="Arial" w:eastAsia="Arial" w:hAnsi="Arial"/>
-          <w:b w:val="0"/>
-          <w:bCs w:val="0"/>
-          <w:i w:val="0"/>
-          <w:iCs w:val="0"/>
-          <w:smallCaps w:val="0"/>
-          <w:strike w:val="0"/>
-          <w:color w:val="000000"/>
-          <w:sz w:val="22"/>
-          <w:szCs w:val="22"/>
-          <w:u w:val="none"/>
-          <w:shd w:fill="auto" w:val="clear"/>
-          <w:vertAlign w:val="baseline"/>
-          <w:rtl w:val="1"/>
-        </w:rPr>
-        <w:t xml:space="preserve">מטבעות</w:t>
-      </w:r>
-      <w:r>
-        <w:rPr>
-          <w:rFonts w:ascii="Arial" w:cs="Arial" w:eastAsia="Arial" w:hAnsi="Arial"/>
-          <w:b w:val="0"/>
-          <w:bCs w:val="0"/>
-          <w:i w:val="0"/>
-          <w:iCs w:val="0"/>
-          <w:smallCaps w:val="0"/>
-          <w:strike w:val="0"/>
-          <w:color w:val="000000"/>
-          <w:sz w:val="22"/>
-          <w:szCs w:val="22"/>
-          <w:u w:val="none"/>
-          <w:shd w:fill="auto" w:val="clear"/>
-          <w:vertAlign w:val="baseline"/>
-          <w:rtl w:val="1"/>
-        </w:rPr>
-        <w:t xml:space="preserve"> </w:t>
-      </w:r>
-      <w:r>
-        <w:rPr>
-          <w:rFonts w:ascii="Arial" w:cs="Arial" w:eastAsia="Arial" w:hAnsi="Arial"/>
-          <w:b w:val="0"/>
-          <w:bCs w:val="0"/>
-          <w:i w:val="0"/>
-          <w:iCs w:val="0"/>
-          <w:smallCaps w:val="0"/>
-          <w:strike w:val="0"/>
-          <w:color w:val="000000"/>
-          <w:sz w:val="22"/>
-          <w:szCs w:val="22"/>
-          <w:u w:val="none"/>
-          <w:shd w:fill="auto" w:val="clear"/>
-          <w:vertAlign w:val="baseline"/>
-          <w:rtl w:val="1"/>
-        </w:rPr>
-        <w:t xml:space="preserve">וירטואליים</w:t>
-      </w:r>
-      <w:r>
-        <w:rPr>
-          <w:rFonts w:ascii="Arial" w:cs="Arial" w:eastAsia="Arial" w:hAnsi="Arial"/>
-          <w:b w:val="0"/>
-          <w:bCs w:val="0"/>
-          <w:i w:val="0"/>
-          <w:iCs w:val="0"/>
-          <w:smallCaps w:val="0"/>
-          <w:strike w:val="0"/>
-          <w:color w:val="000000"/>
-          <w:sz w:val="22"/>
-          <w:szCs w:val="22"/>
-          <w:u w:val="none"/>
-          <w:shd w:fill="auto" w:val="clear"/>
-          <w:vertAlign w:val="baseline"/>
-          <w:rtl w:val="1"/>
-        </w:rPr>
-        <w:t xml:space="preserve"> </w:t>
-      </w:r>
-      <w:r>
-        <w:rPr>
-          <w:rFonts w:ascii="Arial" w:cs="Arial" w:eastAsia="Arial" w:hAnsi="Arial"/>
-          <w:b w:val="0"/>
-          <w:bCs w:val="0"/>
-          <w:i w:val="0"/>
-          <w:iCs w:val="0"/>
-          <w:smallCaps w:val="0"/>
-          <w:strike w:val="0"/>
-          <w:color w:val="000000"/>
-          <w:sz w:val="22"/>
-          <w:szCs w:val="22"/>
-          <w:u w:val="none"/>
-          <w:shd w:fill="auto" w:val="clear"/>
-          <w:vertAlign w:val="baseline"/>
-          <w:rtl w:val="1"/>
-        </w:rPr>
-        <w:t xml:space="preserve">ותגמולים</w:t>
-      </w:r>
-      <w:r>
-        <w:rPr>
-          <w:rFonts w:ascii="Arial" w:cs="Arial" w:eastAsia="Arial" w:hAnsi="Arial"/>
-          <w:b w:val="0"/>
-          <w:bCs w:val="0"/>
-          <w:i w:val="0"/>
-          <w:iCs w:val="0"/>
-          <w:smallCaps w:val="0"/>
-          <w:strike w:val="0"/>
-          <w:color w:val="000000"/>
-          <w:sz w:val="22"/>
-          <w:szCs w:val="22"/>
-          <w:u w:val="none"/>
-          <w:shd w:fill="auto" w:val="clear"/>
-          <w:vertAlign w:val="baseline"/>
-          <w:rtl w:val="1"/>
-        </w:rPr>
-        <w:t xml:space="preserve"> </w:t>
-      </w:r>
-      <w:r>
-        <w:rPr>
-          <w:rFonts w:ascii="Arial" w:cs="Arial" w:eastAsia="Arial" w:hAnsi="Arial"/>
-          <w:b w:val="0"/>
-          <w:bCs w:val="0"/>
-          <w:i w:val="0"/>
-          <w:iCs w:val="0"/>
-          <w:smallCaps w:val="0"/>
-          <w:strike w:val="0"/>
-          <w:color w:val="000000"/>
-          <w:sz w:val="22"/>
-          <w:szCs w:val="22"/>
-          <w:u w:val="none"/>
-          <w:shd w:fill="auto" w:val="clear"/>
-          <w:vertAlign w:val="baseline"/>
-          <w:rtl w:val="1"/>
-        </w:rPr>
-        <w:t xml:space="preserve">הניתנים</w:t>
-      </w:r>
-      <w:r>
-        <w:rPr>
-          <w:rFonts w:ascii="Arial" w:cs="Arial" w:eastAsia="Arial" w:hAnsi="Arial"/>
-          <w:b w:val="0"/>
-          <w:bCs w:val="0"/>
-          <w:i w:val="0"/>
-          <w:iCs w:val="0"/>
-          <w:smallCaps w:val="0"/>
-          <w:strike w:val="0"/>
-          <w:color w:val="000000"/>
-          <w:sz w:val="22"/>
-          <w:szCs w:val="22"/>
-          <w:u w:val="none"/>
-          <w:shd w:fill="auto" w:val="clear"/>
-          <w:vertAlign w:val="baseline"/>
-          <w:rtl w:val="1"/>
-        </w:rPr>
-        <w:t xml:space="preserve"> </w:t>
-      </w:r>
-      <w:r>
-        <w:rPr>
-          <w:rFonts w:ascii="Arial" w:cs="Arial" w:eastAsia="Arial" w:hAnsi="Arial"/>
-          <w:b w:val="0"/>
-          <w:bCs w:val="0"/>
-          <w:i w:val="0"/>
-          <w:iCs w:val="0"/>
-          <w:smallCaps w:val="0"/>
-          <w:strike w:val="0"/>
-          <w:color w:val="000000"/>
-          <w:sz w:val="22"/>
-          <w:szCs w:val="22"/>
-          <w:u w:val="none"/>
-          <w:shd w:fill="auto" w:val="clear"/>
-          <w:vertAlign w:val="baseline"/>
-          <w:rtl w:val="1"/>
-        </w:rPr>
-        <w:t xml:space="preserve">למימוש</w:t>
-      </w:r>
-      <w:r>
-        <w:rPr>
-          <w:rFonts w:ascii="Arial" w:cs="Arial" w:eastAsia="Arial" w:hAnsi="Arial"/>
-          <w:b w:val="0"/>
-          <w:bCs w:val="0"/>
-          <w:i w:val="0"/>
-          <w:iCs w:val="0"/>
-          <w:smallCaps w:val="0"/>
-          <w:strike w:val="0"/>
-          <w:color w:val="000000"/>
-          <w:sz w:val="22"/>
-          <w:szCs w:val="22"/>
-          <w:u w:val="none"/>
-          <w:shd w:fill="auto" w:val="clear"/>
-          <w:vertAlign w:val="baseline"/>
-          <w:rtl w:val="1"/>
-        </w:rPr>
-        <w:t xml:space="preserve"> — </w:t>
-      </w:r>
-      <w:r>
-        <w:rPr>
-          <w:rFonts w:ascii="Arial" w:cs="Arial" w:eastAsia="Arial" w:hAnsi="Arial"/>
-          <w:b w:val="0"/>
-          <w:bCs w:val="0"/>
-          <w:i w:val="0"/>
-          <w:iCs w:val="0"/>
-          <w:smallCaps w:val="0"/>
-          <w:strike w:val="0"/>
-          <w:color w:val="000000"/>
-          <w:sz w:val="22"/>
-          <w:szCs w:val="22"/>
-          <w:u w:val="none"/>
-          <w:shd w:fill="auto" w:val="clear"/>
-          <w:vertAlign w:val="baseline"/>
-          <w:rtl w:val="0"/>
-        </w:rPr>
-        <w:t xml:space="preserve">Should</w:t>
+        <w:t>6. מטבעות וירטואליים ותגמולים הניתנים למימוש — Should, בגרסה הראשונה, מאוחד עם 24. מטבעות על אימון, יעד אישי שהמאמן מגדיר, אתגר שבועי והגעה לשיעור. המאמן מגדיר תגמולים ומספק אותם. הסיפור המלא: story-06-coins-rewards.md (https://github.com/Sharpop30/fitness-app/blob/main/project-docs/story-06-coins-rewards.md)</w:t>
       </w:r>
     </w:p>
     <w:p>
@@ -27898,196 +27749,7 @@
         <w:rPr>
           <w:rtl w:val="0"/>
         </w:rPr>
-      </w:r>
-      <w:r>
-        <w:rPr>
-          <w:rFonts w:ascii="Arial" w:cs="Arial" w:eastAsia="Arial" w:hAnsi="Arial"/>
-          <w:b w:val="0"/>
-          <w:bCs w:val="0"/>
-          <w:i w:val="0"/>
-          <w:iCs w:val="0"/>
-          <w:smallCaps w:val="0"/>
-          <w:strike w:val="0"/>
-          <w:color w:val="000000"/>
-          <w:sz w:val="22"/>
-          <w:szCs w:val="22"/>
-          <w:u w:val="none"/>
-          <w:shd w:fill="auto" w:val="clear"/>
-          <w:vertAlign w:val="baseline"/>
-          <w:rtl w:val="1"/>
-        </w:rPr>
-        <w:t xml:space="preserve">24. </w:t>
-      </w:r>
-      <w:r>
-        <w:rPr>
-          <w:rFonts w:ascii="Arial" w:cs="Arial" w:eastAsia="Arial" w:hAnsi="Arial"/>
-          <w:b w:val="0"/>
-          <w:bCs w:val="0"/>
-          <w:i w:val="0"/>
-          <w:iCs w:val="0"/>
-          <w:smallCaps w:val="0"/>
-          <w:strike w:val="0"/>
-          <w:color w:val="000000"/>
-          <w:sz w:val="22"/>
-          <w:szCs w:val="22"/>
-          <w:u w:val="none"/>
-          <w:shd w:fill="auto" w:val="clear"/>
-          <w:vertAlign w:val="baseline"/>
-          <w:rtl w:val="1"/>
-        </w:rPr>
-        <w:t xml:space="preserve">תגמול</w:t>
-      </w:r>
-      <w:r>
-        <w:rPr>
-          <w:rFonts w:ascii="Arial" w:cs="Arial" w:eastAsia="Arial" w:hAnsi="Arial"/>
-          <w:b w:val="0"/>
-          <w:bCs w:val="0"/>
-          <w:i w:val="0"/>
-          <w:iCs w:val="0"/>
-          <w:smallCaps w:val="0"/>
-          <w:strike w:val="0"/>
-          <w:color w:val="000000"/>
-          <w:sz w:val="22"/>
-          <w:szCs w:val="22"/>
-          <w:u w:val="none"/>
-          <w:shd w:fill="auto" w:val="clear"/>
-          <w:vertAlign w:val="baseline"/>
-          <w:rtl w:val="1"/>
-        </w:rPr>
-        <w:t xml:space="preserve"> </w:t>
-      </w:r>
-      <w:r>
-        <w:rPr>
-          <w:rFonts w:ascii="Arial" w:cs="Arial" w:eastAsia="Arial" w:hAnsi="Arial"/>
-          <w:b w:val="0"/>
-          <w:bCs w:val="0"/>
-          <w:i w:val="0"/>
-          <w:iCs w:val="0"/>
-          <w:smallCaps w:val="0"/>
-          <w:strike w:val="0"/>
-          <w:color w:val="000000"/>
-          <w:sz w:val="22"/>
-          <w:szCs w:val="22"/>
-          <w:u w:val="none"/>
-          <w:shd w:fill="auto" w:val="clear"/>
-          <w:vertAlign w:val="baseline"/>
-          <w:rtl w:val="1"/>
-        </w:rPr>
-        <w:t xml:space="preserve">בעת</w:t>
-      </w:r>
-      <w:r>
-        <w:rPr>
-          <w:rFonts w:ascii="Arial" w:cs="Arial" w:eastAsia="Arial" w:hAnsi="Arial"/>
-          <w:b w:val="0"/>
-          <w:bCs w:val="0"/>
-          <w:i w:val="0"/>
-          <w:iCs w:val="0"/>
-          <w:smallCaps w:val="0"/>
-          <w:strike w:val="0"/>
-          <w:color w:val="000000"/>
-          <w:sz w:val="22"/>
-          <w:szCs w:val="22"/>
-          <w:u w:val="none"/>
-          <w:shd w:fill="auto" w:val="clear"/>
-          <w:vertAlign w:val="baseline"/>
-          <w:rtl w:val="1"/>
-        </w:rPr>
-        <w:t xml:space="preserve"> </w:t>
-      </w:r>
-      <w:r>
-        <w:rPr>
-          <w:rFonts w:ascii="Arial" w:cs="Arial" w:eastAsia="Arial" w:hAnsi="Arial"/>
-          <w:b w:val="0"/>
-          <w:bCs w:val="0"/>
-          <w:i w:val="0"/>
-          <w:iCs w:val="0"/>
-          <w:smallCaps w:val="0"/>
-          <w:strike w:val="0"/>
-          <w:color w:val="000000"/>
-          <w:sz w:val="22"/>
-          <w:szCs w:val="22"/>
-          <w:u w:val="none"/>
-          <w:shd w:fill="auto" w:val="clear"/>
-          <w:vertAlign w:val="baseline"/>
-          <w:rtl w:val="1"/>
-        </w:rPr>
-        <w:t xml:space="preserve">השלמת</w:t>
-      </w:r>
-      <w:r>
-        <w:rPr>
-          <w:rFonts w:ascii="Arial" w:cs="Arial" w:eastAsia="Arial" w:hAnsi="Arial"/>
-          <w:b w:val="0"/>
-          <w:bCs w:val="0"/>
-          <w:i w:val="0"/>
-          <w:iCs w:val="0"/>
-          <w:smallCaps w:val="0"/>
-          <w:strike w:val="0"/>
-          <w:color w:val="000000"/>
-          <w:sz w:val="22"/>
-          <w:szCs w:val="22"/>
-          <w:u w:val="none"/>
-          <w:shd w:fill="auto" w:val="clear"/>
-          <w:vertAlign w:val="baseline"/>
-          <w:rtl w:val="1"/>
-        </w:rPr>
-        <w:t xml:space="preserve"> </w:t>
-      </w:r>
-      <w:r>
-        <w:rPr>
-          <w:rFonts w:ascii="Arial" w:cs="Arial" w:eastAsia="Arial" w:hAnsi="Arial"/>
-          <w:b w:val="0"/>
-          <w:bCs w:val="0"/>
-          <w:i w:val="0"/>
-          <w:iCs w:val="0"/>
-          <w:smallCaps w:val="0"/>
-          <w:strike w:val="0"/>
-          <w:color w:val="000000"/>
-          <w:sz w:val="22"/>
-          <w:szCs w:val="22"/>
-          <w:u w:val="none"/>
-          <w:shd w:fill="auto" w:val="clear"/>
-          <w:vertAlign w:val="baseline"/>
-          <w:rtl w:val="1"/>
-        </w:rPr>
-        <w:t xml:space="preserve">יעדים</w:t>
-      </w:r>
-      <w:r>
-        <w:rPr>
-          <w:rFonts w:ascii="Arial" w:cs="Arial" w:eastAsia="Arial" w:hAnsi="Arial"/>
-          <w:b w:val="0"/>
-          <w:bCs w:val="0"/>
-          <w:i w:val="0"/>
-          <w:iCs w:val="0"/>
-          <w:smallCaps w:val="0"/>
-          <w:strike w:val="0"/>
-          <w:color w:val="000000"/>
-          <w:sz w:val="22"/>
-          <w:szCs w:val="22"/>
-          <w:u w:val="none"/>
-          <w:shd w:fill="auto" w:val="clear"/>
-          <w:vertAlign w:val="baseline"/>
-          <w:rtl w:val="1"/>
-        </w:rPr>
-        <w:t xml:space="preserve"> — </w:t>
-      </w:r>
-      <w:r>
-        <w:rPr>
-          <w:rFonts w:ascii="Arial" w:cs="Arial" w:eastAsia="Arial" w:hAnsi="Arial"/>
-          <w:b w:val="0"/>
-          <w:bCs w:val="0"/>
-          <w:i w:val="0"/>
-          <w:iCs w:val="0"/>
-          <w:smallCaps w:val="0"/>
-          <w:strike w:val="0"/>
-          <w:color w:val="000000"/>
-          <w:sz w:val="22"/>
-          <w:szCs w:val="22"/>
-          <w:u w:val="none"/>
-          <w:shd w:fill="auto" w:val="clear"/>
-          <w:vertAlign w:val="baseline"/>
-          <w:rtl w:val="0"/>
-        </w:rPr>
-        <w:t xml:space="preserve">Should</w:t>
+        <w:t>24. תגמול בעת השלמת יעדים — Should, בגרסה הראשונה, מאוחד עם סיפור 6: story-06-coins-rewards.md</w:t>
       </w:r>
     </w:p>
     <w:p>

</xml_diff>

<commit_message>
Approve story 5; story 30 v3 attendance; PRD v1.13; story 25 draft
Co-Authored-By: Claude Opus 5.5 <noreply@anthropic.com>
</commit_message>
<xml_diff>
--- a/project-docs/prd-fitness-app.docx
+++ b/project-docs/prd-fitness-app.docx
@@ -1529,7 +1529,7 @@
                 <w:szCs w:val="20"/>
                 <w:rtl w:val="0"/>
               </w:rPr>
-              <w:t>1.12</w:t>
+              <w:t>1.13</w:t>
             </w:r>
           </w:p>
         </w:tc>
@@ -3075,6 +3075,84 @@
                 <w:rtl w:val="0"/>
               </w:rPr>
               <w:t>1.12</w:t>
+            </w:r>
+          </w:p>
+        </w:tc>
+      </w:tr>
+      <w:tr>
+        <w:trPr>
+          <w:cantSplit w:val="0"/>
+          <w:tblHeader w:val="0"/>
+        </w:trPr>
+        <w:tc>
+          <w:tcPr>
+            <w:tcMar>
+              <w:top w:w="60.0" w:type="dxa"/>
+              <w:left w:w="100.0" w:type="dxa"/>
+              <w:bottom w:w="60.0" w:type="dxa"/>
+              <w:right w:w="100.0" w:type="dxa"/>
+            </w:tcMar>
+          </w:tcPr>
+          <w:p>
+            <w:pPr>
+              <w:bidi w:val="1"/>
+              <w:rPr/>
+            </w:pPr>
+            <w:r>
+              <w:rPr>
+                <w:sz w:val="20"/>
+                <w:szCs w:val="20"/>
+                <w:rtl w:val="1"/>
+              </w:rPr>
+              <w:t>סעיף 11: סיפור 5 הורחב; סיפור 30 גרסה 3, סימון נוכחות</w:t>
+            </w:r>
+          </w:p>
+        </w:tc>
+        <w:tc>
+          <w:tcPr>
+            <w:tcMar>
+              <w:top w:w="60.0" w:type="dxa"/>
+              <w:left w:w="100.0" w:type="dxa"/>
+              <w:bottom w:w="60.0" w:type="dxa"/>
+              <w:right w:w="100.0" w:type="dxa"/>
+            </w:tcMar>
+          </w:tcPr>
+          <w:p>
+            <w:pPr>
+              <w:bidi w:val="1"/>
+              <w:rPr/>
+            </w:pPr>
+            <w:r>
+              <w:rPr>
+                <w:sz w:val="20"/>
+                <w:szCs w:val="20"/>
+                <w:rtl w:val="0"/>
+              </w:rPr>
+              <w:t>27.09.2026</w:t>
+            </w:r>
+          </w:p>
+        </w:tc>
+        <w:tc>
+          <w:tcPr>
+            <w:tcMar>
+              <w:top w:w="60.0" w:type="dxa"/>
+              <w:left w:w="100.0" w:type="dxa"/>
+              <w:bottom w:w="60.0" w:type="dxa"/>
+              <w:right w:w="100.0" w:type="dxa"/>
+            </w:tcMar>
+          </w:tcPr>
+          <w:p>
+            <w:pPr>
+              <w:bidi w:val="1"/>
+              <w:rPr/>
+            </w:pPr>
+            <w:r>
+              <w:rPr>
+                <w:sz w:val="20"/>
+                <w:szCs w:val="20"/>
+                <w:rtl w:val="0"/>
+              </w:rPr>
+              <w:t>1.13</w:t>
             </w:r>
           </w:p>
         </w:tc>
@@ -23907,196 +23985,7 @@
         <w:rPr>
           <w:rtl w:val="0"/>
         </w:rPr>
-      </w:r>
-      <w:r>
-        <w:rPr>
-          <w:rFonts w:ascii="Arial" w:cs="Arial" w:eastAsia="Arial" w:hAnsi="Arial"/>
-          <w:b w:val="0"/>
-          <w:bCs w:val="0"/>
-          <w:i w:val="0"/>
-          <w:iCs w:val="0"/>
-          <w:smallCaps w:val="0"/>
-          <w:strike w:val="0"/>
-          <w:color w:val="000000"/>
-          <w:sz w:val="22"/>
-          <w:szCs w:val="22"/>
-          <w:u w:val="none"/>
-          <w:shd w:fill="auto" w:val="clear"/>
-          <w:vertAlign w:val="baseline"/>
-          <w:rtl w:val="1"/>
-        </w:rPr>
-        <w:t xml:space="preserve">5. </w:t>
-      </w:r>
-      <w:r>
-        <w:rPr>
-          <w:rFonts w:ascii="Arial" w:cs="Arial" w:eastAsia="Arial" w:hAnsi="Arial"/>
-          <w:b w:val="0"/>
-          <w:bCs w:val="0"/>
-          <w:i w:val="0"/>
-          <w:iCs w:val="0"/>
-          <w:smallCaps w:val="0"/>
-          <w:strike w:val="0"/>
-          <w:color w:val="000000"/>
-          <w:sz w:val="22"/>
-          <w:szCs w:val="22"/>
-          <w:u w:val="none"/>
-          <w:shd w:fill="auto" w:val="clear"/>
-          <w:vertAlign w:val="baseline"/>
-          <w:rtl w:val="1"/>
-        </w:rPr>
-        <w:t xml:space="preserve">אתגרים</w:t>
-      </w:r>
-      <w:r>
-        <w:rPr>
-          <w:rFonts w:ascii="Arial" w:cs="Arial" w:eastAsia="Arial" w:hAnsi="Arial"/>
-          <w:b w:val="0"/>
-          <w:bCs w:val="0"/>
-          <w:i w:val="0"/>
-          <w:iCs w:val="0"/>
-          <w:smallCaps w:val="0"/>
-          <w:strike w:val="0"/>
-          <w:color w:val="000000"/>
-          <w:sz w:val="22"/>
-          <w:szCs w:val="22"/>
-          <w:u w:val="none"/>
-          <w:shd w:fill="auto" w:val="clear"/>
-          <w:vertAlign w:val="baseline"/>
-          <w:rtl w:val="1"/>
-        </w:rPr>
-        <w:t xml:space="preserve"> </w:t>
-      </w:r>
-      <w:r>
-        <w:rPr>
-          <w:rFonts w:ascii="Arial" w:cs="Arial" w:eastAsia="Arial" w:hAnsi="Arial"/>
-          <w:b w:val="0"/>
-          <w:bCs w:val="0"/>
-          <w:i w:val="0"/>
-          <w:iCs w:val="0"/>
-          <w:smallCaps w:val="0"/>
-          <w:strike w:val="0"/>
-          <w:color w:val="000000"/>
-          <w:sz w:val="22"/>
-          <w:szCs w:val="22"/>
-          <w:u w:val="none"/>
-          <w:shd w:fill="auto" w:val="clear"/>
-          <w:vertAlign w:val="baseline"/>
-          <w:rtl w:val="1"/>
-        </w:rPr>
-        <w:t xml:space="preserve">שבועיים</w:t>
-      </w:r>
-      <w:r>
-        <w:rPr>
-          <w:rFonts w:ascii="Arial" w:cs="Arial" w:eastAsia="Arial" w:hAnsi="Arial"/>
-          <w:b w:val="0"/>
-          <w:bCs w:val="0"/>
-          <w:i w:val="0"/>
-          <w:iCs w:val="0"/>
-          <w:smallCaps w:val="0"/>
-          <w:strike w:val="0"/>
-          <w:color w:val="000000"/>
-          <w:sz w:val="22"/>
-          <w:szCs w:val="22"/>
-          <w:u w:val="none"/>
-          <w:shd w:fill="auto" w:val="clear"/>
-          <w:vertAlign w:val="baseline"/>
-          <w:rtl w:val="1"/>
-        </w:rPr>
-        <w:t xml:space="preserve"> </w:t>
-      </w:r>
-      <w:r>
-        <w:rPr>
-          <w:rFonts w:ascii="Arial" w:cs="Arial" w:eastAsia="Arial" w:hAnsi="Arial"/>
-          <w:b w:val="0"/>
-          <w:bCs w:val="0"/>
-          <w:i w:val="0"/>
-          <w:iCs w:val="0"/>
-          <w:smallCaps w:val="0"/>
-          <w:strike w:val="0"/>
-          <w:color w:val="000000"/>
-          <w:sz w:val="22"/>
-          <w:szCs w:val="22"/>
-          <w:u w:val="none"/>
-          <w:shd w:fill="auto" w:val="clear"/>
-          <w:vertAlign w:val="baseline"/>
-          <w:rtl w:val="1"/>
-        </w:rPr>
-        <w:t xml:space="preserve">עם</w:t>
-      </w:r>
-      <w:r>
-        <w:rPr>
-          <w:rFonts w:ascii="Arial" w:cs="Arial" w:eastAsia="Arial" w:hAnsi="Arial"/>
-          <w:b w:val="0"/>
-          <w:bCs w:val="0"/>
-          <w:i w:val="0"/>
-          <w:iCs w:val="0"/>
-          <w:smallCaps w:val="0"/>
-          <w:strike w:val="0"/>
-          <w:color w:val="000000"/>
-          <w:sz w:val="22"/>
-          <w:szCs w:val="22"/>
-          <w:u w:val="none"/>
-          <w:shd w:fill="auto" w:val="clear"/>
-          <w:vertAlign w:val="baseline"/>
-          <w:rtl w:val="1"/>
-        </w:rPr>
-        <w:t xml:space="preserve"> </w:t>
-      </w:r>
-      <w:r>
-        <w:rPr>
-          <w:rFonts w:ascii="Arial" w:cs="Arial" w:eastAsia="Arial" w:hAnsi="Arial"/>
-          <w:b w:val="0"/>
-          <w:bCs w:val="0"/>
-          <w:i w:val="0"/>
-          <w:iCs w:val="0"/>
-          <w:smallCaps w:val="0"/>
-          <w:strike w:val="0"/>
-          <w:color w:val="000000"/>
-          <w:sz w:val="22"/>
-          <w:szCs w:val="22"/>
-          <w:u w:val="none"/>
-          <w:shd w:fill="auto" w:val="clear"/>
-          <w:vertAlign w:val="baseline"/>
-          <w:rtl w:val="1"/>
-        </w:rPr>
-        <w:t xml:space="preserve">פרסים</w:t>
-      </w:r>
-      <w:r>
-        <w:rPr>
-          <w:rFonts w:ascii="Arial" w:cs="Arial" w:eastAsia="Arial" w:hAnsi="Arial"/>
-          <w:b w:val="0"/>
-          <w:bCs w:val="0"/>
-          <w:i w:val="0"/>
-          <w:iCs w:val="0"/>
-          <w:smallCaps w:val="0"/>
-          <w:strike w:val="0"/>
-          <w:color w:val="000000"/>
-          <w:sz w:val="22"/>
-          <w:szCs w:val="22"/>
-          <w:u w:val="none"/>
-          <w:shd w:fill="auto" w:val="clear"/>
-          <w:vertAlign w:val="baseline"/>
-          <w:rtl w:val="1"/>
-        </w:rPr>
-        <w:t xml:space="preserve"> — </w:t>
-      </w:r>
-      <w:r>
-        <w:rPr>
-          <w:rFonts w:ascii="Arial" w:cs="Arial" w:eastAsia="Arial" w:hAnsi="Arial"/>
-          <w:b w:val="0"/>
-          <w:bCs w:val="0"/>
-          <w:i w:val="0"/>
-          <w:iCs w:val="0"/>
-          <w:smallCaps w:val="0"/>
-          <w:strike w:val="0"/>
-          <w:color w:val="000000"/>
-          <w:sz w:val="22"/>
-          <w:szCs w:val="22"/>
-          <w:u w:val="none"/>
-          <w:shd w:fill="auto" w:val="clear"/>
-          <w:vertAlign w:val="baseline"/>
-          <w:rtl w:val="0"/>
-        </w:rPr>
-        <w:t xml:space="preserve">Should</w:t>
+        <w:t>5. אתגרים שבועיים עם פרסים — Should, בגרסה הראשונה. אתגר אחד בשבוע לכל המתאמנים: מספר אימונים או יעד בתרגיל, השלמה אוטומטית, פרס במטבעות ופרס מהמאמן. הסיפור המלא: story-05-weekly-challenge.md (https://github.com/Sharpop30/fitness-app/blob/main/project-docs/story-05-weekly-challenge.md)</w:t>
       </w:r>
     </w:p>
     <w:p>
@@ -29254,7 +29143,7 @@
         <w:rPr>
           <w:rtl w:val="0"/>
         </w:rPr>
-        <w:t>30. הרשמה לשיעורים — Must. שיעור קבוצתי עם מספר מקומות מוגבל, בלי קשר לתשלום, עם רשימת המתנה, וביטול עד 24 שעות לפני השיעור. הסיפור המלא: story-30-class-registration.md (https://github.com/Sharpop30/fitness-app/blob/main/project-docs/story-30-class-registration.md)</w:t>
+        <w:t>30. הרשמה לשיעורים — Must. שיעור קבוצתי עם מספר מקומות מוגבל, בלי קשר לתשלום, עם רשימת המתנה, ביטול עד 24 שעות לפני השיעור, וסימון נוכחות בידי המאמן. הסיפור המלא: story-30-class-registration.md (https://github.com/Sharpop30/fitness-app/blob/main/project-docs/story-30-class-registration.md)</w:t>
       </w:r>
     </w:p>
     <w:p>

</xml_diff>

<commit_message>
Approve story 25; PRD v1.14; story 10 draft
Co-Authored-By: Claude Opus 5.5 <noreply@anthropic.com>
</commit_message>
<xml_diff>
--- a/project-docs/prd-fitness-app.docx
+++ b/project-docs/prd-fitness-app.docx
@@ -1529,7 +1529,7 @@
                 <w:szCs w:val="20"/>
                 <w:rtl w:val="0"/>
               </w:rPr>
-              <w:t>1.13</w:t>
+              <w:t>1.14</w:t>
             </w:r>
           </w:p>
         </w:tc>
@@ -3153,6 +3153,84 @@
                 <w:rtl w:val="0"/>
               </w:rPr>
               <w:t>1.13</w:t>
+            </w:r>
+          </w:p>
+        </w:tc>
+      </w:tr>
+      <w:tr>
+        <w:trPr>
+          <w:cantSplit w:val="0"/>
+          <w:tblHeader w:val="0"/>
+        </w:trPr>
+        <w:tc>
+          <w:tcPr>
+            <w:tcMar>
+              <w:top w:w="60.0" w:type="dxa"/>
+              <w:left w:w="100.0" w:type="dxa"/>
+              <w:bottom w:w="60.0" w:type="dxa"/>
+              <w:right w:w="100.0" w:type="dxa"/>
+            </w:tcMar>
+          </w:tcPr>
+          <w:p>
+            <w:pPr>
+              <w:bidi w:val="1"/>
+              <w:rPr/>
+            </w:pPr>
+            <w:r>
+              <w:rPr>
+                <w:sz w:val="20"/>
+                <w:szCs w:val="20"/>
+                <w:rtl w:val="1"/>
+              </w:rPr>
+              <w:t>סעיף 11: סיפור 25 הורחב, עם ההכרעות והקישור</w:t>
+            </w:r>
+          </w:p>
+        </w:tc>
+        <w:tc>
+          <w:tcPr>
+            <w:tcMar>
+              <w:top w:w="60.0" w:type="dxa"/>
+              <w:left w:w="100.0" w:type="dxa"/>
+              <w:bottom w:w="60.0" w:type="dxa"/>
+              <w:right w:w="100.0" w:type="dxa"/>
+            </w:tcMar>
+          </w:tcPr>
+          <w:p>
+            <w:pPr>
+              <w:bidi w:val="1"/>
+              <w:rPr/>
+            </w:pPr>
+            <w:r>
+              <w:rPr>
+                <w:sz w:val="20"/>
+                <w:szCs w:val="20"/>
+                <w:rtl w:val="0"/>
+              </w:rPr>
+              <w:t>27.09.2026</w:t>
+            </w:r>
+          </w:p>
+        </w:tc>
+        <w:tc>
+          <w:tcPr>
+            <w:tcMar>
+              <w:top w:w="60.0" w:type="dxa"/>
+              <w:left w:w="100.0" w:type="dxa"/>
+              <w:bottom w:w="60.0" w:type="dxa"/>
+              <w:right w:w="100.0" w:type="dxa"/>
+            </w:tcMar>
+          </w:tcPr>
+          <w:p>
+            <w:pPr>
+              <w:bidi w:val="1"/>
+              <w:rPr/>
+            </w:pPr>
+            <w:r>
+              <w:rPr>
+                <w:sz w:val="20"/>
+                <w:szCs w:val="20"/>
+                <w:rtl w:val="0"/>
+              </w:rPr>
+              <w:t>1.14</w:t>
             </w:r>
           </w:p>
         </w:tc>
@@ -27668,196 +27746,7 @@
         <w:rPr>
           <w:rtl w:val="0"/>
         </w:rPr>
-      </w:r>
-      <w:r>
-        <w:rPr>
-          <w:rFonts w:ascii="Arial" w:cs="Arial" w:eastAsia="Arial" w:hAnsi="Arial"/>
-          <w:b w:val="0"/>
-          <w:bCs w:val="0"/>
-          <w:i w:val="0"/>
-          <w:iCs w:val="0"/>
-          <w:smallCaps w:val="0"/>
-          <w:strike w:val="0"/>
-          <w:color w:val="000000"/>
-          <w:sz w:val="22"/>
-          <w:szCs w:val="22"/>
-          <w:u w:val="none"/>
-          <w:shd w:fill="auto" w:val="clear"/>
-          <w:vertAlign w:val="baseline"/>
-          <w:rtl w:val="1"/>
-        </w:rPr>
-        <w:t xml:space="preserve">25. </w:t>
-      </w:r>
-      <w:r>
-        <w:rPr>
-          <w:rFonts w:ascii="Arial" w:cs="Arial" w:eastAsia="Arial" w:hAnsi="Arial"/>
-          <w:b w:val="0"/>
-          <w:bCs w:val="0"/>
-          <w:i w:val="0"/>
-          <w:iCs w:val="0"/>
-          <w:smallCaps w:val="0"/>
-          <w:strike w:val="0"/>
-          <w:color w:val="000000"/>
-          <w:sz w:val="22"/>
-          <w:szCs w:val="22"/>
-          <w:u w:val="none"/>
-          <w:shd w:fill="auto" w:val="clear"/>
-          <w:vertAlign w:val="baseline"/>
-          <w:rtl w:val="1"/>
-        </w:rPr>
-        <w:t xml:space="preserve">טריגר</w:t>
-      </w:r>
-      <w:r>
-        <w:rPr>
-          <w:rFonts w:ascii="Arial" w:cs="Arial" w:eastAsia="Arial" w:hAnsi="Arial"/>
-          <w:b w:val="0"/>
-          <w:bCs w:val="0"/>
-          <w:i w:val="0"/>
-          <w:iCs w:val="0"/>
-          <w:smallCaps w:val="0"/>
-          <w:strike w:val="0"/>
-          <w:color w:val="000000"/>
-          <w:sz w:val="22"/>
-          <w:szCs w:val="22"/>
-          <w:u w:val="none"/>
-          <w:shd w:fill="auto" w:val="clear"/>
-          <w:vertAlign w:val="baseline"/>
-          <w:rtl w:val="1"/>
-        </w:rPr>
-        <w:t xml:space="preserve"> </w:t>
-      </w:r>
-      <w:r>
-        <w:rPr>
-          <w:rFonts w:ascii="Arial" w:cs="Arial" w:eastAsia="Arial" w:hAnsi="Arial"/>
-          <w:b w:val="0"/>
-          <w:bCs w:val="0"/>
-          <w:i w:val="0"/>
-          <w:iCs w:val="0"/>
-          <w:smallCaps w:val="0"/>
-          <w:strike w:val="0"/>
-          <w:color w:val="000000"/>
-          <w:sz w:val="22"/>
-          <w:szCs w:val="22"/>
-          <w:u w:val="none"/>
-          <w:shd w:fill="auto" w:val="clear"/>
-          <w:vertAlign w:val="baseline"/>
-          <w:rtl w:val="1"/>
-        </w:rPr>
-        <w:t xml:space="preserve">יומיומי</w:t>
-      </w:r>
-      <w:r>
-        <w:rPr>
-          <w:rFonts w:ascii="Arial" w:cs="Arial" w:eastAsia="Arial" w:hAnsi="Arial"/>
-          <w:b w:val="0"/>
-          <w:bCs w:val="0"/>
-          <w:i w:val="0"/>
-          <w:iCs w:val="0"/>
-          <w:smallCaps w:val="0"/>
-          <w:strike w:val="0"/>
-          <w:color w:val="000000"/>
-          <w:sz w:val="22"/>
-          <w:szCs w:val="22"/>
-          <w:u w:val="none"/>
-          <w:shd w:fill="auto" w:val="clear"/>
-          <w:vertAlign w:val="baseline"/>
-          <w:rtl w:val="1"/>
-        </w:rPr>
-        <w:t xml:space="preserve"> </w:t>
-      </w:r>
-      <w:r>
-        <w:rPr>
-          <w:rFonts w:ascii="Arial" w:cs="Arial" w:eastAsia="Arial" w:hAnsi="Arial"/>
-          <w:b w:val="0"/>
-          <w:bCs w:val="0"/>
-          <w:i w:val="0"/>
-          <w:iCs w:val="0"/>
-          <w:smallCaps w:val="0"/>
-          <w:strike w:val="0"/>
-          <w:color w:val="000000"/>
-          <w:sz w:val="22"/>
-          <w:szCs w:val="22"/>
-          <w:u w:val="none"/>
-          <w:shd w:fill="auto" w:val="clear"/>
-          <w:vertAlign w:val="baseline"/>
-          <w:rtl w:val="1"/>
-        </w:rPr>
-        <w:t xml:space="preserve">לחזרה</w:t>
-      </w:r>
-      <w:r>
-        <w:rPr>
-          <w:rFonts w:ascii="Arial" w:cs="Arial" w:eastAsia="Arial" w:hAnsi="Arial"/>
-          <w:b w:val="0"/>
-          <w:bCs w:val="0"/>
-          <w:i w:val="0"/>
-          <w:iCs w:val="0"/>
-          <w:smallCaps w:val="0"/>
-          <w:strike w:val="0"/>
-          <w:color w:val="000000"/>
-          <w:sz w:val="22"/>
-          <w:szCs w:val="22"/>
-          <w:u w:val="none"/>
-          <w:shd w:fill="auto" w:val="clear"/>
-          <w:vertAlign w:val="baseline"/>
-          <w:rtl w:val="1"/>
-        </w:rPr>
-        <w:t xml:space="preserve"> </w:t>
-      </w:r>
-      <w:r>
-        <w:rPr>
-          <w:rFonts w:ascii="Arial" w:cs="Arial" w:eastAsia="Arial" w:hAnsi="Arial"/>
-          <w:b w:val="0"/>
-          <w:bCs w:val="0"/>
-          <w:i w:val="0"/>
-          <w:iCs w:val="0"/>
-          <w:smallCaps w:val="0"/>
-          <w:strike w:val="0"/>
-          <w:color w:val="000000"/>
-          <w:sz w:val="22"/>
-          <w:szCs w:val="22"/>
-          <w:u w:val="none"/>
-          <w:shd w:fill="auto" w:val="clear"/>
-          <w:vertAlign w:val="baseline"/>
-          <w:rtl w:val="1"/>
-        </w:rPr>
-        <w:t xml:space="preserve">לאפליקציה</w:t>
-      </w:r>
-      <w:r>
-        <w:rPr>
-          <w:rFonts w:ascii="Arial" w:cs="Arial" w:eastAsia="Arial" w:hAnsi="Arial"/>
-          <w:b w:val="0"/>
-          <w:bCs w:val="0"/>
-          <w:i w:val="0"/>
-          <w:iCs w:val="0"/>
-          <w:smallCaps w:val="0"/>
-          <w:strike w:val="0"/>
-          <w:color w:val="000000"/>
-          <w:sz w:val="22"/>
-          <w:szCs w:val="22"/>
-          <w:u w:val="none"/>
-          <w:shd w:fill="auto" w:val="clear"/>
-          <w:vertAlign w:val="baseline"/>
-          <w:rtl w:val="1"/>
-        </w:rPr>
-        <w:t xml:space="preserve"> — </w:t>
-      </w:r>
-      <w:r>
-        <w:rPr>
-          <w:rFonts w:ascii="Arial" w:cs="Arial" w:eastAsia="Arial" w:hAnsi="Arial"/>
-          <w:b w:val="0"/>
-          <w:bCs w:val="0"/>
-          <w:i w:val="0"/>
-          <w:iCs w:val="0"/>
-          <w:smallCaps w:val="0"/>
-          <w:strike w:val="0"/>
-          <w:color w:val="000000"/>
-          <w:sz w:val="22"/>
-          <w:szCs w:val="22"/>
-          <w:u w:val="none"/>
-          <w:shd w:fill="auto" w:val="clear"/>
-          <w:vertAlign w:val="baseline"/>
-          <w:rtl w:val="0"/>
-        </w:rPr>
-        <w:t xml:space="preserve">Should</w:t>
+        <w:t>25. טריגר יומיומי לחזרה לאפליקציה — Should, בגרסה הראשונה כתזכורת בתוך האפליקציה: אימון הבא, שיעור הבא, התקדמות באתגר והערת מאמן, ורצף ימים שבהם נשמר אימון. התראה לטלפון נדחתה. הסיפור המלא: story-25-daily-trigger.md (https://github.com/Sharpop30/fitness-app/blob/main/project-docs/story-25-daily-trigger.md)</w:t>
       </w:r>
     </w:p>
     <w:p>

</xml_diff>

<commit_message>
Approve story 10; PRD v1.15: all MLP stories expanded
Co-Authored-By: Claude Opus 5.5 <noreply@anthropic.com>
</commit_message>
<xml_diff>
--- a/project-docs/prd-fitness-app.docx
+++ b/project-docs/prd-fitness-app.docx
@@ -1529,7 +1529,7 @@
                 <w:szCs w:val="20"/>
                 <w:rtl w:val="0"/>
               </w:rPr>
-              <w:t>1.14</w:t>
+              <w:t>1.15</w:t>
             </w:r>
           </w:p>
         </w:tc>
@@ -3231,6 +3231,84 @@
                 <w:rtl w:val="0"/>
               </w:rPr>
               <w:t>1.14</w:t>
+            </w:r>
+          </w:p>
+        </w:tc>
+      </w:tr>
+      <w:tr>
+        <w:trPr>
+          <w:cantSplit w:val="0"/>
+          <w:tblHeader w:val="0"/>
+        </w:trPr>
+        <w:tc>
+          <w:tcPr>
+            <w:tcMar>
+              <w:top w:w="60.0" w:type="dxa"/>
+              <w:left w:w="100.0" w:type="dxa"/>
+              <w:bottom w:w="60.0" w:type="dxa"/>
+              <w:right w:w="100.0" w:type="dxa"/>
+            </w:tcMar>
+          </w:tcPr>
+          <w:p>
+            <w:pPr>
+              <w:bidi w:val="1"/>
+              <w:rPr/>
+            </w:pPr>
+            <w:r>
+              <w:rPr>
+                <w:sz w:val="20"/>
+                <w:szCs w:val="20"/>
+                <w:rtl w:val="1"/>
+              </w:rPr>
+              <w:t>סעיף 11: סיפור 10 הורחב, עם ההכרעות והקישור. כל סיפורי הגרסה הראשונה בפורמט ששת המרכיבים</w:t>
+            </w:r>
+          </w:p>
+        </w:tc>
+        <w:tc>
+          <w:tcPr>
+            <w:tcMar>
+              <w:top w:w="60.0" w:type="dxa"/>
+              <w:left w:w="100.0" w:type="dxa"/>
+              <w:bottom w:w="60.0" w:type="dxa"/>
+              <w:right w:w="100.0" w:type="dxa"/>
+            </w:tcMar>
+          </w:tcPr>
+          <w:p>
+            <w:pPr>
+              <w:bidi w:val="1"/>
+              <w:rPr/>
+            </w:pPr>
+            <w:r>
+              <w:rPr>
+                <w:sz w:val="20"/>
+                <w:szCs w:val="20"/>
+                <w:rtl w:val="0"/>
+              </w:rPr>
+              <w:t>27.09.2026</w:t>
+            </w:r>
+          </w:p>
+        </w:tc>
+        <w:tc>
+          <w:tcPr>
+            <w:tcMar>
+              <w:top w:w="60.0" w:type="dxa"/>
+              <w:left w:w="100.0" w:type="dxa"/>
+              <w:bottom w:w="60.0" w:type="dxa"/>
+              <w:right w:w="100.0" w:type="dxa"/>
+            </w:tcMar>
+          </w:tcPr>
+          <w:p>
+            <w:pPr>
+              <w:bidi w:val="1"/>
+              <w:rPr/>
+            </w:pPr>
+            <w:r>
+              <w:rPr>
+                <w:sz w:val="20"/>
+                <w:szCs w:val="20"/>
+                <w:rtl w:val="0"/>
+              </w:rPr>
+              <w:t>1.15</w:t>
             </w:r>
           </w:p>
         </w:tc>
@@ -24894,158 +24972,7 @@
         <w:rPr>
           <w:rtl w:val="0"/>
         </w:rPr>
-      </w:r>
-      <w:r>
-        <w:rPr>
-          <w:rFonts w:ascii="Arial" w:cs="Arial" w:eastAsia="Arial" w:hAnsi="Arial"/>
-          <w:b w:val="0"/>
-          <w:bCs w:val="0"/>
-          <w:i w:val="0"/>
-          <w:iCs w:val="0"/>
-          <w:smallCaps w:val="0"/>
-          <w:strike w:val="0"/>
-          <w:color w:val="000000"/>
-          <w:sz w:val="22"/>
-          <w:szCs w:val="22"/>
-          <w:u w:val="none"/>
-          <w:shd w:fill="auto" w:val="clear"/>
-          <w:vertAlign w:val="baseline"/>
-          <w:rtl w:val="1"/>
-        </w:rPr>
-        <w:t xml:space="preserve">10. </w:t>
-      </w:r>
-      <w:r>
-        <w:rPr>
-          <w:rFonts w:ascii="Arial" w:cs="Arial" w:eastAsia="Arial" w:hAnsi="Arial"/>
-          <w:b w:val="0"/>
-          <w:bCs w:val="0"/>
-          <w:i w:val="0"/>
-          <w:iCs w:val="0"/>
-          <w:smallCaps w:val="0"/>
-          <w:strike w:val="0"/>
-          <w:color w:val="000000"/>
-          <w:sz w:val="22"/>
-          <w:szCs w:val="22"/>
-          <w:u w:val="none"/>
-          <w:shd w:fill="auto" w:val="clear"/>
-          <w:vertAlign w:val="baseline"/>
-          <w:rtl w:val="1"/>
-        </w:rPr>
-        <w:t xml:space="preserve">סרטוני</w:t>
-      </w:r>
-      <w:r>
-        <w:rPr>
-          <w:rFonts w:ascii="Arial" w:cs="Arial" w:eastAsia="Arial" w:hAnsi="Arial"/>
-          <w:b w:val="0"/>
-          <w:bCs w:val="0"/>
-          <w:i w:val="0"/>
-          <w:iCs w:val="0"/>
-          <w:smallCaps w:val="0"/>
-          <w:strike w:val="0"/>
-          <w:color w:val="000000"/>
-          <w:sz w:val="22"/>
-          <w:szCs w:val="22"/>
-          <w:u w:val="none"/>
-          <w:shd w:fill="auto" w:val="clear"/>
-          <w:vertAlign w:val="baseline"/>
-          <w:rtl w:val="1"/>
-        </w:rPr>
-        <w:t xml:space="preserve"> </w:t>
-      </w:r>
-      <w:r>
-        <w:rPr>
-          <w:rFonts w:ascii="Arial" w:cs="Arial" w:eastAsia="Arial" w:hAnsi="Arial"/>
-          <w:b w:val="0"/>
-          <w:bCs w:val="0"/>
-          <w:i w:val="0"/>
-          <w:iCs w:val="0"/>
-          <w:smallCaps w:val="0"/>
-          <w:strike w:val="0"/>
-          <w:color w:val="000000"/>
-          <w:sz w:val="22"/>
-          <w:szCs w:val="22"/>
-          <w:u w:val="none"/>
-          <w:shd w:fill="auto" w:val="clear"/>
-          <w:vertAlign w:val="baseline"/>
-          <w:rtl w:val="1"/>
-        </w:rPr>
-        <w:t xml:space="preserve">הדגמה</w:t>
-      </w:r>
-      <w:r>
-        <w:rPr>
-          <w:rFonts w:ascii="Arial" w:cs="Arial" w:eastAsia="Arial" w:hAnsi="Arial"/>
-          <w:b w:val="0"/>
-          <w:bCs w:val="0"/>
-          <w:i w:val="0"/>
-          <w:iCs w:val="0"/>
-          <w:smallCaps w:val="0"/>
-          <w:strike w:val="0"/>
-          <w:color w:val="000000"/>
-          <w:sz w:val="22"/>
-          <w:szCs w:val="22"/>
-          <w:u w:val="none"/>
-          <w:shd w:fill="auto" w:val="clear"/>
-          <w:vertAlign w:val="baseline"/>
-          <w:rtl w:val="1"/>
-        </w:rPr>
-        <w:t xml:space="preserve"> </w:t>
-      </w:r>
-      <w:r>
-        <w:rPr>
-          <w:rFonts w:ascii="Arial" w:cs="Arial" w:eastAsia="Arial" w:hAnsi="Arial"/>
-          <w:b w:val="0"/>
-          <w:bCs w:val="0"/>
-          <w:i w:val="0"/>
-          <w:iCs w:val="0"/>
-          <w:smallCaps w:val="0"/>
-          <w:strike w:val="0"/>
-          <w:color w:val="000000"/>
-          <w:sz w:val="22"/>
-          <w:szCs w:val="22"/>
-          <w:u w:val="none"/>
-          <w:shd w:fill="auto" w:val="clear"/>
-          <w:vertAlign w:val="baseline"/>
-          <w:rtl w:val="1"/>
-        </w:rPr>
-        <w:t xml:space="preserve">לתרגילים</w:t>
-      </w:r>
-      <w:r>
-        <w:rPr>
-          <w:rFonts w:ascii="Arial" w:cs="Arial" w:eastAsia="Arial" w:hAnsi="Arial"/>
-          <w:b w:val="0"/>
-          <w:bCs w:val="0"/>
-          <w:i w:val="0"/>
-          <w:iCs w:val="0"/>
-          <w:smallCaps w:val="0"/>
-          <w:strike w:val="0"/>
-          <w:color w:val="000000"/>
-          <w:sz w:val="22"/>
-          <w:szCs w:val="22"/>
-          <w:u w:val="none"/>
-          <w:shd w:fill="auto" w:val="clear"/>
-          <w:vertAlign w:val="baseline"/>
-          <w:rtl w:val="1"/>
-        </w:rPr>
-        <w:t xml:space="preserve"> — </w:t>
-      </w:r>
-      <w:r>
-        <w:rPr>
-          <w:rFonts w:ascii="Arial" w:cs="Arial" w:eastAsia="Arial" w:hAnsi="Arial"/>
-          <w:b w:val="0"/>
-          <w:bCs w:val="0"/>
-          <w:i w:val="0"/>
-          <w:iCs w:val="0"/>
-          <w:smallCaps w:val="0"/>
-          <w:strike w:val="0"/>
-          <w:color w:val="000000"/>
-          <w:sz w:val="22"/>
-          <w:szCs w:val="22"/>
-          <w:u w:val="none"/>
-          <w:shd w:fill="auto" w:val="clear"/>
-          <w:vertAlign w:val="baseline"/>
-          <w:rtl w:val="0"/>
-        </w:rPr>
-        <w:t xml:space="preserve">Should</w:t>
+        <w:t>10. סרטוני הדגמה לתרגילים — Should, בגרסה הראשונה. סרטון לכל תרגיל, בקישור או בהעלאה של עד דקה, שמופיע בכל התוכניות. לרשימה המוכנה יש סרטונים מראש. הסיפור המלא: story-10-demo-videos.md (https://github.com/Sharpop30/fitness-app/blob/main/project-docs/story-10-demo-videos.md)</w:t>
       </w:r>
     </w:p>
     <w:p>

</xml_diff>

<commit_message>
Approve use case 5; story 4 v2; PRD v1.16; use case 6 draft
Co-Authored-By: Claude Opus 5.5 <noreply@anthropic.com>
</commit_message>
<xml_diff>
--- a/project-docs/prd-fitness-app.docx
+++ b/project-docs/prd-fitness-app.docx
@@ -1529,7 +1529,7 @@
                 <w:szCs w:val="20"/>
                 <w:rtl w:val="0"/>
               </w:rPr>
-              <w:t>1.15</w:t>
+              <w:t>1.16</w:t>
             </w:r>
           </w:p>
         </w:tc>
@@ -3309,6 +3309,84 @@
                 <w:rtl w:val="0"/>
               </w:rPr>
               <w:t>1.15</w:t>
+            </w:r>
+          </w:p>
+        </w:tc>
+      </w:tr>
+      <w:tr>
+        <w:trPr>
+          <w:cantSplit w:val="0"/>
+          <w:tblHeader w:val="0"/>
+        </w:trPr>
+        <w:tc>
+          <w:tcPr>
+            <w:tcMar>
+              <w:top w:w="60.0" w:type="dxa"/>
+              <w:left w:w="100.0" w:type="dxa"/>
+              <w:bottom w:w="60.0" w:type="dxa"/>
+              <w:right w:w="100.0" w:type="dxa"/>
+            </w:tcMar>
+          </w:tcPr>
+          <w:p>
+            <w:pPr>
+              <w:bidi w:val="1"/>
+              <w:rPr/>
+            </w:pPr>
+            <w:r>
+              <w:rPr>
+                <w:sz w:val="20"/>
+                <w:szCs w:val="20"/>
+                <w:rtl w:val="1"/>
+              </w:rPr>
+              <w:t>סעיף 11: סיפור 4 גרסה 2, תרגיל בלי משקל</w:t>
+            </w:r>
+          </w:p>
+        </w:tc>
+        <w:tc>
+          <w:tcPr>
+            <w:tcMar>
+              <w:top w:w="60.0" w:type="dxa"/>
+              <w:left w:w="100.0" w:type="dxa"/>
+              <w:bottom w:w="60.0" w:type="dxa"/>
+              <w:right w:w="100.0" w:type="dxa"/>
+            </w:tcMar>
+          </w:tcPr>
+          <w:p>
+            <w:pPr>
+              <w:bidi w:val="1"/>
+              <w:rPr/>
+            </w:pPr>
+            <w:r>
+              <w:rPr>
+                <w:sz w:val="20"/>
+                <w:szCs w:val="20"/>
+                <w:rtl w:val="0"/>
+              </w:rPr>
+              <w:t>28.09.2026</w:t>
+            </w:r>
+          </w:p>
+        </w:tc>
+        <w:tc>
+          <w:tcPr>
+            <w:tcMar>
+              <w:top w:w="60.0" w:type="dxa"/>
+              <w:left w:w="100.0" w:type="dxa"/>
+              <w:bottom w:w="60.0" w:type="dxa"/>
+              <w:right w:w="100.0" w:type="dxa"/>
+            </w:tcMar>
+          </w:tcPr>
+          <w:p>
+            <w:pPr>
+              <w:bidi w:val="1"/>
+              <w:rPr/>
+            </w:pPr>
+            <w:r>
+              <w:rPr>
+                <w:sz w:val="20"/>
+                <w:szCs w:val="20"/>
+                <w:rtl w:val="0"/>
+              </w:rPr>
+              <w:t>1.16</w:t>
             </w:r>
           </w:p>
         </w:tc>
@@ -24111,7 +24189,7 @@
         <w:rPr>
           <w:rtl w:val="0"/>
         </w:rPr>
-        <w:t>4. מעקב התקדמות ויזואלי — בגרסה הראשונה. גרף לכל תרגיל של המשקל הגבוה בכל אימון, עם סימון שיא אישי, אצל המאמן ואצל המתאמן. הסיפור המלא: story-04-progress-tracking.md (https://github.com/Sharpop30/fitness-app/blob/main/project-docs/story-04-progress-tracking.md)</w:t>
+        <w:t>4. מעקב התקדמות ויזואלי — בגרסה הראשונה. גרף לכל תרגיל של המשקל הגבוה בכל אימון (ובתרגיל בלי משקל, החזרות), עם סימון שיא אישי, אצל המאמן ואצל המתאמן. הסיפור המלא: story-04-progress-tracking.md (https://github.com/Sharpop30/fitness-app/blob/main/project-docs/story-04-progress-tracking.md)</w:t>
       </w:r>
     </w:p>
     <w:p>

</xml_diff>

<commit_message>
Approve use case 9; story 25 v2; PRD v1.17; use case 10 draft
Co-Authored-By: Claude Opus 5.5 <noreply@anthropic.com>
</commit_message>
<xml_diff>
--- a/project-docs/prd-fitness-app.docx
+++ b/project-docs/prd-fitness-app.docx
@@ -1529,7 +1529,7 @@
                 <w:szCs w:val="20"/>
                 <w:rtl w:val="0"/>
               </w:rPr>
-              <w:t>1.16</w:t>
+              <w:t>1.17</w:t>
             </w:r>
           </w:p>
         </w:tc>
@@ -3387,6 +3387,84 @@
                 <w:rtl w:val="0"/>
               </w:rPr>
               <w:t>1.16</w:t>
+            </w:r>
+          </w:p>
+        </w:tc>
+      </w:tr>
+      <w:tr>
+        <w:trPr>
+          <w:cantSplit w:val="0"/>
+          <w:tblHeader w:val="0"/>
+        </w:trPr>
+        <w:tc>
+          <w:tcPr>
+            <w:tcMar>
+              <w:top w:w="60.0" w:type="dxa"/>
+              <w:left w:w="100.0" w:type="dxa"/>
+              <w:bottom w:w="60.0" w:type="dxa"/>
+              <w:right w:w="100.0" w:type="dxa"/>
+            </w:tcMar>
+          </w:tcPr>
+          <w:p>
+            <w:pPr>
+              <w:bidi w:val="1"/>
+              <w:rPr/>
+            </w:pPr>
+            <w:r>
+              <w:rPr>
+                <w:sz w:val="20"/>
+                <w:szCs w:val="20"/>
+                <w:rtl w:val="1"/>
+              </w:rPr>
+              <w:t>סעיף 11: סיפור 25 גרסה 2, כלל הרצף</w:t>
+            </w:r>
+          </w:p>
+        </w:tc>
+        <w:tc>
+          <w:tcPr>
+            <w:tcMar>
+              <w:top w:w="60.0" w:type="dxa"/>
+              <w:left w:w="100.0" w:type="dxa"/>
+              <w:bottom w:w="60.0" w:type="dxa"/>
+              <w:right w:w="100.0" w:type="dxa"/>
+            </w:tcMar>
+          </w:tcPr>
+          <w:p>
+            <w:pPr>
+              <w:bidi w:val="1"/>
+              <w:rPr/>
+            </w:pPr>
+            <w:r>
+              <w:rPr>
+                <w:sz w:val="20"/>
+                <w:szCs w:val="20"/>
+                <w:rtl w:val="0"/>
+              </w:rPr>
+              <w:t>28.09.2026</w:t>
+            </w:r>
+          </w:p>
+        </w:tc>
+        <w:tc>
+          <w:tcPr>
+            <w:tcMar>
+              <w:top w:w="60.0" w:type="dxa"/>
+              <w:left w:w="100.0" w:type="dxa"/>
+              <w:bottom w:w="60.0" w:type="dxa"/>
+              <w:right w:w="100.0" w:type="dxa"/>
+            </w:tcMar>
+          </w:tcPr>
+          <w:p>
+            <w:pPr>
+              <w:bidi w:val="1"/>
+              <w:rPr/>
+            </w:pPr>
+            <w:r>
+              <w:rPr>
+                <w:sz w:val="20"/>
+                <w:szCs w:val="20"/>
+                <w:rtl w:val="0"/>
+              </w:rPr>
+              <w:t>1.17</w:t>
             </w:r>
           </w:p>
         </w:tc>
@@ -27751,7 +27829,7 @@
         <w:rPr>
           <w:rtl w:val="0"/>
         </w:rPr>
-        <w:t>25. טריגר יומיומי לחזרה לאפליקציה — Should, בגרסה הראשונה כתזכורת בתוך האפליקציה: אימון הבא, שיעור הבא, התקדמות באתגר והערת מאמן, ורצף ימים שבהם נשמר אימון. התראה לטלפון נדחתה. הסיפור המלא: story-25-daily-trigger.md (https://github.com/Sharpop30/fitness-app/blob/main/project-docs/story-25-daily-trigger.md)</w:t>
+        <w:t>25. טריגר יומיומי לחזרה לאפליקציה — Should, בגרסה הראשונה כתזכורת בתוך האפליקציה: אימון הבא, שיעור הבא, התקדמות באתגר והערת מאמן, ורצף אימונים שאינו מתאפס כל עוד עברו עד שלושה ימים בין אימון לאימון. התראה לטלפון נדחתה. הסיפור המלא: story-25-daily-trigger.md (https://github.com/Sharpop30/fitness-app/blob/main/project-docs/story-25-daily-trigger.md)</w:t>
       </w:r>
     </w:p>
     <w:p>

</xml_diff>

<commit_message>
Approve use case 11; story 30 v4; PRD v1.18: all MLP use cases approved
Co-Authored-By: Claude Opus 5.5 <noreply@anthropic.com>
</commit_message>
<xml_diff>
--- a/project-docs/prd-fitness-app.docx
+++ b/project-docs/prd-fitness-app.docx
@@ -1529,7 +1529,7 @@
                 <w:szCs w:val="20"/>
                 <w:rtl w:val="0"/>
               </w:rPr>
-              <w:t>1.17</w:t>
+              <w:t>1.18</w:t>
             </w:r>
           </w:p>
         </w:tc>
@@ -3465,6 +3465,84 @@
                 <w:rtl w:val="0"/>
               </w:rPr>
               <w:t>1.17</w:t>
+            </w:r>
+          </w:p>
+        </w:tc>
+      </w:tr>
+      <w:tr>
+        <w:trPr>
+          <w:cantSplit w:val="0"/>
+          <w:tblHeader w:val="0"/>
+        </w:trPr>
+        <w:tc>
+          <w:tcPr>
+            <w:tcMar>
+              <w:top w:w="60.0" w:type="dxa"/>
+              <w:left w:w="100.0" w:type="dxa"/>
+              <w:bottom w:w="60.0" w:type="dxa"/>
+              <w:right w:w="100.0" w:type="dxa"/>
+            </w:tcMar>
+          </w:tcPr>
+          <w:p>
+            <w:pPr>
+              <w:bidi w:val="1"/>
+              <w:rPr/>
+            </w:pPr>
+            <w:r>
+              <w:rPr>
+                <w:sz w:val="20"/>
+                <w:szCs w:val="20"/>
+                <w:rtl w:val="1"/>
+              </w:rPr>
+              <w:t>סעיף 11: סיפור 30 גרסה 4. כל מקרי השימוש של הגרסה הראשונה אושרו (סעיף 14 יתמלא ממפת המודולים)</w:t>
+            </w:r>
+          </w:p>
+        </w:tc>
+        <w:tc>
+          <w:tcPr>
+            <w:tcMar>
+              <w:top w:w="60.0" w:type="dxa"/>
+              <w:left w:w="100.0" w:type="dxa"/>
+              <w:bottom w:w="60.0" w:type="dxa"/>
+              <w:right w:w="100.0" w:type="dxa"/>
+            </w:tcMar>
+          </w:tcPr>
+          <w:p>
+            <w:pPr>
+              <w:bidi w:val="1"/>
+              <w:rPr/>
+            </w:pPr>
+            <w:r>
+              <w:rPr>
+                <w:sz w:val="20"/>
+                <w:szCs w:val="20"/>
+                <w:rtl w:val="0"/>
+              </w:rPr>
+              <w:t>28.09.2026</w:t>
+            </w:r>
+          </w:p>
+        </w:tc>
+        <w:tc>
+          <w:tcPr>
+            <w:tcMar>
+              <w:top w:w="60.0" w:type="dxa"/>
+              <w:left w:w="100.0" w:type="dxa"/>
+              <w:bottom w:w="60.0" w:type="dxa"/>
+              <w:right w:w="100.0" w:type="dxa"/>
+            </w:tcMar>
+          </w:tcPr>
+          <w:p>
+            <w:pPr>
+              <w:bidi w:val="1"/>
+              <w:rPr/>
+            </w:pPr>
+            <w:r>
+              <w:rPr>
+                <w:sz w:val="20"/>
+                <w:szCs w:val="20"/>
+                <w:rtl w:val="0"/>
+              </w:rPr>
+              <w:t>1.18</w:t>
             </w:r>
           </w:p>
         </w:tc>
@@ -29115,7 +29193,7 @@
         <w:rPr>
           <w:rtl w:val="0"/>
         </w:rPr>
-        <w:t>30. הרשמה לשיעורים — Must. שיעור קבוצתי עם מספר מקומות מוגבל, בלי קשר לתשלום, עם רשימת המתנה, ביטול עד 24 שעות לפני השיעור, וסימון נוכחות בידי המאמן. הסיפור המלא: story-30-class-registration.md (https://github.com/Sharpop30/fitness-app/blob/main/project-docs/story-30-class-registration.md)</w:t>
+        <w:t>30. הרשמה לשיעורים — Must. שיעור קבוצתי עם מספר מקומות מוגבל, בלי קשר לתשלום, עם רשימת המתנה (מקום שהתפנה מוצע בהודעה), ביטול עד 24 שעות ובקשה חריגה מהמאמן אחר כך, ביטול שיעור בידי המאמן עם הודעה, וסימון נוכחות. הסיפור המלא: story-30-class-registration.md (https://github.com/Sharpop30/fitness-app/blob/main/project-docs/story-30-class-registration.md)</w:t>
       </w:r>
     </w:p>
     <w:p>

</xml_diff>

<commit_message>
Approve prototype v1; PRD v1.19 section 13; conceptual ERD draft
Co-Authored-By: Claude Opus 5.5 <noreply@anthropic.com>
</commit_message>
<xml_diff>
--- a/project-docs/prd-fitness-app.docx
+++ b/project-docs/prd-fitness-app.docx
@@ -1529,7 +1529,7 @@
                 <w:szCs w:val="20"/>
                 <w:rtl w:val="0"/>
               </w:rPr>
-              <w:t>1.18</w:t>
+              <w:t>1.19</w:t>
             </w:r>
           </w:p>
         </w:tc>
@@ -3543,6 +3543,84 @@
                 <w:rtl w:val="0"/>
               </w:rPr>
               <w:t>1.18</w:t>
+            </w:r>
+          </w:p>
+        </w:tc>
+      </w:tr>
+      <w:tr>
+        <w:trPr>
+          <w:cantSplit w:val="0"/>
+          <w:tblHeader w:val="0"/>
+        </w:trPr>
+        <w:tc>
+          <w:tcPr>
+            <w:tcMar>
+              <w:top w:w="60.0" w:type="dxa"/>
+              <w:left w:w="100.0" w:type="dxa"/>
+              <w:bottom w:w="60.0" w:type="dxa"/>
+              <w:right w:w="100.0" w:type="dxa"/>
+            </w:tcMar>
+          </w:tcPr>
+          <w:p>
+            <w:pPr>
+              <w:bidi w:val="1"/>
+              <w:rPr/>
+            </w:pPr>
+            <w:r>
+              <w:rPr>
+                <w:sz w:val="20"/>
+                <w:szCs w:val="20"/>
+                <w:rtl w:val="1"/>
+              </w:rPr>
+              <w:t>סעיף 13 מולא: אב טיפוס גרסה 1 אושר; האימות מול משתמשים נדחה בהכרעת הצוות</w:t>
+            </w:r>
+          </w:p>
+        </w:tc>
+        <w:tc>
+          <w:tcPr>
+            <w:tcMar>
+              <w:top w:w="60.0" w:type="dxa"/>
+              <w:left w:w="100.0" w:type="dxa"/>
+              <w:bottom w:w="60.0" w:type="dxa"/>
+              <w:right w:w="100.0" w:type="dxa"/>
+            </w:tcMar>
+          </w:tcPr>
+          <w:p>
+            <w:pPr>
+              <w:bidi w:val="1"/>
+              <w:rPr/>
+            </w:pPr>
+            <w:r>
+              <w:rPr>
+                <w:sz w:val="20"/>
+                <w:szCs w:val="20"/>
+                <w:rtl w:val="0"/>
+              </w:rPr>
+              <w:t>28.09.2026</w:t>
+            </w:r>
+          </w:p>
+        </w:tc>
+        <w:tc>
+          <w:tcPr>
+            <w:tcMar>
+              <w:top w:w="60.0" w:type="dxa"/>
+              <w:left w:w="100.0" w:type="dxa"/>
+              <w:bottom w:w="60.0" w:type="dxa"/>
+              <w:right w:w="100.0" w:type="dxa"/>
+            </w:tcMar>
+          </w:tcPr>
+          <w:p>
+            <w:pPr>
+              <w:bidi w:val="1"/>
+              <w:rPr/>
+            </w:pPr>
+            <w:r>
+              <w:rPr>
+                <w:sz w:val="20"/>
+                <w:szCs w:val="20"/>
+                <w:rtl w:val="0"/>
+              </w:rPr>
+              <w:t>1.19</w:t>
             </w:r>
           </w:p>
         </w:tc>
@@ -30848,100 +30926,82 @@
           <w:iCs w:val="1"/>
           <w:rtl w:val="1"/>
         </w:rPr>
-        <w:t xml:space="preserve">טרם</w:t>
-      </w:r>
-      <w:r>
-        <w:rPr>
-          <w:i w:val="1"/>
-          <w:iCs w:val="1"/>
-          <w:rtl w:val="1"/>
-        </w:rPr>
-        <w:t xml:space="preserve"> </w:t>
-      </w:r>
-      <w:r>
-        <w:rPr>
-          <w:i w:val="1"/>
-          <w:iCs w:val="1"/>
-          <w:rtl w:val="1"/>
-        </w:rPr>
-        <w:t xml:space="preserve">עובד</w:t>
-      </w:r>
-      <w:r>
-        <w:rPr>
-          <w:i w:val="1"/>
-          <w:iCs w:val="1"/>
-          <w:rtl w:val="1"/>
-        </w:rPr>
-        <w:t xml:space="preserve"> </w:t>
-      </w:r>
-      <w:r>
-        <w:rPr>
-          <w:i w:val="1"/>
-          <w:iCs w:val="1"/>
-          <w:rtl w:val="1"/>
-        </w:rPr>
-        <w:t xml:space="preserve">בפרויקט</w:t>
-      </w:r>
-      <w:r>
-        <w:rPr>
-          <w:i w:val="1"/>
-          <w:iCs w:val="1"/>
-          <w:rtl w:val="1"/>
-        </w:rPr>
-        <w:t xml:space="preserve"> - </w:t>
-      </w:r>
-      <w:r>
-        <w:rPr>
-          <w:i w:val="1"/>
-          <w:iCs w:val="1"/>
-          <w:rtl w:val="1"/>
-        </w:rPr>
-        <w:t xml:space="preserve">יעודכן</w:t>
-      </w:r>
-      <w:r>
-        <w:rPr>
-          <w:i w:val="1"/>
-          <w:iCs w:val="1"/>
-          <w:rtl w:val="1"/>
-        </w:rPr>
-        <w:t xml:space="preserve"> </w:t>
-      </w:r>
-      <w:r>
-        <w:rPr>
-          <w:i w:val="1"/>
-          <w:iCs w:val="1"/>
-          <w:rtl w:val="1"/>
-        </w:rPr>
-        <w:t xml:space="preserve">כשהנושא</w:t>
-      </w:r>
-      <w:r>
-        <w:rPr>
-          <w:i w:val="1"/>
-          <w:iCs w:val="1"/>
-          <w:rtl w:val="1"/>
-        </w:rPr>
-        <w:t xml:space="preserve"> </w:t>
-      </w:r>
-      <w:r>
-        <w:rPr>
-          <w:i w:val="1"/>
-          <w:iCs w:val="1"/>
-          <w:rtl w:val="1"/>
-        </w:rPr>
-        <w:t xml:space="preserve">ייסגר</w:t>
-      </w:r>
-      <w:r>
-        <w:rPr>
-          <w:i w:val="1"/>
-          <w:iCs w:val="1"/>
-          <w:rtl w:val="1"/>
-        </w:rPr>
-        <w:t xml:space="preserve">.</w:t>
-      </w:r>
-      <w:r>
-        <w:rPr>
-          <w:rtl w:val="0"/>
-        </w:rPr>
+        <w:t>כלי האב טיפוס: קובץ HTML אחד, בעברית ומותאם לנייד, עם כל מסכי הגרסה הראשונה למאמן ולמתאמן, על נתוני דוגמה מסומנים. גרסה 1, 28.09.2026, בעיצוב FORM.</w:t>
+      </w:r>
+    </w:p>
+    <w:p>
+      <w:pPr>
+        <w:bidi w:val="1"/>
+        <w:spacing w:after="200" w:lineRule="auto"/>
+        <w:rPr/>
+      </w:pPr>
+      <w:r>
+        <w:rPr>
+          <w:i w:val="1"/>
+          <w:iCs w:val="1"/>
+          <w:rtl w:val="1"/>
+        </w:rPr>
+        <w:t>מה נבדק: בתחתית כל מסך השאלה שהמסך בודק מול המשתמש. הנחות העיצוב (מטבעות לפעולה, מחירים, שמירת מקום שעתיים, תוקף הזמנה 7 ימים, הערה עד 280 תווים) אושרו בידי הצוות.</w:t>
+      </w:r>
+    </w:p>
+    <w:p>
+      <w:pPr>
+        <w:bidi w:val="1"/>
+        <w:spacing w:after="200" w:lineRule="auto"/>
+        <w:rPr/>
+      </w:pPr>
+      <w:r>
+        <w:rPr>
+          <w:i w:val="1"/>
+          <w:iCs w:val="1"/>
+          <w:rtl w:val="1"/>
+        </w:rPr>
+        <w:t>ממי מקבלים משוב: מאמן ומתאמן. האימות מול משתמשים (צעד 26) נדחה בהכרעת הצוות מ-28.09.2026, והעבודה ממשיכה לתרשים הנתונים ולמפת המודולים. ממצאי אימות עתידיים ייכנסו כסבב תיקון לפי פרומפט 4 שלב ג.</w:t>
+      </w:r>
+    </w:p>
+    <w:p>
+      <w:pPr>
+        <w:bidi w:val="1"/>
+        <w:spacing w:after="200" w:lineRule="auto"/>
+        <w:rPr/>
+      </w:pPr>
+      <w:r>
+        <w:rPr>
+          <w:i w:val="1"/>
+          <w:iCs w:val="1"/>
+          <w:rtl w:val="1"/>
+        </w:rPr>
+        <w:t>קריטריון מעבר לבנייה: אב הטיפוס אושר בידי הצוות ב-28.09.2026.</w:t>
+      </w:r>
+    </w:p>
+    <w:p>
+      <w:pPr>
+        <w:bidi w:val="1"/>
+        <w:spacing w:after="200" w:lineRule="auto"/>
+        <w:rPr/>
+      </w:pPr>
+      <w:r>
+        <w:rPr>
+          <w:i w:val="1"/>
+          <w:iCs w:val="1"/>
+          <w:rtl w:val="1"/>
+        </w:rPr>
+        <w:t>שאלת בדיקה עצמית: האם כל דרישה בסעיף 12 מוצגת במסך באב הטיפוס?</w:t>
+      </w:r>
+    </w:p>
+    <w:p>
+      <w:pPr>
+        <w:bidi w:val="1"/>
+        <w:spacing w:after="200" w:lineRule="auto"/>
+        <w:rPr/>
+      </w:pPr>
+      <w:r>
+        <w:rPr>
+          <w:i w:val="1"/>
+          <w:iCs w:val="1"/>
+          <w:rtl w:val="1"/>
+        </w:rPr>
+        <w:t>המסמך המלא: prototype-fitness-app.html (https://github.com/Sharpop30/fitness-app/blob/main/project-docs/prototype-fitness-app.html), ובקישור השיתוף https://claude.ai/artifact/KDJkGC7zMEFhtQiwNbsufL</w:t>
       </w:r>
     </w:p>
     <w:p>

</xml_diff>

<commit_message>
Approve module map v1; PRD v1.20 sections 14-16
Co-Authored-By: Claude Opus 5.5 <noreply@anthropic.com>
</commit_message>
<xml_diff>
--- a/project-docs/prd-fitness-app.docx
+++ b/project-docs/prd-fitness-app.docx
@@ -1529,7 +1529,7 @@
                 <w:szCs w:val="20"/>
                 <w:rtl w:val="0"/>
               </w:rPr>
-              <w:t>1.19</w:t>
+              <w:t>1.20</w:t>
             </w:r>
           </w:p>
         </w:tc>
@@ -3621,6 +3621,84 @@
                 <w:rtl w:val="0"/>
               </w:rPr>
               <w:t>1.19</w:t>
+            </w:r>
+          </w:p>
+        </w:tc>
+      </w:tr>
+      <w:tr>
+        <w:trPr>
+          <w:cantSplit w:val="0"/>
+          <w:tblHeader w:val="0"/>
+        </w:trPr>
+        <w:tc>
+          <w:tcPr>
+            <w:tcMar>
+              <w:top w:w="60.0" w:type="dxa"/>
+              <w:left w:w="100.0" w:type="dxa"/>
+              <w:bottom w:w="60.0" w:type="dxa"/>
+              <w:right w:w="100.0" w:type="dxa"/>
+            </w:tcMar>
+          </w:tcPr>
+          <w:p>
+            <w:pPr>
+              <w:bidi w:val="1"/>
+              <w:rPr/>
+            </w:pPr>
+            <w:r>
+              <w:rPr>
+                <w:sz w:val="20"/>
+                <w:szCs w:val="20"/>
+                <w:rtl w:val="1"/>
+              </w:rPr>
+              <w:t>סעיפים 14, 15 ו-16 מולאו ממפת המודולים גרסה 1, לפי כלל 9</w:t>
+            </w:r>
+          </w:p>
+        </w:tc>
+        <w:tc>
+          <w:tcPr>
+            <w:tcMar>
+              <w:top w:w="60.0" w:type="dxa"/>
+              <w:left w:w="100.0" w:type="dxa"/>
+              <w:bottom w:w="60.0" w:type="dxa"/>
+              <w:right w:w="100.0" w:type="dxa"/>
+            </w:tcMar>
+          </w:tcPr>
+          <w:p>
+            <w:pPr>
+              <w:bidi w:val="1"/>
+              <w:rPr/>
+            </w:pPr>
+            <w:r>
+              <w:rPr>
+                <w:sz w:val="20"/>
+                <w:szCs w:val="20"/>
+                <w:rtl w:val="0"/>
+              </w:rPr>
+              <w:t>28.09.2026</w:t>
+            </w:r>
+          </w:p>
+        </w:tc>
+        <w:tc>
+          <w:tcPr>
+            <w:tcMar>
+              <w:top w:w="60.0" w:type="dxa"/>
+              <w:left w:w="100.0" w:type="dxa"/>
+              <w:bottom w:w="60.0" w:type="dxa"/>
+              <w:right w:w="100.0" w:type="dxa"/>
+            </w:tcMar>
+          </w:tcPr>
+          <w:p>
+            <w:pPr>
+              <w:bidi w:val="1"/>
+              <w:rPr/>
+            </w:pPr>
+            <w:r>
+              <w:rPr>
+                <w:sz w:val="20"/>
+                <w:szCs w:val="20"/>
+                <w:rtl w:val="0"/>
+              </w:rPr>
+              <w:t>1.20</w:t>
             </w:r>
           </w:p>
         </w:tc>
@@ -31549,100 +31627,82 @@
           <w:iCs w:val="1"/>
           <w:rtl w:val="1"/>
         </w:rPr>
-        <w:t xml:space="preserve">טרם</w:t>
-      </w:r>
-      <w:r>
-        <w:rPr>
-          <w:i w:val="1"/>
-          <w:iCs w:val="1"/>
-          <w:rtl w:val="1"/>
-        </w:rPr>
-        <w:t xml:space="preserve"> </w:t>
-      </w:r>
-      <w:r>
-        <w:rPr>
-          <w:i w:val="1"/>
-          <w:iCs w:val="1"/>
-          <w:rtl w:val="1"/>
-        </w:rPr>
-        <w:t xml:space="preserve">עובד</w:t>
-      </w:r>
-      <w:r>
-        <w:rPr>
-          <w:i w:val="1"/>
-          <w:iCs w:val="1"/>
-          <w:rtl w:val="1"/>
-        </w:rPr>
-        <w:t xml:space="preserve"> </w:t>
-      </w:r>
-      <w:r>
-        <w:rPr>
-          <w:i w:val="1"/>
-          <w:iCs w:val="1"/>
-          <w:rtl w:val="1"/>
-        </w:rPr>
-        <w:t xml:space="preserve">בפרויקט</w:t>
-      </w:r>
-      <w:r>
-        <w:rPr>
-          <w:i w:val="1"/>
-          <w:iCs w:val="1"/>
-          <w:rtl w:val="1"/>
-        </w:rPr>
-        <w:t xml:space="preserve"> - </w:t>
-      </w:r>
-      <w:r>
-        <w:rPr>
-          <w:i w:val="1"/>
-          <w:iCs w:val="1"/>
-          <w:rtl w:val="1"/>
-        </w:rPr>
-        <w:t xml:space="preserve">יעודכן</w:t>
-      </w:r>
-      <w:r>
-        <w:rPr>
-          <w:i w:val="1"/>
-          <w:iCs w:val="1"/>
-          <w:rtl w:val="1"/>
-        </w:rPr>
-        <w:t xml:space="preserve"> </w:t>
-      </w:r>
-      <w:r>
-        <w:rPr>
-          <w:i w:val="1"/>
-          <w:iCs w:val="1"/>
-          <w:rtl w:val="1"/>
-        </w:rPr>
-        <w:t xml:space="preserve">כשהנושא</w:t>
-      </w:r>
-      <w:r>
-        <w:rPr>
-          <w:i w:val="1"/>
-          <w:iCs w:val="1"/>
-          <w:rtl w:val="1"/>
-        </w:rPr>
-        <w:t xml:space="preserve"> </w:t>
-      </w:r>
-      <w:r>
-        <w:rPr>
-          <w:i w:val="1"/>
-          <w:iCs w:val="1"/>
-          <w:rtl w:val="1"/>
-        </w:rPr>
-        <w:t xml:space="preserve">ייסגר</w:t>
-      </w:r>
-      <w:r>
-        <w:rPr>
-          <w:i w:val="1"/>
-          <w:iCs w:val="1"/>
-          <w:rtl w:val="1"/>
-        </w:rPr>
-        <w:t xml:space="preserve">.</w:t>
-      </w:r>
-      <w:r>
-        <w:rPr>
-          <w:rtl w:val="0"/>
-        </w:rPr>
+        <w:t>לכל דרישה בגרסה הראשונה מקרה שימוש מאושר (usecase-01 עד 11), וכל צעד בו מסווג לפי סוג הרכיב ודרגת המימוש.</w:t>
+      </w:r>
+    </w:p>
+    <w:p>
+      <w:pPr>
+        <w:bidi w:val="1"/>
+        <w:spacing w:after="200" w:lineRule="auto"/>
+        <w:rPr/>
+      </w:pPr>
+      <w:r>
+        <w:rPr>
+          <w:i w:val="1"/>
+          <w:iCs w:val="1"/>
+          <w:rtl w:val="1"/>
+        </w:rPr>
+        <w:t>מה בקוד רגיל: הכול. אין AI בגרסה הראשונה, וכל נקודות ההחלטה ניתנות לשרטוט מראש. משוב ב-AI הוא החלפה עתידית של גוף מודול המשוב בלבד.</w:t>
+      </w:r>
+    </w:p>
+    <w:p>
+      <w:pPr>
+        <w:bidi w:val="1"/>
+        <w:spacing w:after="200" w:lineRule="auto"/>
+        <w:rPr/>
+      </w:pPr>
+      <w:r>
+        <w:rPr>
+          <w:i w:val="1"/>
+          <w:iCs w:val="1"/>
+          <w:rtl w:val="1"/>
+        </w:rPr>
+        <w:t>ממשקים: Identity Connector (Supabase Auth), Payment Gateway מדומה, Invite Channel (קישור ומייל), ואחסון קבצים בתוך ה-Repository.</w:t>
+      </w:r>
+    </w:p>
+    <w:p>
+      <w:pPr>
+        <w:bidi w:val="1"/>
+        <w:spacing w:after="200" w:lineRule="auto"/>
+        <w:rPr/>
+      </w:pPr>
+      <w:r>
+        <w:rPr>
+          <w:i w:val="1"/>
+          <w:iCs w:val="1"/>
+          <w:rtl w:val="1"/>
+        </w:rPr>
+        <w:t>שיוך למודול: כל דרישה משויכת למודול אחד מתוך 14 (M01 עד M14). חריגות מאימות אב הטיפוס: [טרם נקבע], האימות נדחה.</w:t>
+      </w:r>
+    </w:p>
+    <w:p>
+      <w:pPr>
+        <w:bidi w:val="1"/>
+        <w:spacing w:after="200" w:lineRule="auto"/>
+        <w:rPr/>
+      </w:pPr>
+      <w:r>
+        <w:rPr>
+          <w:i w:val="1"/>
+          <w:iCs w:val="1"/>
+          <w:rtl w:val="1"/>
+        </w:rPr>
+        <w:t>שאלת בדיקה עצמית: האם לכל דרישה בסעיף 12 יש מקרה שימוש ומודול?</w:t>
+      </w:r>
+    </w:p>
+    <w:p>
+      <w:pPr>
+        <w:bidi w:val="1"/>
+        <w:spacing w:after="200" w:lineRule="auto"/>
+        <w:rPr/>
+      </w:pPr>
+      <w:r>
+        <w:rPr>
+          <w:i w:val="1"/>
+          <w:iCs w:val="1"/>
+          <w:rtl w:val="1"/>
+        </w:rPr>
+        <w:t>המסמך המלא: מפת המודולים, doc-module-map.md (https://github.com/Sharpop30/fitness-app/blob/main/project-docs/doc-module-map.md)</w:t>
       </w:r>
     </w:p>
     <w:p>
@@ -31897,100 +31957,97 @@
           <w:iCs w:val="1"/>
           <w:rtl w:val="1"/>
         </w:rPr>
-        <w:t xml:space="preserve">טרם</w:t>
-      </w:r>
-      <w:r>
-        <w:rPr>
-          <w:i w:val="1"/>
-          <w:iCs w:val="1"/>
-          <w:rtl w:val="1"/>
-        </w:rPr>
-        <w:t xml:space="preserve"> </w:t>
-      </w:r>
-      <w:r>
-        <w:rPr>
-          <w:i w:val="1"/>
-          <w:iCs w:val="1"/>
-          <w:rtl w:val="1"/>
-        </w:rPr>
-        <w:t xml:space="preserve">עובד</w:t>
-      </w:r>
-      <w:r>
-        <w:rPr>
-          <w:i w:val="1"/>
-          <w:iCs w:val="1"/>
-          <w:rtl w:val="1"/>
-        </w:rPr>
-        <w:t xml:space="preserve"> </w:t>
-      </w:r>
-      <w:r>
-        <w:rPr>
-          <w:i w:val="1"/>
-          <w:iCs w:val="1"/>
-          <w:rtl w:val="1"/>
-        </w:rPr>
-        <w:t xml:space="preserve">בפרויקט</w:t>
-      </w:r>
-      <w:r>
-        <w:rPr>
-          <w:i w:val="1"/>
-          <w:iCs w:val="1"/>
-          <w:rtl w:val="1"/>
-        </w:rPr>
-        <w:t xml:space="preserve"> - </w:t>
-      </w:r>
-      <w:r>
-        <w:rPr>
-          <w:i w:val="1"/>
-          <w:iCs w:val="1"/>
-          <w:rtl w:val="1"/>
-        </w:rPr>
-        <w:t xml:space="preserve">יעודכן</w:t>
-      </w:r>
-      <w:r>
-        <w:rPr>
-          <w:i w:val="1"/>
-          <w:iCs w:val="1"/>
-          <w:rtl w:val="1"/>
-        </w:rPr>
-        <w:t xml:space="preserve"> </w:t>
-      </w:r>
-      <w:r>
-        <w:rPr>
-          <w:i w:val="1"/>
-          <w:iCs w:val="1"/>
-          <w:rtl w:val="1"/>
-        </w:rPr>
-        <w:t xml:space="preserve">כשהנושא</w:t>
-      </w:r>
-      <w:r>
-        <w:rPr>
-          <w:i w:val="1"/>
-          <w:iCs w:val="1"/>
-          <w:rtl w:val="1"/>
-        </w:rPr>
-        <w:t xml:space="preserve"> </w:t>
-      </w:r>
-      <w:r>
-        <w:rPr>
-          <w:i w:val="1"/>
-          <w:iCs w:val="1"/>
-          <w:rtl w:val="1"/>
-        </w:rPr>
-        <w:t xml:space="preserve">ייסגר</w:t>
-      </w:r>
-      <w:r>
-        <w:rPr>
-          <w:i w:val="1"/>
-          <w:iCs w:val="1"/>
-          <w:rtl w:val="1"/>
-        </w:rPr>
-        <w:t xml:space="preserve">.</w:t>
-      </w:r>
-      <w:r>
-        <w:rPr>
-          <w:rtl w:val="0"/>
-        </w:rPr>
+        <w:t>השאלה האסטרטגית: ליבה חדשה. יעד ההרצה: ענן, Supabase ו-Endpoint יחיד כ-Edge Function; האתר ב-GitHub Pages.</w:t>
+      </w:r>
+    </w:p>
+    <w:p>
+      <w:pPr>
+        <w:bidi w:val="1"/>
+        <w:spacing w:after="200" w:lineRule="auto"/>
+        <w:rPr/>
+      </w:pPr>
+      <w:r>
+        <w:rPr>
+          <w:i w:val="1"/>
+          <w:iCs w:val="1"/>
+          <w:rtl w:val="1"/>
+        </w:rPr>
+        <w:t>הליבה: מאמן, מתאמן, תרגיל, תוכנית ואימון שבוצע, ושמונה כללי Business Logic. כל השאר נתונים פרטיים של מודול.</w:t>
+      </w:r>
+    </w:p>
+    <w:p>
+      <w:pPr>
+        <w:bidi w:val="1"/>
+        <w:spacing w:after="200" w:lineRule="auto"/>
+        <w:rPr/>
+      </w:pPr>
+      <w:r>
+        <w:rPr>
+          <w:i w:val="1"/>
+          <w:iCs w:val="1"/>
+          <w:rtl w:val="1"/>
+        </w:rPr>
+        <w:t>רכיבים: Endpoint ו-Orchestrator, Registry, Audit Log, Repository ו-Error Codes; 14 מודולים עסקיים; 4 ממשקים. כל פנייה עוברת ב-Orchestrator במעטפה { caller, module, action, payload, lang }, והתשובה ב-{ ok, data, error }.</w:t>
+      </w:r>
+    </w:p>
+    <w:p>
+      <w:pPr>
+        <w:bidi w:val="1"/>
+        <w:spacing w:after="200" w:lineRule="auto"/>
+        <w:rPr/>
+      </w:pPr>
+      <w:r>
+        <w:rPr>
+          <w:i w:val="1"/>
+          <w:iCs w:val="1"/>
+          <w:rtl w:val="1"/>
+        </w:rPr>
+        <w:t>זרימת מידע: מסך, Endpoint, Orchestrator, מודול, Repository, מסד. כיוון תלות אחד, בלי ייבוא בין מודולים. תרשימים: diagram-06-architecture ו-06a-modules.</w:t>
+      </w:r>
+    </w:p>
+    <w:p>
+      <w:pPr>
+        <w:bidi w:val="1"/>
+        <w:spacing w:after="200" w:lineRule="auto"/>
+        <w:rPr/>
+      </w:pPr>
+      <w:r>
+        <w:rPr>
+          <w:i w:val="1"/>
+          <w:iCs w:val="1"/>
+          <w:rtl w:val="1"/>
+        </w:rPr>
+        <w:t>ניהול הקשר: אין AI, ולכן אין ניהול הקשר למודל.</w:t>
+      </w:r>
+    </w:p>
+    <w:p>
+      <w:pPr>
+        <w:bidi w:val="1"/>
+        <w:spacing w:after="200" w:lineRule="auto"/>
+        <w:rPr/>
+      </w:pPr>
+      <w:r>
+        <w:rPr>
+          <w:i w:val="1"/>
+          <w:iCs w:val="1"/>
+          <w:rtl w:val="1"/>
+        </w:rPr>
+        <w:t>שאלת בדיקה עצמית: האם אפשר להחליף את Supabase, ספק הסליקה או העיצוב בלי לשבור דבר מחוץ לרכיב שהוחלף?</w:t>
+      </w:r>
+    </w:p>
+    <w:p>
+      <w:pPr>
+        <w:bidi w:val="1"/>
+        <w:spacing w:after="200" w:lineRule="auto"/>
+        <w:rPr/>
+      </w:pPr>
+      <w:r>
+        <w:rPr>
+          <w:i w:val="1"/>
+          <w:iCs w:val="1"/>
+          <w:rtl w:val="1"/>
+        </w:rPr>
+        <w:t>המסמך המלא: מפת המודולים, doc-module-map.md (https://github.com/Sharpop30/fitness-app/blob/main/project-docs/doc-module-map.md)</w:t>
       </w:r>
     </w:p>
     <w:p>
@@ -32277,100 +32334,67 @@
           <w:iCs w:val="1"/>
           <w:rtl w:val="1"/>
         </w:rPr>
-        <w:t xml:space="preserve">טרם</w:t>
-      </w:r>
-      <w:r>
-        <w:rPr>
-          <w:i w:val="1"/>
-          <w:iCs w:val="1"/>
-          <w:rtl w:val="1"/>
-        </w:rPr>
-        <w:t xml:space="preserve"> </w:t>
-      </w:r>
-      <w:r>
-        <w:rPr>
-          <w:i w:val="1"/>
-          <w:iCs w:val="1"/>
-          <w:rtl w:val="1"/>
-        </w:rPr>
-        <w:t xml:space="preserve">עובד</w:t>
-      </w:r>
-      <w:r>
-        <w:rPr>
-          <w:i w:val="1"/>
-          <w:iCs w:val="1"/>
-          <w:rtl w:val="1"/>
-        </w:rPr>
-        <w:t xml:space="preserve"> </w:t>
-      </w:r>
-      <w:r>
-        <w:rPr>
-          <w:i w:val="1"/>
-          <w:iCs w:val="1"/>
-          <w:rtl w:val="1"/>
-        </w:rPr>
-        <w:t xml:space="preserve">בפרויקט</w:t>
-      </w:r>
-      <w:r>
-        <w:rPr>
-          <w:i w:val="1"/>
-          <w:iCs w:val="1"/>
-          <w:rtl w:val="1"/>
-        </w:rPr>
-        <w:t xml:space="preserve"> - </w:t>
-      </w:r>
-      <w:r>
-        <w:rPr>
-          <w:i w:val="1"/>
-          <w:iCs w:val="1"/>
-          <w:rtl w:val="1"/>
-        </w:rPr>
-        <w:t xml:space="preserve">יעודכן</w:t>
-      </w:r>
-      <w:r>
-        <w:rPr>
-          <w:i w:val="1"/>
-          <w:iCs w:val="1"/>
-          <w:rtl w:val="1"/>
-        </w:rPr>
-        <w:t xml:space="preserve"> </w:t>
-      </w:r>
-      <w:r>
-        <w:rPr>
-          <w:i w:val="1"/>
-          <w:iCs w:val="1"/>
-          <w:rtl w:val="1"/>
-        </w:rPr>
-        <w:t xml:space="preserve">כשהנושא</w:t>
-      </w:r>
-      <w:r>
-        <w:rPr>
-          <w:i w:val="1"/>
-          <w:iCs w:val="1"/>
-          <w:rtl w:val="1"/>
-        </w:rPr>
-        <w:t xml:space="preserve"> </w:t>
-      </w:r>
-      <w:r>
-        <w:rPr>
-          <w:i w:val="1"/>
-          <w:iCs w:val="1"/>
-          <w:rtl w:val="1"/>
-        </w:rPr>
-        <w:t xml:space="preserve">ייסגר</w:t>
-      </w:r>
-      <w:r>
-        <w:rPr>
-          <w:i w:val="1"/>
-          <w:iCs w:val="1"/>
-          <w:rtl w:val="1"/>
-        </w:rPr>
-        <w:t xml:space="preserve">.</w:t>
-      </w:r>
-      <w:r>
-        <w:rPr>
-          <w:rtl w:val="0"/>
-        </w:rPr>
+        <w:t>רשימת מסכים: 23. למאמן S01 עד S12, למתאמן S13 עד S20, משותפים S21 עד S23. כל מסך מודול, ופונה ל-Endpoint היחיד בלבד.</w:t>
+      </w:r>
+    </w:p>
+    <w:p>
+      <w:pPr>
+        <w:bidi w:val="1"/>
+        <w:spacing w:after="200" w:lineRule="auto"/>
+        <w:rPr/>
+      </w:pPr>
+      <w:r>
+        <w:rPr>
+          <w:i w:val="1"/>
+          <w:iCs w:val="1"/>
+          <w:rtl w:val="1"/>
+        </w:rPr>
+        <w:t>תיאור וזרימה: לפי אב הטיפוס המאושר (prototype-fitness-app גרסה 1). לכל מסך טבלת פעולות סגורה במפה.</w:t>
+      </w:r>
+    </w:p>
+    <w:p>
+      <w:pPr>
+        <w:bidi w:val="1"/>
+        <w:spacing w:after="200" w:lineRule="auto"/>
+        <w:rPr/>
+      </w:pPr>
+      <w:r>
+        <w:rPr>
+          <w:i w:val="1"/>
+          <w:iCs w:val="1"/>
+          <w:rtl w:val="1"/>
+        </w:rPr>
+        <w:t>הנחיות UX: מודול עיצוב אחד (D01) באסימוני FORM, עברית מימין לשמאל, מותאם לנייד, שפה פשוטה, והודעת שגיאה בשפת אדם מטבלת ERROR_CODES.</w:t>
+      </w:r>
+    </w:p>
+    <w:p>
+      <w:pPr>
+        <w:bidi w:val="1"/>
+        <w:spacing w:after="200" w:lineRule="auto"/>
+        <w:rPr/>
+      </w:pPr>
+      <w:r>
+        <w:rPr>
+          <w:i w:val="1"/>
+          <w:iCs w:val="1"/>
+          <w:rtl w:val="1"/>
+        </w:rPr>
+        <w:t>שאלת בדיקה עצמית: האם כל מסך מפעיל רק את הפעולות שבטבלה שלו?</w:t>
+      </w:r>
+    </w:p>
+    <w:p>
+      <w:pPr>
+        <w:bidi w:val="1"/>
+        <w:spacing w:after="200" w:lineRule="auto"/>
+        <w:rPr/>
+      </w:pPr>
+      <w:r>
+        <w:rPr>
+          <w:i w:val="1"/>
+          <w:iCs w:val="1"/>
+          <w:rtl w:val="1"/>
+        </w:rPr>
+        <w:t>המסמך המלא: מפת המודולים, doc-module-map.md (https://github.com/Sharpop30/fitness-app/blob/main/project-docs/doc-module-map.md)</w:t>
       </w:r>
     </w:p>
     <w:p>

</xml_diff>

<commit_message>
PRD v1.21: the business owner in sections 1, 7 and 9 to 16
From the ten approved items in prd-update-inbox, now in done. The previous
version is archived and the run is logged.

Co-Authored-By: Claude Opus 5.5 <noreply@anthropic.com>
</commit_message>
<xml_diff>
--- a/project-docs/prd-fitness-app.docx
+++ b/project-docs/prd-fitness-app.docx
@@ -1529,7 +1529,7 @@
                 <w:szCs w:val="20"/>
                 <w:rtl w:val="0"/>
               </w:rPr>
-              <w:t>1.20</w:t>
+              <w:t>1.21</w:t>
             </w:r>
           </w:p>
         </w:tc>
@@ -1604,7 +1604,7 @@
                 <w:szCs w:val="20"/>
                 <w:rtl w:val="0"/>
               </w:rPr>
-              <w:t>27.09.2026</w:t>
+              <w:t>30.09.2026</w:t>
             </w:r>
             <w:r>
               <w:rPr>
@@ -3699,6 +3699,84 @@
                 <w:rtl w:val="0"/>
               </w:rPr>
               <w:t>1.20</w:t>
+            </w:r>
+          </w:p>
+        </w:tc>
+      </w:tr>
+      <w:tr>
+        <w:trPr>
+          <w:cantSplit w:val="0"/>
+          <w:tblHeader w:val="0"/>
+        </w:trPr>
+        <w:tc>
+          <w:tcPr>
+            <w:tcMar>
+              <w:top w:w="60.0" w:type="dxa"/>
+              <w:left w:w="100.0" w:type="dxa"/>
+              <w:bottom w:w="60.0" w:type="dxa"/>
+              <w:right w:w="100.0" w:type="dxa"/>
+            </w:tcMar>
+          </w:tcPr>
+          <w:p>
+            <w:pPr>
+              <w:bidi w:val="1"/>
+              <w:rPr/>
+            </w:pPr>
+            <w:r>
+              <w:rPr>
+                <w:sz w:val="20"/>
+                <w:szCs w:val="20"/>
+                <w:rtl w:val="1"/>
+              </w:rPr>
+              <w:t>בעל העסק, בהכרעת הצוות (מסלול ב, doc-owner-role): סעיף 7, בעל העניין השלישי; סעיף 9, היכן מוצגים המדדים; סעיפים 10 ו-11, דרישה 15 וסיפור 15; סעיף 12, דרישה 15 בחלקה נכנסת; סעיף 13, אב הטיפוס גרסאות 2 ו-3; סעיפים 14 עד 16, מפת המודולים גרסה 11. המקורות: doc-stakeholder-map גרסה 2, doc-okr-kpi גרסה 2, doc-mlp-scope גרסה 2, story-15, usecase-12, ERD גרסה 2, doc-module-map גרסה 11, prototype גרסה 3</w:t>
+            </w:r>
+          </w:p>
+        </w:tc>
+        <w:tc>
+          <w:tcPr>
+            <w:tcMar>
+              <w:top w:w="60.0" w:type="dxa"/>
+              <w:left w:w="100.0" w:type="dxa"/>
+              <w:bottom w:w="60.0" w:type="dxa"/>
+              <w:right w:w="100.0" w:type="dxa"/>
+            </w:tcMar>
+          </w:tcPr>
+          <w:p>
+            <w:pPr>
+              <w:bidi w:val="1"/>
+              <w:rPr/>
+            </w:pPr>
+            <w:r>
+              <w:rPr>
+                <w:sz w:val="20"/>
+                <w:szCs w:val="20"/>
+                <w:rtl w:val="0"/>
+              </w:rPr>
+              <w:t>30.09.2026</w:t>
+            </w:r>
+          </w:p>
+        </w:tc>
+        <w:tc>
+          <w:tcPr>
+            <w:tcMar>
+              <w:top w:w="60.0" w:type="dxa"/>
+              <w:left w:w="100.0" w:type="dxa"/>
+              <w:bottom w:w="60.0" w:type="dxa"/>
+              <w:right w:w="100.0" w:type="dxa"/>
+            </w:tcMar>
+          </w:tcPr>
+          <w:p>
+            <w:pPr>
+              <w:bidi w:val="1"/>
+              <w:rPr/>
+            </w:pPr>
+            <w:r>
+              <w:rPr>
+                <w:sz w:val="20"/>
+                <w:szCs w:val="20"/>
+                <w:rtl w:val="0"/>
+              </w:rPr>
+              <w:t>1.21</w:t>
             </w:r>
           </w:p>
         </w:tc>
@@ -13363,6 +13441,332 @@
           </w:p>
         </w:tc>
       </w:tr>
+      <w:tr>
+        <w:trPr>
+          <w:cantSplit w:val="0"/>
+          <w:tblHeader w:val="0"/>
+        </w:trPr>
+        <w:tc>
+          <w:tcPr>
+            <w:tcMar>
+              <w:top w:w="60.0" w:type="dxa"/>
+              <w:left w:w="100.0" w:type="dxa"/>
+              <w:bottom w:w="60.0" w:type="dxa"/>
+              <w:right w:w="100.0" w:type="dxa"/>
+            </w:tcMar>
+          </w:tcPr>
+          <w:p>
+            <w:pPr>
+              <w:bidi w:val="1"/>
+              <w:rPr/>
+            </w:pPr>
+            <w:r>
+              <w:rPr>
+                <w:sz w:val="20"/>
+                <w:szCs w:val="20"/>
+                <w:rtl w:val="1"/>
+              </w:rPr>
+              <w:t>תמונת העסק במקום אחד בלי לשאול כל מאמן, גבייה פתוחה שנראית מיד, מדדי השימור של כל העסק, מאמנים שמצטרפים בהזמנה</w:t>
+            </w:r>
+            <w:r>
+              <w:rPr>
+                <w:sz w:val="20"/>
+                <w:szCs w:val="20"/>
+                <w:rtl w:val="1"/>
+              </w:rPr>
+            </w:r>
+            <w:r>
+              <w:rPr>
+                <w:sz w:val="20"/>
+                <w:szCs w:val="20"/>
+                <w:rtl w:val="1"/>
+              </w:rPr>
+            </w:r>
+            <w:r>
+              <w:rPr>
+                <w:sz w:val="20"/>
+                <w:szCs w:val="20"/>
+                <w:rtl w:val="1"/>
+              </w:rPr>
+            </w:r>
+            <w:r>
+              <w:rPr>
+                <w:sz w:val="20"/>
+                <w:szCs w:val="20"/>
+                <w:rtl w:val="1"/>
+              </w:rPr>
+            </w:r>
+            <w:r>
+              <w:rPr>
+                <w:sz w:val="20"/>
+                <w:szCs w:val="20"/>
+                <w:rtl w:val="1"/>
+              </w:rPr>
+            </w:r>
+            <w:r>
+              <w:rPr>
+                <w:sz w:val="20"/>
+                <w:szCs w:val="20"/>
+                <w:rtl w:val="1"/>
+              </w:rPr>
+            </w:r>
+            <w:r>
+              <w:rPr>
+                <w:sz w:val="20"/>
+                <w:szCs w:val="20"/>
+                <w:rtl w:val="1"/>
+              </w:rPr>
+            </w:r>
+            <w:r>
+              <w:rPr>
+                <w:sz w:val="20"/>
+                <w:szCs w:val="20"/>
+                <w:rtl w:val="1"/>
+              </w:rPr>
+            </w:r>
+            <w:r>
+              <w:rPr>
+                <w:sz w:val="20"/>
+                <w:szCs w:val="20"/>
+                <w:rtl w:val="1"/>
+              </w:rPr>
+            </w:r>
+            <w:r>
+              <w:rPr>
+                <w:sz w:val="20"/>
+                <w:szCs w:val="20"/>
+                <w:rtl w:val="1"/>
+              </w:rPr>
+            </w:r>
+            <w:r>
+              <w:rPr>
+                <w:sz w:val="20"/>
+                <w:szCs w:val="20"/>
+                <w:rtl w:val="1"/>
+              </w:rPr>
+            </w:r>
+            <w:r>
+              <w:rPr>
+                <w:sz w:val="20"/>
+                <w:szCs w:val="20"/>
+                <w:rtl w:val="1"/>
+              </w:rPr>
+            </w:r>
+            <w:r>
+              <w:rPr>
+                <w:sz w:val="20"/>
+                <w:szCs w:val="20"/>
+                <w:rtl w:val="1"/>
+              </w:rPr>
+            </w:r>
+            <w:r>
+              <w:rPr>
+                <w:sz w:val="20"/>
+                <w:szCs w:val="20"/>
+                <w:rtl w:val="1"/>
+              </w:rPr>
+            </w:r>
+            <w:r>
+              <w:rPr>
+                <w:sz w:val="20"/>
+                <w:szCs w:val="20"/>
+                <w:rtl w:val="1"/>
+              </w:rPr>
+            </w:r>
+            <w:r>
+              <w:rPr>
+                <w:sz w:val="20"/>
+                <w:szCs w:val="20"/>
+                <w:rtl w:val="1"/>
+              </w:rPr>
+            </w:r>
+            <w:r>
+              <w:rPr>
+                <w:rtl w:val="0"/>
+              </w:rPr>
+            </w:r>
+          </w:p>
+        </w:tc>
+        <w:tc>
+          <w:tcPr>
+            <w:tcMar>
+              <w:top w:w="60.0" w:type="dxa"/>
+              <w:left w:w="100.0" w:type="dxa"/>
+              <w:bottom w:w="60.0" w:type="dxa"/>
+              <w:right w:w="100.0" w:type="dxa"/>
+            </w:tcMar>
+          </w:tcPr>
+          <w:p>
+            <w:pPr>
+              <w:bidi w:val="1"/>
+              <w:rPr/>
+            </w:pPr>
+            <w:r>
+              <w:rPr>
+                <w:sz w:val="20"/>
+                <w:szCs w:val="20"/>
+                <w:rtl w:val="1"/>
+              </w:rPr>
+              <w:t>בינונית</w:t>
+            </w:r>
+            <w:r>
+              <w:rPr>
+                <w:rtl w:val="0"/>
+              </w:rPr>
+            </w:r>
+          </w:p>
+        </w:tc>
+        <w:tc>
+          <w:tcPr>
+            <w:tcMar>
+              <w:top w:w="60.0" w:type="dxa"/>
+              <w:left w:w="100.0" w:type="dxa"/>
+              <w:bottom w:w="60.0" w:type="dxa"/>
+              <w:right w:w="100.0" w:type="dxa"/>
+            </w:tcMar>
+          </w:tcPr>
+          <w:p>
+            <w:pPr>
+              <w:bidi w:val="1"/>
+              <w:rPr/>
+            </w:pPr>
+            <w:r>
+              <w:rPr>
+                <w:sz w:val="20"/>
+                <w:szCs w:val="20"/>
+                <w:rtl w:val="1"/>
+              </w:rPr>
+              <w:t>גבוהה</w:t>
+            </w:r>
+            <w:r>
+              <w:rPr>
+                <w:rtl w:val="0"/>
+              </w:rPr>
+            </w:r>
+          </w:p>
+        </w:tc>
+        <w:tc>
+          <w:tcPr>
+            <w:tcMar>
+              <w:top w:w="60.0" w:type="dxa"/>
+              <w:left w:w="100.0" w:type="dxa"/>
+              <w:bottom w:w="60.0" w:type="dxa"/>
+              <w:right w:w="100.0" w:type="dxa"/>
+            </w:tcMar>
+          </w:tcPr>
+          <w:p>
+            <w:pPr>
+              <w:bidi w:val="1"/>
+              <w:rPr/>
+            </w:pPr>
+            <w:r>
+              <w:rPr>
+                <w:sz w:val="20"/>
+                <w:szCs w:val="20"/>
+                <w:rtl w:val="1"/>
+              </w:rPr>
+              <w:t>משתמש משני (מנהל)</w:t>
+            </w:r>
+            <w:r>
+              <w:rPr>
+                <w:sz w:val="20"/>
+                <w:szCs w:val="20"/>
+                <w:rtl w:val="1"/>
+              </w:rPr>
+            </w:r>
+            <w:r>
+              <w:rPr>
+                <w:sz w:val="20"/>
+                <w:szCs w:val="20"/>
+                <w:rtl w:val="1"/>
+              </w:rPr>
+            </w:r>
+            <w:r>
+              <w:rPr>
+                <w:sz w:val="20"/>
+                <w:szCs w:val="20"/>
+                <w:rtl w:val="1"/>
+              </w:rPr>
+            </w:r>
+            <w:r>
+              <w:rPr>
+                <w:sz w:val="20"/>
+                <w:szCs w:val="20"/>
+                <w:rtl w:val="1"/>
+              </w:rPr>
+            </w:r>
+            <w:r>
+              <w:rPr>
+                <w:sz w:val="20"/>
+                <w:szCs w:val="20"/>
+                <w:rtl w:val="1"/>
+              </w:rPr>
+            </w:r>
+            <w:r>
+              <w:rPr>
+                <w:sz w:val="20"/>
+                <w:szCs w:val="20"/>
+                <w:rtl w:val="1"/>
+              </w:rPr>
+            </w:r>
+            <w:r>
+              <w:rPr>
+                <w:sz w:val="20"/>
+                <w:szCs w:val="20"/>
+                <w:rtl w:val="1"/>
+              </w:rPr>
+            </w:r>
+            <w:r>
+              <w:rPr>
+                <w:sz w:val="20"/>
+                <w:szCs w:val="20"/>
+                <w:rtl w:val="1"/>
+              </w:rPr>
+            </w:r>
+            <w:r>
+              <w:rPr>
+                <w:sz w:val="20"/>
+                <w:szCs w:val="20"/>
+                <w:rtl w:val="1"/>
+              </w:rPr>
+            </w:r>
+            <w:r>
+              <w:rPr>
+                <w:rtl w:val="0"/>
+              </w:rPr>
+            </w:r>
+          </w:p>
+        </w:tc>
+        <w:tc>
+          <w:tcPr>
+            <w:tcMar>
+              <w:top w:w="60.0" w:type="dxa"/>
+              <w:left w:w="100.0" w:type="dxa"/>
+              <w:bottom w:w="60.0" w:type="dxa"/>
+              <w:right w:w="100.0" w:type="dxa"/>
+            </w:tcMar>
+          </w:tcPr>
+          <w:p>
+            <w:pPr>
+              <w:bidi w:val="1"/>
+              <w:rPr/>
+            </w:pPr>
+            <w:r>
+              <w:rPr>
+                <w:sz w:val="20"/>
+                <w:szCs w:val="20"/>
+                <w:rtl w:val="1"/>
+              </w:rPr>
+              <w:t>בעל העסק</w:t>
+            </w:r>
+            <w:r>
+              <w:rPr>
+                <w:rtl w:val="0"/>
+              </w:rPr>
+            </w:r>
+          </w:p>
+        </w:tc>
+      </w:tr>
     </w:tbl>
     <w:p>
       <w:pPr>
@@ -13388,431 +13792,362 @@
           <w:bCs w:val="1"/>
           <w:rtl w:val="1"/>
         </w:rPr>
-        <w:t xml:space="preserve">מטריצת</w:t>
-      </w:r>
-      <w:r>
-        <w:rPr>
-          <w:b w:val="1"/>
-          <w:bCs w:val="1"/>
-          <w:rtl w:val="1"/>
-        </w:rPr>
-        <w:t xml:space="preserve"> </w:t>
-      </w:r>
-      <w:r>
-        <w:rPr>
-          <w:b w:val="1"/>
-          <w:bCs w:val="1"/>
-          <w:rtl w:val="1"/>
-        </w:rPr>
-        <w:t xml:space="preserve">עוצמה</w:t>
-      </w:r>
-      <w:r>
-        <w:rPr>
-          <w:b w:val="1"/>
-          <w:bCs w:val="1"/>
-          <w:rtl w:val="1"/>
-        </w:rPr>
-        <w:t xml:space="preserve">-</w:t>
-      </w:r>
-      <w:r>
-        <w:rPr>
-          <w:b w:val="1"/>
-          <w:bCs w:val="1"/>
-          <w:rtl w:val="1"/>
-        </w:rPr>
-        <w:t xml:space="preserve">עניין</w:t>
-      </w:r>
-      <w:r>
-        <w:rPr>
-          <w:b w:val="1"/>
-          <w:bCs w:val="1"/>
-          <w:rtl w:val="1"/>
-        </w:rPr>
-        <w:t xml:space="preserve">: </w:t>
-      </w:r>
-      <w:r>
-        <w:rPr>
-          <w:rtl w:val="1"/>
-        </w:rPr>
-        <w:t xml:space="preserve">שני</w:t>
-      </w:r>
-      <w:r>
-        <w:rPr>
-          <w:rtl w:val="1"/>
-        </w:rPr>
-        <w:t xml:space="preserve"> </w:t>
-      </w:r>
-      <w:r>
-        <w:rPr>
-          <w:rtl w:val="1"/>
-        </w:rPr>
-        <w:t xml:space="preserve">בעלי</w:t>
-      </w:r>
-      <w:r>
-        <w:rPr>
-          <w:rtl w:val="1"/>
-        </w:rPr>
-        <w:t xml:space="preserve"> </w:t>
-      </w:r>
-      <w:r>
-        <w:rPr>
-          <w:rtl w:val="1"/>
-        </w:rPr>
-        <w:t xml:space="preserve">העניין</w:t>
-      </w:r>
-      <w:r>
-        <w:rPr>
-          <w:rtl w:val="1"/>
-        </w:rPr>
-        <w:t xml:space="preserve"> </w:t>
-      </w:r>
-      <w:r>
-        <w:rPr>
-          <w:rtl w:val="1"/>
-        </w:rPr>
-        <w:t xml:space="preserve">נמצאים</w:t>
-      </w:r>
-      <w:r>
-        <w:rPr>
-          <w:rtl w:val="1"/>
-        </w:rPr>
-        <w:t xml:space="preserve"> </w:t>
-      </w:r>
-      <w:r>
-        <w:rPr>
-          <w:rtl w:val="1"/>
-        </w:rPr>
-        <w:t xml:space="preserve">בעניין</w:t>
-      </w:r>
-      <w:r>
-        <w:rPr>
-          <w:rtl w:val="1"/>
-        </w:rPr>
-        <w:t xml:space="preserve"> </w:t>
-      </w:r>
-      <w:r>
-        <w:rPr>
-          <w:rtl w:val="1"/>
-        </w:rPr>
-        <w:t xml:space="preserve">גבוה</w:t>
-      </w:r>
-      <w:r>
-        <w:rPr>
-          <w:rtl w:val="1"/>
-        </w:rPr>
-        <w:t xml:space="preserve">. </w:t>
-      </w:r>
-      <w:r>
-        <w:rPr>
-          <w:rtl w:val="1"/>
-        </w:rPr>
-        <w:t xml:space="preserve">המאמן</w:t>
-      </w:r>
-      <w:r>
-        <w:rPr>
-          <w:rtl w:val="1"/>
-        </w:rPr>
-        <w:t xml:space="preserve"> </w:t>
-      </w:r>
-      <w:r>
-        <w:rPr>
-          <w:rtl w:val="1"/>
-        </w:rPr>
-        <w:t xml:space="preserve">האישי</w:t>
-      </w:r>
-      <w:r>
-        <w:rPr>
-          <w:rtl w:val="1"/>
-        </w:rPr>
-        <w:t xml:space="preserve"> — </w:t>
-      </w:r>
-      <w:r>
-        <w:rPr>
-          <w:rtl w:val="1"/>
-        </w:rPr>
-        <w:t xml:space="preserve">עוצמת</w:t>
-      </w:r>
-      <w:r>
-        <w:rPr>
-          <w:rtl w:val="1"/>
-        </w:rPr>
-        <w:t xml:space="preserve"> </w:t>
-      </w:r>
-      <w:r>
-        <w:rPr>
-          <w:rtl w:val="1"/>
-        </w:rPr>
-        <w:t xml:space="preserve">השפעה</w:t>
-      </w:r>
-      <w:r>
-        <w:rPr>
-          <w:rtl w:val="1"/>
-        </w:rPr>
-        <w:t xml:space="preserve"> </w:t>
-      </w:r>
-      <w:r>
-        <w:rPr>
-          <w:rtl w:val="1"/>
-        </w:rPr>
-        <w:t xml:space="preserve">גבוהה</w:t>
-      </w:r>
-      <w:r>
-        <w:rPr>
-          <w:rtl w:val="1"/>
-        </w:rPr>
-        <w:t xml:space="preserve">, </w:t>
-      </w:r>
-      <w:r>
-        <w:rPr>
-          <w:rtl w:val="1"/>
-        </w:rPr>
-        <w:t xml:space="preserve">יש</w:t>
-      </w:r>
-      <w:r>
-        <w:rPr>
-          <w:rtl w:val="1"/>
-        </w:rPr>
-        <w:t xml:space="preserve"> </w:t>
-      </w:r>
-      <w:r>
-        <w:rPr>
-          <w:rtl w:val="1"/>
-        </w:rPr>
-        <w:t xml:space="preserve">לנהל</w:t>
-      </w:r>
-      <w:r>
-        <w:rPr>
-          <w:rtl w:val="1"/>
-        </w:rPr>
-        <w:t xml:space="preserve"> </w:t>
-      </w:r>
-      <w:r>
-        <w:rPr>
-          <w:rtl w:val="1"/>
-        </w:rPr>
-        <w:t xml:space="preserve">אותו</w:t>
-      </w:r>
-      <w:r>
-        <w:rPr>
-          <w:rtl w:val="1"/>
-        </w:rPr>
-        <w:t xml:space="preserve"> </w:t>
-      </w:r>
-      <w:r>
-        <w:rPr>
-          <w:rtl w:val="1"/>
-        </w:rPr>
-        <w:t xml:space="preserve">בקפידה</w:t>
-      </w:r>
-      <w:r>
-        <w:rPr>
-          <w:rtl w:val="1"/>
-        </w:rPr>
-        <w:t xml:space="preserve"> </w:t>
-      </w:r>
-      <w:r>
-        <w:rPr>
-          <w:rtl w:val="1"/>
-        </w:rPr>
-        <w:t xml:space="preserve">עם</w:t>
-      </w:r>
-      <w:r>
-        <w:rPr>
-          <w:rtl w:val="1"/>
-        </w:rPr>
-        <w:t xml:space="preserve"> </w:t>
-      </w:r>
-      <w:r>
-        <w:rPr>
-          <w:rtl w:val="1"/>
-        </w:rPr>
-        <w:t xml:space="preserve">עדכונים</w:t>
-      </w:r>
-      <w:r>
-        <w:rPr>
-          <w:rtl w:val="1"/>
-        </w:rPr>
-        <w:t xml:space="preserve"> </w:t>
-      </w:r>
-      <w:r>
-        <w:rPr>
-          <w:rtl w:val="1"/>
-        </w:rPr>
-        <w:t xml:space="preserve">תכופים</w:t>
-      </w:r>
-      <w:r>
-        <w:rPr>
-          <w:rtl w:val="1"/>
-        </w:rPr>
-        <w:t xml:space="preserve">. </w:t>
-      </w:r>
-      <w:r>
-        <w:rPr>
-          <w:rtl w:val="1"/>
-        </w:rPr>
-        <w:t xml:space="preserve">המתאמן</w:t>
-      </w:r>
-      <w:r>
-        <w:rPr>
-          <w:rtl w:val="1"/>
-        </w:rPr>
-        <w:t xml:space="preserve"> — </w:t>
-      </w:r>
-      <w:r>
-        <w:rPr>
-          <w:rtl w:val="1"/>
-        </w:rPr>
-        <w:t xml:space="preserve">עוצמת</w:t>
-      </w:r>
-      <w:r>
-        <w:rPr>
-          <w:rtl w:val="1"/>
-        </w:rPr>
-        <w:t xml:space="preserve"> </w:t>
-      </w:r>
-      <w:r>
-        <w:rPr>
-          <w:rtl w:val="1"/>
-        </w:rPr>
-        <w:t xml:space="preserve">השפעה</w:t>
-      </w:r>
-      <w:r>
-        <w:rPr>
-          <w:rtl w:val="1"/>
-        </w:rPr>
-        <w:t xml:space="preserve"> </w:t>
-      </w:r>
-      <w:r>
-        <w:rPr>
-          <w:rtl w:val="1"/>
-        </w:rPr>
-        <w:t xml:space="preserve">נמוכה</w:t>
-      </w:r>
-      <w:r>
-        <w:rPr>
-          <w:rtl w:val="1"/>
-        </w:rPr>
-        <w:t xml:space="preserve">, </w:t>
-      </w:r>
-      <w:r>
-        <w:rPr>
-          <w:rtl w:val="1"/>
-        </w:rPr>
-        <w:t xml:space="preserve">יש</w:t>
-      </w:r>
-      <w:r>
-        <w:rPr>
-          <w:rtl w:val="1"/>
-        </w:rPr>
-        <w:t xml:space="preserve"> </w:t>
-      </w:r>
-      <w:r>
-        <w:rPr>
-          <w:rtl w:val="1"/>
-        </w:rPr>
-        <w:t xml:space="preserve">לענות</w:t>
-      </w:r>
-      <w:r>
-        <w:rPr>
-          <w:rtl w:val="1"/>
-        </w:rPr>
-        <w:t xml:space="preserve"> </w:t>
-      </w:r>
-      <w:r>
-        <w:rPr>
-          <w:rtl w:val="1"/>
-        </w:rPr>
-        <w:t xml:space="preserve">לשאלותיו</w:t>
-      </w:r>
-      <w:r>
-        <w:rPr>
-          <w:rtl w:val="1"/>
-        </w:rPr>
-        <w:t xml:space="preserve"> </w:t>
-      </w:r>
-      <w:r>
-        <w:rPr>
-          <w:rtl w:val="1"/>
-        </w:rPr>
-        <w:t xml:space="preserve">ולעדכן</w:t>
-      </w:r>
-      <w:r>
-        <w:rPr>
-          <w:rtl w:val="1"/>
-        </w:rPr>
-        <w:t xml:space="preserve"> </w:t>
-      </w:r>
-      <w:r>
-        <w:rPr>
-          <w:rtl w:val="1"/>
-        </w:rPr>
-        <w:t xml:space="preserve">אותו</w:t>
-      </w:r>
-      <w:r>
-        <w:rPr>
-          <w:rtl w:val="1"/>
-        </w:rPr>
-        <w:t xml:space="preserve"> </w:t>
-      </w:r>
-      <w:r>
-        <w:rPr>
-          <w:rtl w:val="1"/>
-        </w:rPr>
-        <w:t xml:space="preserve">דרך</w:t>
-      </w:r>
-      <w:r>
-        <w:rPr>
-          <w:rtl w:val="1"/>
-        </w:rPr>
-        <w:t xml:space="preserve"> </w:t>
-      </w:r>
-      <w:r>
-        <w:rPr>
-          <w:rtl w:val="1"/>
-        </w:rPr>
-        <w:t xml:space="preserve">המאמן</w:t>
-      </w:r>
-      <w:r>
-        <w:rPr>
-          <w:rtl w:val="1"/>
-        </w:rPr>
-        <w:t xml:space="preserve"> </w:t>
-      </w:r>
-      <w:r>
-        <w:rPr>
-          <w:rtl w:val="1"/>
-        </w:rPr>
-        <w:t xml:space="preserve">ו</w:t>
-      </w:r>
-      <w:r>
-        <w:rPr>
-          <w:rtl w:val="1"/>
-        </w:rPr>
-        <w:t xml:space="preserve">/</w:t>
-      </w:r>
-      <w:r>
-        <w:rPr>
-          <w:rtl w:val="1"/>
-        </w:rPr>
-        <w:t xml:space="preserve">או</w:t>
-      </w:r>
-      <w:r>
-        <w:rPr>
-          <w:rtl w:val="1"/>
-        </w:rPr>
-        <w:t xml:space="preserve"> </w:t>
-      </w:r>
-      <w:r>
-        <w:rPr>
-          <w:rtl w:val="1"/>
-        </w:rPr>
-        <w:t xml:space="preserve">פושים</w:t>
-      </w:r>
-      <w:r>
-        <w:rPr>
-          <w:rtl w:val="1"/>
-        </w:rPr>
-        <w:t xml:space="preserve">.</w:t>
+        <w:t>מטריצת עוצמה-עניין: המאמן האישי — עוצמת השפעה גבוהה ועניין גבוה, יש לנהל אותו בקפידה עם עדכונים תכופים. בעל העסק — עוצמת השפעה גבוהה (משלם) ועניין בינוני, יש לשמור על שביעות רצונו ולעדכן אותו תקופתית. המתאמן — עוצמת השפעה נמוכה ועניין גבוה, יש לענות לשאלותיו ולעדכן אותו דרך המאמן ו/או פושים.</w:t>
+      </w:r>
+      <w:r>
+        <w:rPr>
+          <w:b w:val="1"/>
+          <w:bCs w:val="1"/>
+          <w:rtl w:val="1"/>
+        </w:rPr>
+      </w:r>
+      <w:r>
+        <w:rPr>
+          <w:b w:val="1"/>
+          <w:bCs w:val="1"/>
+          <w:rtl w:val="1"/>
+        </w:rPr>
+      </w:r>
+      <w:r>
+        <w:rPr>
+          <w:b w:val="1"/>
+          <w:bCs w:val="1"/>
+          <w:rtl w:val="1"/>
+        </w:rPr>
+      </w:r>
+      <w:r>
+        <w:rPr>
+          <w:b w:val="1"/>
+          <w:bCs w:val="1"/>
+          <w:rtl w:val="1"/>
+        </w:rPr>
+      </w:r>
+      <w:r>
+        <w:rPr>
+          <w:b w:val="1"/>
+          <w:bCs w:val="1"/>
+          <w:rtl w:val="1"/>
+        </w:rPr>
+      </w:r>
+      <w:r>
+        <w:rPr>
+          <w:rtl w:val="1"/>
+        </w:rPr>
+      </w:r>
+      <w:r>
+        <w:rPr>
+          <w:rtl w:val="1"/>
+        </w:rPr>
+      </w:r>
+      <w:r>
+        <w:rPr>
+          <w:rtl w:val="1"/>
+        </w:rPr>
+      </w:r>
+      <w:r>
+        <w:rPr>
+          <w:rtl w:val="1"/>
+        </w:rPr>
+      </w:r>
+      <w:r>
+        <w:rPr>
+          <w:rtl w:val="1"/>
+        </w:rPr>
+      </w:r>
+      <w:r>
+        <w:rPr>
+          <w:rtl w:val="1"/>
+        </w:rPr>
+      </w:r>
+      <w:r>
+        <w:rPr>
+          <w:rtl w:val="1"/>
+        </w:rPr>
+      </w:r>
+      <w:r>
+        <w:rPr>
+          <w:rtl w:val="1"/>
+        </w:rPr>
+      </w:r>
+      <w:r>
+        <w:rPr>
+          <w:rtl w:val="1"/>
+        </w:rPr>
+      </w:r>
+      <w:r>
+        <w:rPr>
+          <w:rtl w:val="1"/>
+        </w:rPr>
+      </w:r>
+      <w:r>
+        <w:rPr>
+          <w:rtl w:val="1"/>
+        </w:rPr>
+      </w:r>
+      <w:r>
+        <w:rPr>
+          <w:rtl w:val="1"/>
+        </w:rPr>
+      </w:r>
+      <w:r>
+        <w:rPr>
+          <w:rtl w:val="1"/>
+        </w:rPr>
+      </w:r>
+      <w:r>
+        <w:rPr>
+          <w:rtl w:val="1"/>
+        </w:rPr>
+      </w:r>
+      <w:r>
+        <w:rPr>
+          <w:rtl w:val="1"/>
+        </w:rPr>
+      </w:r>
+      <w:r>
+        <w:rPr>
+          <w:rtl w:val="1"/>
+        </w:rPr>
+      </w:r>
+      <w:r>
+        <w:rPr>
+          <w:rtl w:val="1"/>
+        </w:rPr>
+      </w:r>
+      <w:r>
+        <w:rPr>
+          <w:rtl w:val="1"/>
+        </w:rPr>
+      </w:r>
+      <w:r>
+        <w:rPr>
+          <w:rtl w:val="1"/>
+        </w:rPr>
+      </w:r>
+      <w:r>
+        <w:rPr>
+          <w:rtl w:val="1"/>
+        </w:rPr>
+      </w:r>
+      <w:r>
+        <w:rPr>
+          <w:rtl w:val="1"/>
+        </w:rPr>
+      </w:r>
+      <w:r>
+        <w:rPr>
+          <w:rtl w:val="1"/>
+        </w:rPr>
+      </w:r>
+      <w:r>
+        <w:rPr>
+          <w:rtl w:val="1"/>
+        </w:rPr>
+      </w:r>
+      <w:r>
+        <w:rPr>
+          <w:rtl w:val="1"/>
+        </w:rPr>
+      </w:r>
+      <w:r>
+        <w:rPr>
+          <w:rtl w:val="1"/>
+        </w:rPr>
+      </w:r>
+      <w:r>
+        <w:rPr>
+          <w:rtl w:val="1"/>
+        </w:rPr>
+      </w:r>
+      <w:r>
+        <w:rPr>
+          <w:rtl w:val="1"/>
+        </w:rPr>
+      </w:r>
+      <w:r>
+        <w:rPr>
+          <w:rtl w:val="1"/>
+        </w:rPr>
+      </w:r>
+      <w:r>
+        <w:rPr>
+          <w:rtl w:val="1"/>
+        </w:rPr>
+      </w:r>
+      <w:r>
+        <w:rPr>
+          <w:rtl w:val="1"/>
+        </w:rPr>
+      </w:r>
+      <w:r>
+        <w:rPr>
+          <w:rtl w:val="1"/>
+        </w:rPr>
+      </w:r>
+      <w:r>
+        <w:rPr>
+          <w:rtl w:val="1"/>
+        </w:rPr>
+      </w:r>
+      <w:r>
+        <w:rPr>
+          <w:rtl w:val="1"/>
+        </w:rPr>
+      </w:r>
+      <w:r>
+        <w:rPr>
+          <w:rtl w:val="1"/>
+        </w:rPr>
+      </w:r>
+      <w:r>
+        <w:rPr>
+          <w:rtl w:val="1"/>
+        </w:rPr>
+      </w:r>
+      <w:r>
+        <w:rPr>
+          <w:rtl w:val="1"/>
+        </w:rPr>
+      </w:r>
+      <w:r>
+        <w:rPr>
+          <w:rtl w:val="1"/>
+        </w:rPr>
+      </w:r>
+      <w:r>
+        <w:rPr>
+          <w:rtl w:val="1"/>
+        </w:rPr>
+      </w:r>
+      <w:r>
+        <w:rPr>
+          <w:rtl w:val="1"/>
+        </w:rPr>
+      </w:r>
+      <w:r>
+        <w:rPr>
+          <w:rtl w:val="1"/>
+        </w:rPr>
+      </w:r>
+      <w:r>
+        <w:rPr>
+          <w:rtl w:val="1"/>
+        </w:rPr>
+      </w:r>
+      <w:r>
+        <w:rPr>
+          <w:rtl w:val="1"/>
+        </w:rPr>
+      </w:r>
+      <w:r>
+        <w:rPr>
+          <w:rtl w:val="1"/>
+        </w:rPr>
+      </w:r>
+      <w:r>
+        <w:rPr>
+          <w:rtl w:val="1"/>
+        </w:rPr>
+      </w:r>
+      <w:r>
+        <w:rPr>
+          <w:rtl w:val="1"/>
+        </w:rPr>
+      </w:r>
+      <w:r>
+        <w:rPr>
+          <w:rtl w:val="1"/>
+        </w:rPr>
+      </w:r>
+      <w:r>
+        <w:rPr>
+          <w:rtl w:val="1"/>
+        </w:rPr>
+      </w:r>
+      <w:r>
+        <w:rPr>
+          <w:rtl w:val="1"/>
+        </w:rPr>
+      </w:r>
+      <w:r>
+        <w:rPr>
+          <w:rtl w:val="1"/>
+        </w:rPr>
+      </w:r>
+      <w:r>
+        <w:rPr>
+          <w:rtl w:val="1"/>
+        </w:rPr>
+      </w:r>
+      <w:r>
+        <w:rPr>
+          <w:rtl w:val="1"/>
+        </w:rPr>
+      </w:r>
+      <w:r>
+        <w:rPr>
+          <w:rtl w:val="1"/>
+        </w:rPr>
+      </w:r>
+      <w:r>
+        <w:rPr>
+          <w:rtl w:val="1"/>
+        </w:rPr>
+      </w:r>
+      <w:r>
+        <w:rPr>
+          <w:rtl w:val="1"/>
+        </w:rPr>
+      </w:r>
+      <w:r>
+        <w:rPr>
+          <w:rtl w:val="1"/>
+        </w:rPr>
+      </w:r>
+      <w:r>
+        <w:rPr>
+          <w:rtl w:val="1"/>
+        </w:rPr>
+      </w:r>
+      <w:r>
+        <w:rPr>
+          <w:rtl w:val="1"/>
+        </w:rPr>
+      </w:r>
+      <w:r>
+        <w:rPr>
+          <w:rtl w:val="1"/>
+        </w:rPr>
+      </w:r>
+      <w:r>
+        <w:rPr>
+          <w:rtl w:val="1"/>
+        </w:rPr>
+      </w:r>
+      <w:r>
+        <w:rPr>
+          <w:rtl w:val="1"/>
+        </w:rPr>
+      </w:r>
+      <w:r>
+        <w:rPr>
+          <w:rtl w:val="1"/>
+        </w:rPr>
+      </w:r>
+      <w:r>
+        <w:rPr>
+          <w:rtl w:val="1"/>
+        </w:rPr>
+      </w:r>
+      <w:r>
+        <w:rPr>
+          <w:rtl w:val="1"/>
+        </w:rPr>
+      </w:r>
+      <w:r>
+        <w:rPr>
+          <w:rtl w:val="1"/>
+        </w:rPr>
       </w:r>
     </w:p>
     <w:p>
@@ -13827,287 +14162,242 @@
           <w:bCs w:val="1"/>
           <w:rtl w:val="1"/>
         </w:rPr>
-        <w:t xml:space="preserve">הערה</w:t>
-      </w:r>
-      <w:r>
-        <w:rPr>
-          <w:b w:val="1"/>
-          <w:bCs w:val="1"/>
-          <w:rtl w:val="1"/>
-        </w:rPr>
-        <w:t xml:space="preserve"> </w:t>
-      </w:r>
-      <w:r>
-        <w:rPr>
-          <w:b w:val="1"/>
-          <w:bCs w:val="1"/>
-          <w:rtl w:val="1"/>
-        </w:rPr>
-        <w:t xml:space="preserve">מהמסמך</w:t>
-      </w:r>
-      <w:r>
-        <w:rPr>
-          <w:b w:val="1"/>
-          <w:bCs w:val="1"/>
-          <w:rtl w:val="1"/>
-        </w:rPr>
-        <w:t xml:space="preserve"> </w:t>
-      </w:r>
-      <w:r>
-        <w:rPr>
-          <w:b w:val="1"/>
-          <w:bCs w:val="1"/>
-          <w:rtl w:val="1"/>
-        </w:rPr>
-        <w:t xml:space="preserve">המקורי</w:t>
-      </w:r>
-      <w:r>
-        <w:rPr>
-          <w:b w:val="1"/>
-          <w:bCs w:val="1"/>
-          <w:rtl w:val="1"/>
-        </w:rPr>
-        <w:t xml:space="preserve">: </w:t>
-      </w:r>
-      <w:r>
-        <w:rPr>
-          <w:rtl w:val="1"/>
-        </w:rPr>
-        <w:t xml:space="preserve">הכותרת</w:t>
-      </w:r>
-      <w:r>
-        <w:rPr>
-          <w:rtl w:val="1"/>
-        </w:rPr>
-        <w:t xml:space="preserve"> </w:t>
-      </w:r>
-      <w:r>
-        <w:rPr>
-          <w:rtl w:val="1"/>
-        </w:rPr>
-        <w:t xml:space="preserve">ציינה</w:t>
-      </w:r>
-      <w:r>
-        <w:rPr>
-          <w:rtl w:val="1"/>
-        </w:rPr>
-        <w:t xml:space="preserve"> "</w:t>
-      </w:r>
-      <w:r>
-        <w:rPr>
-          <w:rtl w:val="1"/>
-        </w:rPr>
-        <w:t xml:space="preserve">שלושת</w:t>
-      </w:r>
-      <w:r>
-        <w:rPr>
-          <w:rtl w:val="1"/>
-        </w:rPr>
-        <w:t xml:space="preserve"> </w:t>
-      </w:r>
-      <w:r>
-        <w:rPr>
-          <w:rtl w:val="1"/>
-        </w:rPr>
-        <w:t xml:space="preserve">בעלי</w:t>
-      </w:r>
-      <w:r>
-        <w:rPr>
-          <w:rtl w:val="1"/>
-        </w:rPr>
-        <w:t xml:space="preserve"> </w:t>
-      </w:r>
-      <w:r>
-        <w:rPr>
-          <w:rtl w:val="1"/>
-        </w:rPr>
-        <w:t xml:space="preserve">העניין</w:t>
-      </w:r>
-      <w:r>
-        <w:rPr>
-          <w:rtl w:val="1"/>
-        </w:rPr>
-        <w:t xml:space="preserve"> </w:t>
-      </w:r>
-      <w:r>
-        <w:rPr>
-          <w:rtl w:val="1"/>
-        </w:rPr>
-        <w:t xml:space="preserve">המרכזיים</w:t>
-      </w:r>
-      <w:r>
-        <w:rPr>
-          <w:rtl w:val="1"/>
-        </w:rPr>
-        <w:t xml:space="preserve">", </w:t>
-      </w:r>
-      <w:r>
-        <w:rPr>
-          <w:rtl w:val="1"/>
-        </w:rPr>
-        <w:t xml:space="preserve">אך</w:t>
-      </w:r>
-      <w:r>
-        <w:rPr>
-          <w:rtl w:val="1"/>
-        </w:rPr>
-        <w:t xml:space="preserve"> </w:t>
-      </w:r>
-      <w:r>
-        <w:rPr>
-          <w:rtl w:val="1"/>
-        </w:rPr>
-        <w:t xml:space="preserve">בפועל</w:t>
-      </w:r>
-      <w:r>
-        <w:rPr>
-          <w:rtl w:val="1"/>
-        </w:rPr>
-        <w:t xml:space="preserve"> </w:t>
-      </w:r>
-      <w:r>
-        <w:rPr>
-          <w:rtl w:val="1"/>
-        </w:rPr>
-        <w:t xml:space="preserve">תועדו</w:t>
-      </w:r>
-      <w:r>
-        <w:rPr>
-          <w:rtl w:val="1"/>
-        </w:rPr>
-        <w:t xml:space="preserve"> </w:t>
-      </w:r>
-      <w:r>
-        <w:rPr>
-          <w:rtl w:val="1"/>
-        </w:rPr>
-        <w:t xml:space="preserve">רק</w:t>
-      </w:r>
-      <w:r>
-        <w:rPr>
-          <w:rtl w:val="1"/>
-        </w:rPr>
-        <w:t xml:space="preserve"> </w:t>
-      </w:r>
-      <w:r>
-        <w:rPr>
-          <w:rtl w:val="1"/>
-        </w:rPr>
-        <w:t xml:space="preserve">שני</w:t>
-      </w:r>
-      <w:r>
-        <w:rPr>
-          <w:rtl w:val="1"/>
-        </w:rPr>
-        <w:t xml:space="preserve"> </w:t>
-      </w:r>
-      <w:r>
-        <w:rPr>
-          <w:rtl w:val="1"/>
-        </w:rPr>
-        <w:t xml:space="preserve">בעלי</w:t>
-      </w:r>
-      <w:r>
-        <w:rPr>
-          <w:rtl w:val="1"/>
-        </w:rPr>
-        <w:t xml:space="preserve"> </w:t>
-      </w:r>
-      <w:r>
-        <w:rPr>
-          <w:rtl w:val="1"/>
-        </w:rPr>
-        <w:t xml:space="preserve">עניין</w:t>
-      </w:r>
-      <w:r>
-        <w:rPr>
-          <w:rtl w:val="1"/>
-        </w:rPr>
-        <w:t xml:space="preserve">. </w:t>
-      </w:r>
-      <w:r>
-        <w:rPr>
-          <w:rtl w:val="1"/>
-        </w:rPr>
-        <w:t xml:space="preserve">אם</w:t>
-      </w:r>
-      <w:r>
-        <w:rPr>
-          <w:rtl w:val="1"/>
-        </w:rPr>
-        <w:t xml:space="preserve"> </w:t>
-      </w:r>
-      <w:r>
-        <w:rPr>
-          <w:rtl w:val="1"/>
-        </w:rPr>
-        <w:t xml:space="preserve">קיים</w:t>
-      </w:r>
-      <w:r>
-        <w:rPr>
-          <w:rtl w:val="1"/>
-        </w:rPr>
-        <w:t xml:space="preserve"> </w:t>
-      </w:r>
-      <w:r>
-        <w:rPr>
-          <w:rtl w:val="1"/>
-        </w:rPr>
-        <w:t xml:space="preserve">בעל</w:t>
-      </w:r>
-      <w:r>
-        <w:rPr>
-          <w:rtl w:val="1"/>
-        </w:rPr>
-        <w:t xml:space="preserve"> </w:t>
-      </w:r>
-      <w:r>
-        <w:rPr>
-          <w:rtl w:val="1"/>
-        </w:rPr>
-        <w:t xml:space="preserve">עניין</w:t>
-      </w:r>
-      <w:r>
-        <w:rPr>
-          <w:rtl w:val="1"/>
-        </w:rPr>
-        <w:t xml:space="preserve"> </w:t>
-      </w:r>
-      <w:r>
-        <w:rPr>
-          <w:rtl w:val="1"/>
-        </w:rPr>
-        <w:t xml:space="preserve">שלישי</w:t>
-      </w:r>
-      <w:r>
-        <w:rPr>
-          <w:rtl w:val="1"/>
-        </w:rPr>
-        <w:t xml:space="preserve"> — </w:t>
-      </w:r>
-      <w:r>
-        <w:rPr>
-          <w:rtl w:val="1"/>
-        </w:rPr>
-        <w:t xml:space="preserve">יש</w:t>
-      </w:r>
-      <w:r>
-        <w:rPr>
-          <w:rtl w:val="1"/>
-        </w:rPr>
-        <w:t xml:space="preserve"> </w:t>
-      </w:r>
-      <w:r>
-        <w:rPr>
-          <w:rtl w:val="1"/>
-        </w:rPr>
-        <w:t xml:space="preserve">להשלים</w:t>
-      </w:r>
-      <w:r>
-        <w:rPr>
-          <w:rtl w:val="1"/>
-        </w:rPr>
-        <w:t xml:space="preserve">.</w:t>
+        <w:t>בעל העניין השלישי: בעל העסק (בעלים של סטודיו או חדר כושר עם כמה מאמנים, או מאמן עצמאי שהוא העסק כולו), נוסף בהכרעת הצוות מ-30.09.2026. בזה נסגרה ההערה שהכותרת ציינה שלושה בעלי עניין ותועדו שניים.</w:t>
+      </w:r>
+      <w:r>
+        <w:rPr>
+          <w:b w:val="1"/>
+          <w:bCs w:val="1"/>
+          <w:rtl w:val="1"/>
+        </w:rPr>
+      </w:r>
+      <w:r>
+        <w:rPr>
+          <w:b w:val="1"/>
+          <w:bCs w:val="1"/>
+          <w:rtl w:val="1"/>
+        </w:rPr>
+      </w:r>
+      <w:r>
+        <w:rPr>
+          <w:b w:val="1"/>
+          <w:bCs w:val="1"/>
+          <w:rtl w:val="1"/>
+        </w:rPr>
+      </w:r>
+      <w:r>
+        <w:rPr>
+          <w:b w:val="1"/>
+          <w:bCs w:val="1"/>
+          <w:rtl w:val="1"/>
+        </w:rPr>
+      </w:r>
+      <w:r>
+        <w:rPr>
+          <w:b w:val="1"/>
+          <w:bCs w:val="1"/>
+          <w:rtl w:val="1"/>
+        </w:rPr>
+      </w:r>
+      <w:r>
+        <w:rPr>
+          <w:rtl w:val="1"/>
+        </w:rPr>
+      </w:r>
+      <w:r>
+        <w:rPr>
+          <w:rtl w:val="1"/>
+        </w:rPr>
+      </w:r>
+      <w:r>
+        <w:rPr>
+          <w:rtl w:val="1"/>
+        </w:rPr>
+      </w:r>
+      <w:r>
+        <w:rPr>
+          <w:rtl w:val="1"/>
+        </w:rPr>
+      </w:r>
+      <w:r>
+        <w:rPr>
+          <w:rtl w:val="1"/>
+        </w:rPr>
+      </w:r>
+      <w:r>
+        <w:rPr>
+          <w:rtl w:val="1"/>
+        </w:rPr>
+      </w:r>
+      <w:r>
+        <w:rPr>
+          <w:rtl w:val="1"/>
+        </w:rPr>
+      </w:r>
+      <w:r>
+        <w:rPr>
+          <w:rtl w:val="1"/>
+        </w:rPr>
+      </w:r>
+      <w:r>
+        <w:rPr>
+          <w:rtl w:val="1"/>
+        </w:rPr>
+      </w:r>
+      <w:r>
+        <w:rPr>
+          <w:rtl w:val="1"/>
+        </w:rPr>
+      </w:r>
+      <w:r>
+        <w:rPr>
+          <w:rtl w:val="1"/>
+        </w:rPr>
+      </w:r>
+      <w:r>
+        <w:rPr>
+          <w:rtl w:val="1"/>
+        </w:rPr>
+      </w:r>
+      <w:r>
+        <w:rPr>
+          <w:rtl w:val="1"/>
+        </w:rPr>
+      </w:r>
+      <w:r>
+        <w:rPr>
+          <w:rtl w:val="1"/>
+        </w:rPr>
+      </w:r>
+      <w:r>
+        <w:rPr>
+          <w:rtl w:val="1"/>
+        </w:rPr>
+      </w:r>
+      <w:r>
+        <w:rPr>
+          <w:rtl w:val="1"/>
+        </w:rPr>
+      </w:r>
+      <w:r>
+        <w:rPr>
+          <w:rtl w:val="1"/>
+        </w:rPr>
+      </w:r>
+      <w:r>
+        <w:rPr>
+          <w:rtl w:val="1"/>
+        </w:rPr>
+      </w:r>
+      <w:r>
+        <w:rPr>
+          <w:rtl w:val="1"/>
+        </w:rPr>
+      </w:r>
+      <w:r>
+        <w:rPr>
+          <w:rtl w:val="1"/>
+        </w:rPr>
+      </w:r>
+      <w:r>
+        <w:rPr>
+          <w:rtl w:val="1"/>
+        </w:rPr>
+      </w:r>
+      <w:r>
+        <w:rPr>
+          <w:rtl w:val="1"/>
+        </w:rPr>
+      </w:r>
+      <w:r>
+        <w:rPr>
+          <w:rtl w:val="1"/>
+        </w:rPr>
+      </w:r>
+      <w:r>
+        <w:rPr>
+          <w:rtl w:val="1"/>
+        </w:rPr>
+      </w:r>
+      <w:r>
+        <w:rPr>
+          <w:rtl w:val="1"/>
+        </w:rPr>
+      </w:r>
+      <w:r>
+        <w:rPr>
+          <w:rtl w:val="1"/>
+        </w:rPr>
+      </w:r>
+      <w:r>
+        <w:rPr>
+          <w:rtl w:val="1"/>
+        </w:rPr>
+      </w:r>
+      <w:r>
+        <w:rPr>
+          <w:rtl w:val="1"/>
+        </w:rPr>
+      </w:r>
+      <w:r>
+        <w:rPr>
+          <w:rtl w:val="1"/>
+        </w:rPr>
+      </w:r>
+      <w:r>
+        <w:rPr>
+          <w:rtl w:val="1"/>
+        </w:rPr>
+      </w:r>
+      <w:r>
+        <w:rPr>
+          <w:rtl w:val="1"/>
+        </w:rPr>
+      </w:r>
+      <w:r>
+        <w:rPr>
+          <w:rtl w:val="1"/>
+        </w:rPr>
+      </w:r>
+      <w:r>
+        <w:rPr>
+          <w:rtl w:val="1"/>
+        </w:rPr>
+      </w:r>
+      <w:r>
+        <w:rPr>
+          <w:rtl w:val="1"/>
+        </w:rPr>
+      </w:r>
+      <w:r>
+        <w:rPr>
+          <w:rtl w:val="1"/>
+        </w:rPr>
+      </w:r>
+      <w:r>
+        <w:rPr>
+          <w:rtl w:val="1"/>
+        </w:rPr>
+      </w:r>
+      <w:r>
+        <w:rPr>
+          <w:rtl w:val="1"/>
+        </w:rPr>
+      </w:r>
+      <w:r>
+        <w:rPr>
+          <w:rtl w:val="1"/>
+        </w:rPr>
+      </w:r>
+      <w:r>
+        <w:rPr>
+          <w:rtl w:val="1"/>
+        </w:rPr>
+      </w:r>
+      <w:r>
+        <w:rPr>
+          <w:rtl w:val="1"/>
+        </w:rPr>
       </w:r>
     </w:p>
     <w:p>
@@ -14139,185 +14429,164 @@
           <w:iCs w:val="1"/>
           <w:rtl w:val="1"/>
         </w:rPr>
-        <w:t xml:space="preserve">שאלת</w:t>
-      </w:r>
-      <w:r>
-        <w:rPr>
-          <w:b w:val="1"/>
-          <w:bCs w:val="1"/>
-          <w:i w:val="1"/>
-          <w:iCs w:val="1"/>
-          <w:rtl w:val="1"/>
-        </w:rPr>
-        <w:t xml:space="preserve"> </w:t>
-      </w:r>
-      <w:r>
-        <w:rPr>
-          <w:b w:val="1"/>
-          <w:bCs w:val="1"/>
-          <w:i w:val="1"/>
-          <w:iCs w:val="1"/>
-          <w:rtl w:val="1"/>
-        </w:rPr>
-        <w:t xml:space="preserve">בדיקה</w:t>
-      </w:r>
-      <w:r>
-        <w:rPr>
-          <w:b w:val="1"/>
-          <w:bCs w:val="1"/>
-          <w:i w:val="1"/>
-          <w:iCs w:val="1"/>
-          <w:rtl w:val="1"/>
-        </w:rPr>
-        <w:t xml:space="preserve"> </w:t>
-      </w:r>
-      <w:r>
-        <w:rPr>
-          <w:b w:val="1"/>
-          <w:bCs w:val="1"/>
-          <w:i w:val="1"/>
-          <w:iCs w:val="1"/>
-          <w:rtl w:val="1"/>
-        </w:rPr>
-        <w:t xml:space="preserve">עצמית</w:t>
-      </w:r>
-      <w:r>
-        <w:rPr>
-          <w:b w:val="1"/>
-          <w:bCs w:val="1"/>
-          <w:i w:val="1"/>
-          <w:iCs w:val="1"/>
-          <w:rtl w:val="1"/>
-        </w:rPr>
-        <w:t xml:space="preserve">: </w:t>
-      </w:r>
-      <w:r>
-        <w:rPr>
-          <w:i w:val="1"/>
-          <w:iCs w:val="1"/>
-          <w:rtl w:val="1"/>
-        </w:rPr>
-        <w:t xml:space="preserve">האם</w:t>
-      </w:r>
-      <w:r>
-        <w:rPr>
-          <w:i w:val="1"/>
-          <w:iCs w:val="1"/>
-          <w:rtl w:val="1"/>
-        </w:rPr>
-        <w:t xml:space="preserve"> </w:t>
-      </w:r>
-      <w:r>
-        <w:rPr>
-          <w:i w:val="1"/>
-          <w:iCs w:val="1"/>
-          <w:rtl w:val="1"/>
-        </w:rPr>
-        <w:t xml:space="preserve">יש</w:t>
-      </w:r>
-      <w:r>
-        <w:rPr>
-          <w:i w:val="1"/>
-          <w:iCs w:val="1"/>
-          <w:rtl w:val="1"/>
-        </w:rPr>
-        <w:t xml:space="preserve"> </w:t>
-      </w:r>
-      <w:r>
-        <w:rPr>
-          <w:i w:val="1"/>
-          <w:iCs w:val="1"/>
-          <w:rtl w:val="1"/>
-        </w:rPr>
-        <w:t xml:space="preserve">בעל</w:t>
-      </w:r>
-      <w:r>
-        <w:rPr>
-          <w:i w:val="1"/>
-          <w:iCs w:val="1"/>
-          <w:rtl w:val="1"/>
-        </w:rPr>
-        <w:t xml:space="preserve"> </w:t>
-      </w:r>
-      <w:r>
-        <w:rPr>
-          <w:i w:val="1"/>
-          <w:iCs w:val="1"/>
-          <w:rtl w:val="1"/>
-        </w:rPr>
-        <w:t xml:space="preserve">עניין</w:t>
-      </w:r>
-      <w:r>
-        <w:rPr>
-          <w:i w:val="1"/>
-          <w:iCs w:val="1"/>
-          <w:rtl w:val="1"/>
-        </w:rPr>
-        <w:t xml:space="preserve"> </w:t>
-      </w:r>
-      <w:r>
-        <w:rPr>
-          <w:i w:val="1"/>
-          <w:iCs w:val="1"/>
-          <w:rtl w:val="1"/>
-        </w:rPr>
-        <w:t xml:space="preserve">שלישי</w:t>
-      </w:r>
-      <w:r>
-        <w:rPr>
-          <w:i w:val="1"/>
-          <w:iCs w:val="1"/>
-          <w:rtl w:val="1"/>
-        </w:rPr>
-        <w:t xml:space="preserve"> </w:t>
-      </w:r>
-      <w:r>
-        <w:rPr>
-          <w:i w:val="1"/>
-          <w:iCs w:val="1"/>
-          <w:rtl w:val="1"/>
-        </w:rPr>
-        <w:t xml:space="preserve">שצריך</w:t>
-      </w:r>
-      <w:r>
-        <w:rPr>
-          <w:i w:val="1"/>
-          <w:iCs w:val="1"/>
-          <w:rtl w:val="1"/>
-        </w:rPr>
-        <w:t xml:space="preserve"> </w:t>
-      </w:r>
-      <w:r>
-        <w:rPr>
-          <w:i w:val="1"/>
-          <w:iCs w:val="1"/>
-          <w:rtl w:val="1"/>
-        </w:rPr>
-        <w:t xml:space="preserve">להשלים</w:t>
-      </w:r>
-      <w:r>
-        <w:rPr>
-          <w:i w:val="1"/>
-          <w:iCs w:val="1"/>
-          <w:rtl w:val="1"/>
-        </w:rPr>
-        <w:t xml:space="preserve"> </w:t>
-      </w:r>
-      <w:r>
-        <w:rPr>
-          <w:i w:val="1"/>
-          <w:iCs w:val="1"/>
-          <w:rtl w:val="1"/>
-        </w:rPr>
-        <w:t xml:space="preserve">למסמך</w:t>
-      </w:r>
-      <w:r>
-        <w:rPr>
-          <w:i w:val="1"/>
-          <w:iCs w:val="1"/>
-          <w:rtl w:val="1"/>
-        </w:rPr>
-        <w:t xml:space="preserve">?</w:t>
+        <w:t>שאלת בדיקה עצמית: האם לכל אחד משלושת בעלי העניין יש דרישה בסעיף 10 שעונה על מה שנחשב אצלו הצלחה?</w:t>
+      </w:r>
+      <w:r>
+        <w:rPr>
+          <w:b w:val="1"/>
+          <w:bCs w:val="1"/>
+          <w:i w:val="1"/>
+          <w:iCs w:val="1"/>
+          <w:rtl w:val="1"/>
+        </w:rPr>
+      </w:r>
+      <w:r>
+        <w:rPr>
+          <w:b w:val="1"/>
+          <w:bCs w:val="1"/>
+          <w:i w:val="1"/>
+          <w:iCs w:val="1"/>
+          <w:rtl w:val="1"/>
+        </w:rPr>
+      </w:r>
+      <w:r>
+        <w:rPr>
+          <w:b w:val="1"/>
+          <w:bCs w:val="1"/>
+          <w:i w:val="1"/>
+          <w:iCs w:val="1"/>
+          <w:rtl w:val="1"/>
+        </w:rPr>
+      </w:r>
+      <w:r>
+        <w:rPr>
+          <w:b w:val="1"/>
+          <w:bCs w:val="1"/>
+          <w:i w:val="1"/>
+          <w:iCs w:val="1"/>
+          <w:rtl w:val="1"/>
+        </w:rPr>
+      </w:r>
+      <w:r>
+        <w:rPr>
+          <w:b w:val="1"/>
+          <w:bCs w:val="1"/>
+          <w:i w:val="1"/>
+          <w:iCs w:val="1"/>
+          <w:rtl w:val="1"/>
+        </w:rPr>
+      </w:r>
+      <w:r>
+        <w:rPr>
+          <w:i w:val="1"/>
+          <w:iCs w:val="1"/>
+          <w:rtl w:val="1"/>
+        </w:rPr>
+      </w:r>
+      <w:r>
+        <w:rPr>
+          <w:i w:val="1"/>
+          <w:iCs w:val="1"/>
+          <w:rtl w:val="1"/>
+        </w:rPr>
+      </w:r>
+      <w:r>
+        <w:rPr>
+          <w:i w:val="1"/>
+          <w:iCs w:val="1"/>
+          <w:rtl w:val="1"/>
+        </w:rPr>
+      </w:r>
+      <w:r>
+        <w:rPr>
+          <w:i w:val="1"/>
+          <w:iCs w:val="1"/>
+          <w:rtl w:val="1"/>
+        </w:rPr>
+      </w:r>
+      <w:r>
+        <w:rPr>
+          <w:i w:val="1"/>
+          <w:iCs w:val="1"/>
+          <w:rtl w:val="1"/>
+        </w:rPr>
+      </w:r>
+      <w:r>
+        <w:rPr>
+          <w:i w:val="1"/>
+          <w:iCs w:val="1"/>
+          <w:rtl w:val="1"/>
+        </w:rPr>
+      </w:r>
+      <w:r>
+        <w:rPr>
+          <w:i w:val="1"/>
+          <w:iCs w:val="1"/>
+          <w:rtl w:val="1"/>
+        </w:rPr>
+      </w:r>
+      <w:r>
+        <w:rPr>
+          <w:i w:val="1"/>
+          <w:iCs w:val="1"/>
+          <w:rtl w:val="1"/>
+        </w:rPr>
+      </w:r>
+      <w:r>
+        <w:rPr>
+          <w:i w:val="1"/>
+          <w:iCs w:val="1"/>
+          <w:rtl w:val="1"/>
+        </w:rPr>
+      </w:r>
+      <w:r>
+        <w:rPr>
+          <w:i w:val="1"/>
+          <w:iCs w:val="1"/>
+          <w:rtl w:val="1"/>
+        </w:rPr>
+      </w:r>
+      <w:r>
+        <w:rPr>
+          <w:i w:val="1"/>
+          <w:iCs w:val="1"/>
+          <w:rtl w:val="1"/>
+        </w:rPr>
+      </w:r>
+      <w:r>
+        <w:rPr>
+          <w:i w:val="1"/>
+          <w:iCs w:val="1"/>
+          <w:rtl w:val="1"/>
+        </w:rPr>
+      </w:r>
+      <w:r>
+        <w:rPr>
+          <w:i w:val="1"/>
+          <w:iCs w:val="1"/>
+          <w:rtl w:val="1"/>
+        </w:rPr>
+      </w:r>
+      <w:r>
+        <w:rPr>
+          <w:i w:val="1"/>
+          <w:iCs w:val="1"/>
+          <w:rtl w:val="1"/>
+        </w:rPr>
+      </w:r>
+      <w:r>
+        <w:rPr>
+          <w:i w:val="1"/>
+          <w:iCs w:val="1"/>
+          <w:rtl w:val="1"/>
+        </w:rPr>
+      </w:r>
+      <w:r>
+        <w:rPr>
+          <w:i w:val="1"/>
+          <w:iCs w:val="1"/>
+          <w:rtl w:val="1"/>
+        </w:rPr>
       </w:r>
       <w:r>
         <w:rPr>
@@ -14929,7 +15198,7 @@
           <w:iCs w:val="1"/>
           <w:rtl w:val="1"/>
         </w:rPr>
-        <w:t>המדדים: ל-KR1 תוכניות פעילות לכל מתאמן, זמן החלפת תרגיל ותשלומים עם חשבונית אוטומטית; ל-KR2 שיעור נטישה חודשי, מתאמנים פעילים והשתתפות באתגר השבועי; ל-KR3 הזנת תוצאות שבועית, חזרה יומית ומשוב שנשלח. כל המדדים נמדדים מנתוני האפליקציה.</w:t>
+        <w:t>המדדים: ל-KR1 תוכניות פעילות לכל מתאמן, זמן החלפת תרגיל ותשלומים עם חשבונית אוטומטית; ל-KR2 שיעור נטישה חודשי, מתאמנים פעילים והשתתפות באתגר השבועי; ל-KR3 הזנת תוצאות שבועית, חזרה יומית ומשוב שנשלח. כל המדדים נמדדים מנתוני האפליקציה. המדדים שאפשר לחשב מהנתונים השמורים (תוכניות פעילות, תשלומים עם חשבונית, השתתפות באתגר והזנת תוצאות שבועית) מוצגים באפליקציה לבעל העסק בלבד, לכל העסק (הכרעת הצוות מ-30.09.2026). הנטישה, הכניסות והחזרה היומית דורשים רישום כניסות שאינו בגרסה הראשונה.</w:t>
       </w:r>
     </w:p>
     <w:p>
@@ -19022,46 +19291,42 @@
               <w:rPr>
                 <w:rtl w:val="0"/>
               </w:rPr>
-            </w:r>
-            <w:r>
-              <w:rPr>
-                <w:sz w:val="20"/>
-                <w:szCs w:val="20"/>
-                <w:rtl w:val="1"/>
-              </w:rPr>
-              <w:t xml:space="preserve">[</w:t>
-            </w:r>
-            <w:r>
-              <w:rPr>
-                <w:sz w:val="20"/>
-                <w:szCs w:val="20"/>
-                <w:rtl w:val="1"/>
-              </w:rPr>
-              <w:t xml:space="preserve">טרם</w:t>
-            </w:r>
-            <w:r>
-              <w:rPr>
-                <w:sz w:val="20"/>
-                <w:szCs w:val="20"/>
-                <w:rtl w:val="1"/>
-              </w:rPr>
-              <w:t xml:space="preserve"> </w:t>
-            </w:r>
-            <w:r>
-              <w:rPr>
-                <w:sz w:val="20"/>
-                <w:szCs w:val="20"/>
-                <w:rtl w:val="1"/>
-              </w:rPr>
-              <w:t xml:space="preserve">נקבע</w:t>
-            </w:r>
-            <w:r>
-              <w:rPr>
-                <w:sz w:val="20"/>
-                <w:szCs w:val="20"/>
-                <w:rtl w:val="1"/>
-              </w:rPr>
-              <w:t xml:space="preserve">]</w:t>
+              <w:t>רצון</w:t>
+            </w:r>
+            <w:r>
+              <w:rPr>
+                <w:sz w:val="20"/>
+                <w:szCs w:val="20"/>
+                <w:rtl w:val="1"/>
+              </w:rPr>
+            </w:r>
+            <w:r>
+              <w:rPr>
+                <w:sz w:val="20"/>
+                <w:szCs w:val="20"/>
+                <w:rtl w:val="1"/>
+              </w:rPr>
+            </w:r>
+            <w:r>
+              <w:rPr>
+                <w:sz w:val="20"/>
+                <w:szCs w:val="20"/>
+                <w:rtl w:val="1"/>
+              </w:rPr>
+            </w:r>
+            <w:r>
+              <w:rPr>
+                <w:sz w:val="20"/>
+                <w:szCs w:val="20"/>
+                <w:rtl w:val="1"/>
+              </w:rPr>
+            </w:r>
+            <w:r>
+              <w:rPr>
+                <w:sz w:val="20"/>
+                <w:szCs w:val="20"/>
+                <w:rtl w:val="1"/>
+              </w:rPr>
             </w:r>
             <w:r>
               <w:rPr>
@@ -19090,7 +19355,7 @@
                 <w:szCs w:val="20"/>
                 <w:rtl w:val="0"/>
               </w:rPr>
-              <w:t xml:space="preserve">Could</w:t>
+              <w:t>Could. החלק של בעל העסק נכנס לגרסה הראשונה בהכרעת הצוות מ-30.09.2026</w:t>
             </w:r>
             <w:r>
               <w:rPr>
@@ -26174,177 +26439,169 @@
         <w:rPr>
           <w:rtl w:val="0"/>
         </w:rPr>
-      </w:r>
-      <w:r>
-        <w:rPr>
-          <w:rFonts w:ascii="Arial" w:cs="Arial" w:eastAsia="Arial" w:hAnsi="Arial"/>
-          <w:b w:val="0"/>
-          <w:bCs w:val="0"/>
-          <w:i w:val="0"/>
-          <w:iCs w:val="0"/>
-          <w:smallCaps w:val="0"/>
-          <w:strike w:val="0"/>
-          <w:color w:val="000000"/>
-          <w:sz w:val="22"/>
-          <w:szCs w:val="22"/>
-          <w:u w:val="none"/>
-          <w:shd w:fill="auto" w:val="clear"/>
-          <w:vertAlign w:val="baseline"/>
-          <w:rtl w:val="1"/>
-        </w:rPr>
-        <w:t xml:space="preserve">15. </w:t>
-      </w:r>
-      <w:r>
-        <w:rPr>
-          <w:rFonts w:ascii="Arial" w:cs="Arial" w:eastAsia="Arial" w:hAnsi="Arial"/>
-          <w:b w:val="0"/>
-          <w:bCs w:val="0"/>
-          <w:i w:val="0"/>
-          <w:iCs w:val="0"/>
-          <w:smallCaps w:val="0"/>
-          <w:strike w:val="0"/>
-          <w:color w:val="000000"/>
-          <w:sz w:val="22"/>
-          <w:szCs w:val="22"/>
-          <w:u w:val="none"/>
-          <w:shd w:fill="auto" w:val="clear"/>
-          <w:vertAlign w:val="baseline"/>
-          <w:rtl w:val="1"/>
-        </w:rPr>
-        <w:t xml:space="preserve">תמיכה</w:t>
-      </w:r>
-      <w:r>
-        <w:rPr>
-          <w:rFonts w:ascii="Arial" w:cs="Arial" w:eastAsia="Arial" w:hAnsi="Arial"/>
-          <w:b w:val="0"/>
-          <w:bCs w:val="0"/>
-          <w:i w:val="0"/>
-          <w:iCs w:val="0"/>
-          <w:smallCaps w:val="0"/>
-          <w:strike w:val="0"/>
-          <w:color w:val="000000"/>
-          <w:sz w:val="22"/>
-          <w:szCs w:val="22"/>
-          <w:u w:val="none"/>
-          <w:shd w:fill="auto" w:val="clear"/>
-          <w:vertAlign w:val="baseline"/>
-          <w:rtl w:val="1"/>
-        </w:rPr>
-        <w:t xml:space="preserve"> </w:t>
-      </w:r>
-      <w:r>
-        <w:rPr>
-          <w:rFonts w:ascii="Arial" w:cs="Arial" w:eastAsia="Arial" w:hAnsi="Arial"/>
-          <w:b w:val="0"/>
-          <w:bCs w:val="0"/>
-          <w:i w:val="0"/>
-          <w:iCs w:val="0"/>
-          <w:smallCaps w:val="0"/>
-          <w:strike w:val="0"/>
-          <w:color w:val="000000"/>
-          <w:sz w:val="22"/>
-          <w:szCs w:val="22"/>
-          <w:u w:val="none"/>
-          <w:shd w:fill="auto" w:val="clear"/>
-          <w:vertAlign w:val="baseline"/>
-          <w:rtl w:val="1"/>
-        </w:rPr>
-        <w:t xml:space="preserve">בסוגי</w:t>
-      </w:r>
-      <w:r>
-        <w:rPr>
-          <w:rFonts w:ascii="Arial" w:cs="Arial" w:eastAsia="Arial" w:hAnsi="Arial"/>
-          <w:b w:val="0"/>
-          <w:bCs w:val="0"/>
-          <w:i w:val="0"/>
-          <w:iCs w:val="0"/>
-          <w:smallCaps w:val="0"/>
-          <w:strike w:val="0"/>
-          <w:color w:val="000000"/>
-          <w:sz w:val="22"/>
-          <w:szCs w:val="22"/>
-          <w:u w:val="none"/>
-          <w:shd w:fill="auto" w:val="clear"/>
-          <w:vertAlign w:val="baseline"/>
-          <w:rtl w:val="1"/>
-        </w:rPr>
-        <w:t xml:space="preserve"> </w:t>
-      </w:r>
-      <w:r>
-        <w:rPr>
-          <w:rFonts w:ascii="Arial" w:cs="Arial" w:eastAsia="Arial" w:hAnsi="Arial"/>
-          <w:b w:val="0"/>
-          <w:bCs w:val="0"/>
-          <w:i w:val="0"/>
-          <w:iCs w:val="0"/>
-          <w:smallCaps w:val="0"/>
-          <w:strike w:val="0"/>
-          <w:color w:val="000000"/>
-          <w:sz w:val="22"/>
-          <w:szCs w:val="22"/>
-          <w:u w:val="none"/>
-          <w:shd w:fill="auto" w:val="clear"/>
-          <w:vertAlign w:val="baseline"/>
-          <w:rtl w:val="1"/>
-        </w:rPr>
-        <w:t xml:space="preserve">עסק</w:t>
-      </w:r>
-      <w:r>
-        <w:rPr>
-          <w:rFonts w:ascii="Arial" w:cs="Arial" w:eastAsia="Arial" w:hAnsi="Arial"/>
-          <w:b w:val="0"/>
-          <w:bCs w:val="0"/>
-          <w:i w:val="0"/>
-          <w:iCs w:val="0"/>
-          <w:smallCaps w:val="0"/>
-          <w:strike w:val="0"/>
-          <w:color w:val="000000"/>
-          <w:sz w:val="22"/>
-          <w:szCs w:val="22"/>
-          <w:u w:val="none"/>
-          <w:shd w:fill="auto" w:val="clear"/>
-          <w:vertAlign w:val="baseline"/>
-          <w:rtl w:val="1"/>
-        </w:rPr>
-        <w:t xml:space="preserve"> </w:t>
-      </w:r>
-      <w:r>
-        <w:rPr>
-          <w:rFonts w:ascii="Arial" w:cs="Arial" w:eastAsia="Arial" w:hAnsi="Arial"/>
-          <w:b w:val="0"/>
-          <w:bCs w:val="0"/>
-          <w:i w:val="0"/>
-          <w:iCs w:val="0"/>
-          <w:smallCaps w:val="0"/>
-          <w:strike w:val="0"/>
-          <w:color w:val="000000"/>
-          <w:sz w:val="22"/>
-          <w:szCs w:val="22"/>
-          <w:u w:val="none"/>
-          <w:shd w:fill="auto" w:val="clear"/>
-          <w:vertAlign w:val="baseline"/>
-          <w:rtl w:val="1"/>
-        </w:rPr>
-        <w:t xml:space="preserve">שונים</w:t>
-      </w:r>
-      <w:r>
-        <w:rPr>
-          <w:rFonts w:ascii="Arial" w:cs="Arial" w:eastAsia="Arial" w:hAnsi="Arial"/>
-          <w:b w:val="0"/>
-          <w:bCs w:val="0"/>
-          <w:i w:val="0"/>
-          <w:iCs w:val="0"/>
-          <w:smallCaps w:val="0"/>
-          <w:strike w:val="0"/>
-          <w:color w:val="000000"/>
-          <w:sz w:val="22"/>
-          <w:szCs w:val="22"/>
-          <w:u w:val="none"/>
-          <w:shd w:fill="auto" w:val="clear"/>
-          <w:vertAlign w:val="baseline"/>
-          <w:rtl w:val="1"/>
-        </w:rPr>
-        <w:t xml:space="preserve"> — </w:t>
+        <w:t>15. תמיכה בסוגי עסק שונים — Could; החלק של בעל העסק בגרסה הראשונה. בעל העסק רואה סקירה עסקית (הכנסות, גבייה פתוחה, מאמנים, תפוסת שיעורים), מזמין מאמנים, פותח כרטיס מאמן (שמות וסיכומים, בלי תוצאות והערות), רואה את המדדים וקובע את הגדרות העסק. מאמן עצמאי הוא עסק של אדם אחד, ובעל עסק שהוא גם מאמן עובר בין התפקידים בחשבון אחד. הסיפור המלא: story-15-business-owner.md (https://github.com/Sharpop30/fitness-app/blob/main/project-docs/story-15-business-owner.md)</w:t>
+      </w:r>
+      <w:r>
+        <w:rPr>
+          <w:rFonts w:ascii="Arial" w:cs="Arial" w:eastAsia="Arial" w:hAnsi="Arial"/>
+          <w:b w:val="0"/>
+          <w:bCs w:val="0"/>
+          <w:i w:val="0"/>
+          <w:iCs w:val="0"/>
+          <w:smallCaps w:val="0"/>
+          <w:strike w:val="0"/>
+          <w:color w:val="000000"/>
+          <w:sz w:val="22"/>
+          <w:szCs w:val="22"/>
+          <w:u w:val="none"/>
+          <w:shd w:fill="auto" w:val="clear"/>
+          <w:vertAlign w:val="baseline"/>
+          <w:rtl w:val="1"/>
+        </w:rPr>
+      </w:r>
+      <w:r>
+        <w:rPr>
+          <w:rFonts w:ascii="Arial" w:cs="Arial" w:eastAsia="Arial" w:hAnsi="Arial"/>
+          <w:b w:val="0"/>
+          <w:bCs w:val="0"/>
+          <w:i w:val="0"/>
+          <w:iCs w:val="0"/>
+          <w:smallCaps w:val="0"/>
+          <w:strike w:val="0"/>
+          <w:color w:val="000000"/>
+          <w:sz w:val="22"/>
+          <w:szCs w:val="22"/>
+          <w:u w:val="none"/>
+          <w:shd w:fill="auto" w:val="clear"/>
+          <w:vertAlign w:val="baseline"/>
+          <w:rtl w:val="1"/>
+        </w:rPr>
+      </w:r>
+      <w:r>
+        <w:rPr>
+          <w:rFonts w:ascii="Arial" w:cs="Arial" w:eastAsia="Arial" w:hAnsi="Arial"/>
+          <w:b w:val="0"/>
+          <w:bCs w:val="0"/>
+          <w:i w:val="0"/>
+          <w:iCs w:val="0"/>
+          <w:smallCaps w:val="0"/>
+          <w:strike w:val="0"/>
+          <w:color w:val="000000"/>
+          <w:sz w:val="22"/>
+          <w:szCs w:val="22"/>
+          <w:u w:val="none"/>
+          <w:shd w:fill="auto" w:val="clear"/>
+          <w:vertAlign w:val="baseline"/>
+          <w:rtl w:val="1"/>
+        </w:rPr>
+      </w:r>
+      <w:r>
+        <w:rPr>
+          <w:rFonts w:ascii="Arial" w:cs="Arial" w:eastAsia="Arial" w:hAnsi="Arial"/>
+          <w:b w:val="0"/>
+          <w:bCs w:val="0"/>
+          <w:i w:val="0"/>
+          <w:iCs w:val="0"/>
+          <w:smallCaps w:val="0"/>
+          <w:strike w:val="0"/>
+          <w:color w:val="000000"/>
+          <w:sz w:val="22"/>
+          <w:szCs w:val="22"/>
+          <w:u w:val="none"/>
+          <w:shd w:fill="auto" w:val="clear"/>
+          <w:vertAlign w:val="baseline"/>
+          <w:rtl w:val="1"/>
+        </w:rPr>
+      </w:r>
+      <w:r>
+        <w:rPr>
+          <w:rFonts w:ascii="Arial" w:cs="Arial" w:eastAsia="Arial" w:hAnsi="Arial"/>
+          <w:b w:val="0"/>
+          <w:bCs w:val="0"/>
+          <w:i w:val="0"/>
+          <w:iCs w:val="0"/>
+          <w:smallCaps w:val="0"/>
+          <w:strike w:val="0"/>
+          <w:color w:val="000000"/>
+          <w:sz w:val="22"/>
+          <w:szCs w:val="22"/>
+          <w:u w:val="none"/>
+          <w:shd w:fill="auto" w:val="clear"/>
+          <w:vertAlign w:val="baseline"/>
+          <w:rtl w:val="1"/>
+        </w:rPr>
+      </w:r>
+      <w:r>
+        <w:rPr>
+          <w:rFonts w:ascii="Arial" w:cs="Arial" w:eastAsia="Arial" w:hAnsi="Arial"/>
+          <w:b w:val="0"/>
+          <w:bCs w:val="0"/>
+          <w:i w:val="0"/>
+          <w:iCs w:val="0"/>
+          <w:smallCaps w:val="0"/>
+          <w:strike w:val="0"/>
+          <w:color w:val="000000"/>
+          <w:sz w:val="22"/>
+          <w:szCs w:val="22"/>
+          <w:u w:val="none"/>
+          <w:shd w:fill="auto" w:val="clear"/>
+          <w:vertAlign w:val="baseline"/>
+          <w:rtl w:val="1"/>
+        </w:rPr>
+      </w:r>
+      <w:r>
+        <w:rPr>
+          <w:rFonts w:ascii="Arial" w:cs="Arial" w:eastAsia="Arial" w:hAnsi="Arial"/>
+          <w:b w:val="0"/>
+          <w:bCs w:val="0"/>
+          <w:i w:val="0"/>
+          <w:iCs w:val="0"/>
+          <w:smallCaps w:val="0"/>
+          <w:strike w:val="0"/>
+          <w:color w:val="000000"/>
+          <w:sz w:val="22"/>
+          <w:szCs w:val="22"/>
+          <w:u w:val="none"/>
+          <w:shd w:fill="auto" w:val="clear"/>
+          <w:vertAlign w:val="baseline"/>
+          <w:rtl w:val="1"/>
+        </w:rPr>
+      </w:r>
+      <w:r>
+        <w:rPr>
+          <w:rFonts w:ascii="Arial" w:cs="Arial" w:eastAsia="Arial" w:hAnsi="Arial"/>
+          <w:b w:val="0"/>
+          <w:bCs w:val="0"/>
+          <w:i w:val="0"/>
+          <w:iCs w:val="0"/>
+          <w:smallCaps w:val="0"/>
+          <w:strike w:val="0"/>
+          <w:color w:val="000000"/>
+          <w:sz w:val="22"/>
+          <w:szCs w:val="22"/>
+          <w:u w:val="none"/>
+          <w:shd w:fill="auto" w:val="clear"/>
+          <w:vertAlign w:val="baseline"/>
+          <w:rtl w:val="1"/>
+        </w:rPr>
+      </w:r>
+      <w:r>
+        <w:rPr>
+          <w:rFonts w:ascii="Arial" w:cs="Arial" w:eastAsia="Arial" w:hAnsi="Arial"/>
+          <w:b w:val="0"/>
+          <w:bCs w:val="0"/>
+          <w:i w:val="0"/>
+          <w:iCs w:val="0"/>
+          <w:smallCaps w:val="0"/>
+          <w:strike w:val="0"/>
+          <w:color w:val="000000"/>
+          <w:sz w:val="22"/>
+          <w:szCs w:val="22"/>
+          <w:u w:val="none"/>
+          <w:shd w:fill="auto" w:val="clear"/>
+          <w:vertAlign w:val="baseline"/>
+          <w:rtl w:val="1"/>
+        </w:rPr>
       </w:r>
       <w:r>
         <w:rPr>
@@ -26363,7 +26620,6 @@
           <w:vertAlign w:val="baseline"/>
           <w:rtl w:val="0"/>
         </w:rPr>
-        <w:t xml:space="preserve">Could</w:t>
       </w:r>
     </w:p>
     <w:p>
@@ -30351,7 +30607,7 @@
           <w:iCs w:val="1"/>
           <w:rtl w:val="1"/>
         </w:rPr>
-        <w:t>דרישות שנכנסות לגרסה הראשונה: צורך: 1 תוכניות אימון, 2 סליקה וחשבוניות (הדגמה בלבד), 12 הזנת תוצאות, 19 ניהול מאוחד, 4 מעקב התקדמות ויזואלי, 30 הרשמה לשיעורים. רצון: 21 משוב מיידי, 6 ו-24 מטבעות ותגמולים, 5 אתגר שבועי, 25 טריגר יומי כתזכורת בתוך האפליקציה, 10 סרטוני הדגמה. עקרונות: 20, 27, 28, 29.</w:t>
+        <w:t>דרישות שנכנסות לגרסה הראשונה: צורך: 1 תוכניות אימון, 2 סליקה וחשבוניות (הדגמה בלבד), 12 הזנת תוצאות, 19 ניהול מאוחד, 4 מעקב התקדמות ויזואלי, 30 הרשמה לשיעורים. רצון: 21 משוב מיידי, 6 ו-24 מטבעות ותגמולים, 5 אתגר שבועי, 25 טריגר יומי כתזכורת בתוך האפליקציה, 10 סרטוני הדגמה, 15 בחלקה: בעל עסק עם כמה מאמנים (הכרעת הצוות מ-30.09.2026). עקרונות: 20, 27, 28, 29.</w:t>
       </w:r>
     </w:p>
     <w:p>
@@ -30366,7 +30622,7 @@
           <w:iCs w:val="1"/>
           <w:rtl w:val="1"/>
         </w:rPr>
-        <w:t>דרישות שנדחות לשלב הצמיחה: 7 תזונה ו-22 שיתוף הישגים (דורשות AI או פיד); 9, 11, 14, 23 שכבת הקהילה (Could); 15 סוגי עסק; 3 מיתוג, 13 מעקב אוטומטי, 16 תמחור, 26 תגים; 8, 17, 18 (Won't).</w:t>
+        <w:t>דרישות שנדחות לשלב הצמיחה: 7 תזונה ו-22 שיתוף הישגים (דורשות AI או פיד); 9, 11, 14, 23 שכבת הקהילה (Could); יתרת 15 (סניפים, מיתוג לכל עסק, העברת מתאמנים בין מאמנים); 3 מיתוג, 13 מעקב אוטומטי, 16 תמחור, 26 תגים; 8, 17, 18 (Won't).</w:t>
       </w:r>
     </w:p>
     <w:p>
@@ -30381,7 +30637,7 @@
           <w:iCs w:val="1"/>
           <w:rtl w:val="1"/>
         </w:rPr>
-        <w:t>קריטריוני קבלה: לכל דרישה שנכנסת, מה עושים ומה חייבים לראות, במסמך המלא. הערכים המספריים (כמו מטבעות לפעולה) [טרם נקבע], ונשמרים בטבלת ייחוס.</w:t>
+        <w:t>קריטריוני קבלה: לכל דרישה שנכנסת, מה עושים ומה חייבים לראות, במסמך המלא. הערכים המספריים (כמו מטבעות לפעולה) [טרם נקבע], ונשמרים בטבלת ייחוס של העסק, שבעל העסק משנה.</w:t>
       </w:r>
     </w:p>
     <w:p>
@@ -30396,7 +30652,7 @@
           <w:iCs w:val="1"/>
           <w:rtl w:val="1"/>
         </w:rPr>
-        <w:t>תנאי אישור: בדיקה מול מאמן (האם הוא מנהל תוכנית, גבייה ומעקב בלי אפליקציה נוספת ובלי הדרכה) ומול מתאמן (האם הוא מזין תוצאה בלי מאמץ ורוצה לחזור). מי הבודקים וכמה: [טרם נקבע].</w:t>
+        <w:t>תנאי אישור: בדיקה מול מאמן (האם הוא מנהל תוכנית, גבייה ומעקב בלי אפליקציה נוספת ובלי הדרכה), מול בעל עסק (האם הוא מבין את מצב העסק מהסקירה ומהמדדים בלי לשאול את המאמנים) ומול מתאמן (האם הוא מזין תוצאה בלי מאמץ ורוצה לחזור). מי הבודקים וכמה: [טרם נקבע].</w:t>
       </w:r>
     </w:p>
     <w:p>
@@ -31004,7 +31260,7 @@
           <w:iCs w:val="1"/>
           <w:rtl w:val="1"/>
         </w:rPr>
-        <w:t>כלי האב טיפוס: קובץ HTML אחד, בעברית ומותאם לנייד, עם כל מסכי הגרסה הראשונה למאמן ולמתאמן, על נתוני דוגמה מסומנים. גרסה 1, 28.09.2026, בעיצוב FORM.</w:t>
+        <w:t>כלי האב טיפוס: קובץ HTML אחד, בעברית ומותאם לנייד, עם כל מסכי הגרסה הראשונה למאמן, למתאמן ולבעל העסק, על נתוני דוגמה מסומנים. גרסה 1, 28.09.2026; גרסה 2, 30.09.2026, סגנון FORM ונוסח ניטרלי משלב העיצוב; גרסה 3, 30.09.2026, בעל העסק (S24 עד S27, בחירת תפקיד, והגדרות לקריאה בלבד למאמן).</w:t>
       </w:r>
     </w:p>
     <w:p>
@@ -31049,7 +31305,7 @@
           <w:iCs w:val="1"/>
           <w:rtl w:val="1"/>
         </w:rPr>
-        <w:t>קריטריון מעבר לבנייה: אב הטיפוס אושר בידי הצוות ב-28.09.2026.</w:t>
+        <w:t>קריטריון מעבר לבנייה: אב הטיפוס אושר בידי הצוות ב-28.09.2026, גרסה 2 ב-30.09.2026, וגרסה 3 ב-30.09.2026 לפני שלב 4ה (עסק ובעל עסק).</w:t>
       </w:r>
     </w:p>
     <w:p>
@@ -31627,7 +31883,7 @@
           <w:iCs w:val="1"/>
           <w:rtl w:val="1"/>
         </w:rPr>
-        <w:t>לכל דרישה בגרסה הראשונה מקרה שימוש מאושר (usecase-01 עד 11), וכל צעד בו מסווג לפי סוג הרכיב ודרגת המימוש.</w:t>
+        <w:t>לכל דרישה בגרסה הראשונה מקרה שימוש מאושר (usecase-01 עד 12), וכל צעד בו מסווג לפי סוג הרכיב ודרגת המימוש.</w:t>
       </w:r>
     </w:p>
     <w:p>
@@ -31672,7 +31928,7 @@
           <w:iCs w:val="1"/>
           <w:rtl w:val="1"/>
         </w:rPr>
-        <w:t>שיוך למודול: כל דרישה משויכת למודול אחד מתוך 14 (M01 עד M14). חריגות מאימות אב הטיפוס: [טרם נקבע], האימות נדחה.</w:t>
+        <w:t>שיוך למודול: כל דרישה משויכת למודול אחד מתוך 15 (M01 עד M15). דרישה 15 משויכת ל-M15 business, והסקירה של בעל העסק ל-M13 home. חריגות מאימות אב הטיפוס: [טרם נקבע], האימות נדחה.</w:t>
       </w:r>
     </w:p>
     <w:p>
@@ -31972,7 +32228,7 @@
           <w:iCs w:val="1"/>
           <w:rtl w:val="1"/>
         </w:rPr>
-        <w:t>הליבה: מאמן, מתאמן, תרגיל, תוכנית ואימון שבוצע, ושמונה כללי Business Logic. כל השאר נתונים פרטיים של מודול.</w:t>
+        <w:t>הליבה: עסק ובעל עסק, מאמן, מתאמן, תרגיל, תוכנית ואימון שבוצע, ועשרה כללי Business Logic. כל השאר נתונים פרטיים של מודול. שלושה תפקידים: בעל עסק, מאמן ומתאמן; בעל העסק קורא את כל המאמנים בעסק שלו בשמות ובסיכומים בלבד.</w:t>
       </w:r>
     </w:p>
     <w:p>
@@ -31987,7 +32243,7 @@
           <w:iCs w:val="1"/>
           <w:rtl w:val="1"/>
         </w:rPr>
-        <w:t>רכיבים: Endpoint ו-Orchestrator, Registry, Audit Log, Repository ו-Error Codes; 14 מודולים עסקיים; 4 ממשקים. כל פנייה עוברת ב-Orchestrator במעטפה { caller, module, action, payload, lang }, והתשובה ב-{ ok, data, error }.</w:t>
+        <w:t>רכיבים: Endpoint ו-Orchestrator, Registry, Audit Log, Repository ו-Error Codes; 15 מודולים עסקיים; 4 ממשקים. כל פנייה עוברת ב-Orchestrator במעטפה { caller, module, action, payload, lang }, והתשובה ב-{ ok, data, error }. ה-Orchestrator מזהה את תפקיד המשתמש לפי שורות ה-Registry, בלי שינוי במעטפה.</w:t>
       </w:r>
     </w:p>
     <w:p>
@@ -32334,7 +32590,7 @@
           <w:iCs w:val="1"/>
           <w:rtl w:val="1"/>
         </w:rPr>
-        <w:t>רשימת מסכים: 23. למאמן S01 עד S12, למתאמן S13 עד S20, משותפים S21 עד S23. כל מסך מודול, ופונה ל-Endpoint היחיד בלבד.</w:t>
+        <w:t>רשימת מסכים: 27. למאמן S01 עד S11, למתאמן S13 עד S20, לבעל העסק S24 עד S27, משותפים S12 (בעל העסק משנה, המאמן רואה) ו-S21 עד S23. כל מסך מודול, ופונה ל-Endpoint היחיד בלבד.</w:t>
       </w:r>
     </w:p>
     <w:p>
@@ -32349,7 +32605,7 @@
           <w:iCs w:val="1"/>
           <w:rtl w:val="1"/>
         </w:rPr>
-        <w:t>תיאור וזרימה: לפי אב הטיפוס המאושר (prototype-fitness-app גרסה 1). לכל מסך טבלת פעולות סגורה במפה.</w:t>
+        <w:t>תיאור וזרימה: לפי אב הטיפוס המאושר (prototype-fitness-app גרסה 3). לכל מסך טבלת פעולות סגורה במפה.</w:t>
       </w:r>
     </w:p>
     <w:p>

</xml_diff>

<commit_message>
PRD v1.22: S12 for the business owner only, in sections 13 and 16
From prd-update-inbox: module map v12, usecase-12 v2 and doc-owner-role
(decision 3 updated), now in done. Prototype v3.1 in section 13. The
previous version is archived, the run is logged and the session state
updated.

Co-Authored-By: Claude Opus 5.5 <noreply@anthropic.com>
</commit_message>
<xml_diff>
--- a/project-docs/prd-fitness-app.docx
+++ b/project-docs/prd-fitness-app.docx
@@ -1529,7 +1529,7 @@
                 <w:szCs w:val="20"/>
                 <w:rtl w:val="0"/>
               </w:rPr>
-              <w:t>1.21</w:t>
+              <w:t>1.22</w:t>
             </w:r>
           </w:p>
         </w:tc>
@@ -1604,7 +1604,7 @@
                 <w:szCs w:val="20"/>
                 <w:rtl w:val="0"/>
               </w:rPr>
-              <w:t>30.09.2026</w:t>
+              <w:t>01.10.2026</w:t>
             </w:r>
             <w:r>
               <w:rPr>
@@ -3777,6 +3777,84 @@
                 <w:rtl w:val="0"/>
               </w:rPr>
               <w:t>1.21</w:t>
+            </w:r>
+          </w:p>
+        </w:tc>
+      </w:tr>
+      <w:tr>
+        <w:trPr>
+          <w:cantSplit w:val="0"/>
+          <w:tblHeader w:val="0"/>
+        </w:trPr>
+        <w:tc>
+          <w:tcPr>
+            <w:tcMar>
+              <w:top w:w="60.0" w:type="dxa"/>
+              <w:left w:w="100.0" w:type="dxa"/>
+              <w:bottom w:w="60.0" w:type="dxa"/>
+              <w:right w:w="100.0" w:type="dxa"/>
+            </w:tcMar>
+          </w:tcPr>
+          <w:p>
+            <w:pPr>
+              <w:bidi w:val="1"/>
+              <w:rPr/>
+            </w:pPr>
+            <w:r>
+              <w:rPr>
+                <w:sz w:val="20"/>
+                <w:szCs w:val="20"/>
+                <w:rtl w:val="1"/>
+              </w:rPr>
+              <w:t>S12 לבעל העסק בלבד, בהכרעת הצוות מ-01.10.2026 (חלופה 1): סעיף 13, אב הטיפוס גרסה 3.1; סעיף 16, S12 עובר מהמשותפים למסכי בעל העסק. המקורות: doc-module-map גרסה 12, usecase-12 גרסה 2, doc-owner-role (הכרעה 3 עודכנה). שאר שינויי המפה (שורת Registry של M15 מול get_settings, ומבנה התשובות לבעל העסק) אינם משנים את התמצית בסעיפים 14 ו-15</w:t>
+            </w:r>
+          </w:p>
+        </w:tc>
+        <w:tc>
+          <w:tcPr>
+            <w:tcMar>
+              <w:top w:w="60.0" w:type="dxa"/>
+              <w:left w:w="100.0" w:type="dxa"/>
+              <w:bottom w:w="60.0" w:type="dxa"/>
+              <w:right w:w="100.0" w:type="dxa"/>
+            </w:tcMar>
+          </w:tcPr>
+          <w:p>
+            <w:pPr>
+              <w:bidi w:val="1"/>
+              <w:rPr/>
+            </w:pPr>
+            <w:r>
+              <w:rPr>
+                <w:sz w:val="20"/>
+                <w:szCs w:val="20"/>
+                <w:rtl w:val="0"/>
+              </w:rPr>
+              <w:t>01.10.2026</w:t>
+            </w:r>
+          </w:p>
+        </w:tc>
+        <w:tc>
+          <w:tcPr>
+            <w:tcMar>
+              <w:top w:w="60.0" w:type="dxa"/>
+              <w:left w:w="100.0" w:type="dxa"/>
+              <w:bottom w:w="60.0" w:type="dxa"/>
+              <w:right w:w="100.0" w:type="dxa"/>
+            </w:tcMar>
+          </w:tcPr>
+          <w:p>
+            <w:pPr>
+              <w:bidi w:val="1"/>
+              <w:rPr/>
+            </w:pPr>
+            <w:r>
+              <w:rPr>
+                <w:sz w:val="20"/>
+                <w:szCs w:val="20"/>
+                <w:rtl w:val="0"/>
+              </w:rPr>
+              <w:t>1.22</w:t>
             </w:r>
           </w:p>
         </w:tc>
@@ -31260,7 +31338,7 @@
           <w:iCs w:val="1"/>
           <w:rtl w:val="1"/>
         </w:rPr>
-        <w:t>כלי האב טיפוס: קובץ HTML אחד, בעברית ומותאם לנייד, עם כל מסכי הגרסה הראשונה למאמן, למתאמן ולבעל העסק, על נתוני דוגמה מסומנים. גרסה 1, 28.09.2026; גרסה 2, 30.09.2026, סגנון FORM ונוסח ניטרלי משלב העיצוב; גרסה 3, 30.09.2026, בעל העסק (S24 עד S27, בחירת תפקיד, והגדרות לקריאה בלבד למאמן).</w:t>
+        <w:t>כלי האב טיפוס: קובץ HTML אחד, בעברית ומותאם לנייד, עם כל מסכי הגרסה הראשונה למאמן, למתאמן ולבעל העסק, על נתוני דוגמה מסומנים. גרסה 1, 28.09.2026; גרסה 2, 30.09.2026, סגנון FORM ונוסח ניטרלי משלב העיצוב; גרסה 3, 30.09.2026, בעל העסק (S24 עד S27, בחירת תפקיד, והגדרות לקריאה בלבד למאמן); גרסה 3.1, 01.10.2026, S12 הגדרות העסק לבעל העסק בלבד, והמאמן אינו רואה אותן (הכרעת הצוות אחרי שלב 4ה).</w:t>
       </w:r>
     </w:p>
     <w:p>
@@ -31305,7 +31383,7 @@
           <w:iCs w:val="1"/>
           <w:rtl w:val="1"/>
         </w:rPr>
-        <w:t>קריטריון מעבר לבנייה: אב הטיפוס אושר בידי הצוות ב-28.09.2026, גרסה 2 ב-30.09.2026, וגרסה 3 ב-30.09.2026 לפני שלב 4ה (עסק ובעל עסק).</w:t>
+        <w:t>קריטריון מעבר לבנייה: אב הטיפוס אושר בידי הצוות ב-28.09.2026, גרסה 2 ב-30.09.2026, גרסה 3 ב-30.09.2026 לפני שלב 4ה (עסק ובעל עסק), וגרסה 3.1 ב-01.10.2026.</w:t>
       </w:r>
     </w:p>
     <w:p>
@@ -32590,7 +32668,7 @@
           <w:iCs w:val="1"/>
           <w:rtl w:val="1"/>
         </w:rPr>
-        <w:t>רשימת מסכים: 27. למאמן S01 עד S11, למתאמן S13 עד S20, לבעל העסק S24 עד S27, משותפים S12 (בעל העסק משנה, המאמן רואה) ו-S21 עד S23. כל מסך מודול, ופונה ל-Endpoint היחיד בלבד.</w:t>
+        <w:t>רשימת מסכים: 27. למאמן S01 עד S11, למתאמן S13 עד S20, לבעל העסק S24 עד S27 ו-S12 (הגדרות העסק; המאמן והמתאמן אינם רואים אותן, והן חלות עליהם דרך המודולים), משותפים S21 עד S23. כל מסך מודול, ופונה ל-Endpoint היחיד בלבד.</w:t>
       </w:r>
     </w:p>
     <w:p>
@@ -32605,7 +32683,7 @@
           <w:iCs w:val="1"/>
           <w:rtl w:val="1"/>
         </w:rPr>
-        <w:t>תיאור וזרימה: לפי אב הטיפוס המאושר (prototype-fitness-app גרסה 3). לכל מסך טבלת פעולות סגורה במפה.</w:t>
+        <w:t>תיאור וזרימה: לפי אב הטיפוס המאושר (prototype-fitness-app גרסה 3.1). לכל מסך טבלת פעולות סגורה במפה.</w:t>
       </w:r>
     </w:p>
     <w:p>

</xml_diff>